<commit_message>
docs: informe F0-F4 reescrito con paso a paso reproducible (Anexo A) y matriz por capas
</commit_message>
<xml_diff>
--- a/Informe_Taller_WAAP_Fase0-2.docx
+++ b/Informe_Taller_WAAP_Fase0-2.docx
@@ -4,20 +4,48 @@
   <w:body>
     <w:p>
       <w:pPr>
-        <w:pStyle w:val="Heading1"/>
+        <w:jc w:val="center"/>
       </w:pPr>
       <w:r>
-        <w:t>Taller WAAP — Informe de laboratorio Fase 0 a Fase 2</w:t>
+        <w:rPr>
+          <w:b/>
+          <w:sz w:val="32"/>
+        </w:rPr>
+        <w:t>Taller WAAP con IA/ML, RASP y DevSecOps</w:t>
+        <w:br/>
+        <w:t>Informe de laboratorio — Fases 0 a 4</w:t>
       </w:r>
     </w:p>
     <w:p>
       <w:r>
-        <w:t>Prototipo WAAP (OWASP Juice Shop 20.2.0 + ModSecurity CRS 3.3.10). Entorno: Ubuntu 22.04, Docker + Docker Compose. Acceso vía WAAP: http://localhost:8080 (backend directo http://localhost:3000). Nivel de paranoia CRS: PL1 (PARANOIA=1).</w:t>
+        <w:rPr>
+          <w:b w:val="0"/>
+          <w:i/>
+        </w:rPr>
+        <w:t>Universidad Distrital FJDC — Mecanismos de Seguridad Informática. Prof. Octavio J. Salcedo Parra.</w:t>
+      </w:r>
+    </w:p>
+    <w:p>
+      <w:r>
+        <w:rPr>
+          <w:b w:val="0"/>
+          <w:i w:val="0"/>
+        </w:rPr>
+        <w:t>Prototipo: OWASP Juice Shop 20.2.0 + ModSecurity CRS 3.3.10 (PL1). Entorno: Ubuntu 22.04, Docker + Docker Compose. Acceso vía WAAP: http://localhost:8080 (backend directo :3000).</w:t>
+      </w:r>
+    </w:p>
+    <w:p>
+      <w:r>
+        <w:rPr>
+          <w:b w:val="0"/>
+          <w:i w:val="0"/>
+        </w:rPr>
+        <w:t>Rama del trabajo: lab/fases-0-4. Este documento se genera de forma reproducible con build_informe_full.py (ver Anexo A).</w:t>
       </w:r>
     </w:p>
     <w:p>
       <w:pPr>
-        <w:pStyle w:val="Heading2"/>
+        <w:pStyle w:val="Heading1"/>
       </w:pPr>
       <w:r>
         <w:t>Fase 0 — Preparación del entorno</w:t>
@@ -25,7 +53,96 @@
     </w:p>
     <w:p>
       <w:r>
-        <w:t>Se copió .env.example a .env (JUICE_PORT=3000, WAAP_PORT=8080, PARANOIA=1) y se levantó docker compose (juice-shop + waap-proxy en red lab-net). Ambos contenedores Up (waap-proxy healthy). Verificación: curl a http://localhost:8080 responde 200 OK con Server: nginx (proxy WAAP).</w:t>
+        <w:rPr>
+          <w:b/>
+          <w:i w:val="0"/>
+        </w:rPr>
+        <w:t>Objetivo: levantar la infraestructura base (PDF p.9).</w:t>
+      </w:r>
+    </w:p>
+    <w:p>
+      <w:r>
+        <w:rPr>
+          <w:b w:val="0"/>
+          <w:i w:val="0"/>
+        </w:rPr>
+        <w:t>Paso a paso ejecutado:</w:t>
+      </w:r>
+    </w:p>
+    <w:p>
+      <w:r>
+        <w:rPr>
+          <w:rFonts w:ascii="Consolas" w:hAnsi="Consolas"/>
+          <w:sz w:val="17"/>
+        </w:rPr>
+        <w:t>cd taller-waap</w:t>
+        <w:br/>
+        <w:t>cp .env.example .env   # JUICE_PORT=3000, WAAP_PORT=8080, PARANOIA=1</w:t>
+        <w:br/>
+        <w:t>docker compose pull</w:t>
+        <w:br/>
+        <w:t>docker compose up -d &amp;&amp; docker compose ps</w:t>
+        <w:br/>
+        <w:t>curl -i http://localhost:8080   # 200 OK, Server: nginx (proxy WAAP)</w:t>
+      </w:r>
+    </w:p>
+    <w:p>
+      <w:r>
+        <w:rPr>
+          <w:b w:val="0"/>
+          <w:i w:val="0"/>
+        </w:rPr>
+        <w:t>Resultado: ambos contenedores Up (waap-proxy healthy). Nota: el usuario debió añadirse al grupo docker (sudo usermod -aG docker $USER) por permiso denegado en /var/run/docker.sock.</w:t>
+      </w:r>
+    </w:p>
+    <w:p>
+      <w:r>
+        <w:rPr>
+          <w:rFonts w:ascii="Consolas" w:hAnsi="Consolas"/>
+          <w:sz w:val="17"/>
+        </w:rPr>
+        <w:t>===== docker compose ps =====</w:t>
+        <w:br/>
+        <w:t>NAME                       IMAGE                          COMMAND                  SERVICE      CREATED          STATUS                    PORTS</w:t>
+        <w:br/>
+        <w:t>taller-waap-juice-shop-1   bkimminich/juice-shop:latest   "/nodejs/bin/node /jâ¦"   juice-shop   32 minutes ago   Up 32 minutes             0.0.0.0:3000-&gt;3000/tcp, [::]:3000-&gt;3000/tcp</w:t>
+        <w:br/>
+        <w:t>taller-waap-waap-proxy-1   owasp/modsecurity-crs:nginx    "/docker-entrypoint.â¦"   waap-proxy   32 minutes ago   Up 32 minutes (healthy)   0.0.0.0:8080-&gt;8080/tcp, [::]:8080-&gt;8080/tcp</w:t>
+        <w:br/>
+        <w:br/>
+        <w:t>===== curl cÃ³digos =====</w:t>
+        <w:br/>
+        <w:t>HOME via WAAP 8080: 200</w:t>
+        <w:br/>
+        <w:t>search normal: 200</w:t>
+        <w:br/>
+        <w:t>sqli clasico: 403</w:t>
+        <w:br/>
+        <w:t>evasion fragmentada: 200</w:t>
+        <w:br/>
+        <w:br/>
+        <w:t>===== WAAP env =====</w:t>
+        <w:br/>
+        <w:t>PARANOIA=1</w:t>
+        <w:br/>
+        <w:t>BACKEND=http://juice-shop:3000</w:t>
+        <w:br/>
+        <w:t>MODSEC_DISABLE_BACKEND_COMPRESSION=Off</w:t>
+        <w:br/>
+        <w:t>BLOCKING_PARANOIA=1</w:t>
+        <w:br/>
+        <w:br/>
+        <w:t>===== regla CRS (bloqueo) =====</w:t>
+        <w:br/>
+        <w:t xml:space="preserve">     34 "ruleId":"949110"</w:t>
+        <w:br/>
+        <w:t xml:space="preserve">     34 "message":"Inbound Anomaly Score Exceeded (Total Score: 5)"</w:t>
+        <w:br/>
+        <w:t xml:space="preserve">     33 "message":"Request content type is not allowed by policy"</w:t>
+        <w:br/>
+        <w:t xml:space="preserve">      1 "ruleId":"942100"</w:t>
+        <w:br/>
+        <w:t xml:space="preserve">      1 "message":"SQL Injection Attack Detected via libinjection"</w:t>
       </w:r>
     </w:p>
     <w:p>
@@ -33,7 +150,7 @@
         <w:pStyle w:val="Caption"/>
       </w:pPr>
       <w:r>
-        <w:t>Figura 1. Juice Shop a través del proxy WAAP (puerto 8080).</w:t>
+        <w:t>Figura 1. Juice Shop servido a través del proxy WAAP (:8080).</w:t>
       </w:r>
     </w:p>
     <w:p>
@@ -77,7 +194,7 @@
     </w:p>
     <w:p>
       <w:pPr>
-        <w:pStyle w:val="Heading2"/>
+        <w:pStyle w:val="Heading1"/>
       </w:pPr>
       <w:r>
         <w:t>Fase 1 — Aplicación objetivo vulnerable</w:t>
@@ -85,106 +202,42 @@
     </w:p>
     <w:p>
       <w:r>
-        <w:t>OWASP Juice Shop 20.2.0 desplegado. Score Board disponible en /#/score-board (categorías OWASP: Injection, Broken Access Control, XSS, Sensitive Data Exposure, etc.). El endpoint /rest/products/search?q=apple responde JSON success a través del WAAP.</w:t>
-      </w:r>
-    </w:p>
-    <w:p>
-      <w:pPr>
-        <w:pStyle w:val="Caption"/>
-      </w:pPr>
-      <w:r>
-        <w:t>Figura 2. Score Board con retos por categoría OWASP.</w:t>
-      </w:r>
-    </w:p>
-    <w:p>
-      <w:pPr>
-        <w:jc w:val="center"/>
-      </w:pPr>
-      <w:r>
-        <w:drawing>
-          <wp:inline xmlns:a="http://schemas.openxmlformats.org/drawingml/2006/main" xmlns:pic="http://schemas.openxmlformats.org/drawingml/2006/picture">
-            <wp:extent cx="5486400" cy="3614758"/>
-            <wp:docPr id="2" name="Picture 2"/>
-            <wp:cNvGraphicFramePr>
-              <a:graphicFrameLocks noChangeAspect="1"/>
-            </wp:cNvGraphicFramePr>
-            <a:graphic>
-              <a:graphicData uri="http://schemas.openxmlformats.org/drawingml/2006/picture">
-                <pic:pic>
-                  <pic:nvPicPr>
-                    <pic:cNvPr id="0" name="02-scoreboard.png"/>
-                    <pic:cNvPicPr/>
-                  </pic:nvPicPr>
-                  <pic:blipFill>
-                    <a:blip r:embed="rId10"/>
-                    <a:stretch>
-                      <a:fillRect/>
-                    </a:stretch>
-                  </pic:blipFill>
-                  <pic:spPr>
-                    <a:xfrm>
-                      <a:off x="0" y="0"/>
-                      <a:ext cx="5486400" cy="3614758"/>
-                    </a:xfrm>
-                    <a:prstGeom prst="rect"/>
-                  </pic:spPr>
-                </pic:pic>
-              </a:graphicData>
-            </a:graphic>
-          </wp:inline>
-        </w:drawing>
-      </w:r>
-    </w:p>
-    <w:p>
-      <w:pPr>
-        <w:pStyle w:val="Caption"/>
-      </w:pPr>
-      <w:r>
-        <w:t>Figura 3. Tráfico normal: búsqueda de producto vía WAAP (200).</w:t>
-      </w:r>
-    </w:p>
-    <w:p>
-      <w:pPr>
-        <w:jc w:val="center"/>
-      </w:pPr>
-      <w:r>
-        <w:drawing>
-          <wp:inline xmlns:a="http://schemas.openxmlformats.org/drawingml/2006/main" xmlns:pic="http://schemas.openxmlformats.org/drawingml/2006/picture">
-            <wp:extent cx="5486400" cy="3614758"/>
-            <wp:docPr id="3" name="Picture 3"/>
-            <wp:cNvGraphicFramePr>
-              <a:graphicFrameLocks noChangeAspect="1"/>
-            </wp:cNvGraphicFramePr>
-            <a:graphic>
-              <a:graphicData uri="http://schemas.openxmlformats.org/drawingml/2006/picture">
-                <pic:pic>
-                  <pic:nvPicPr>
-                    <pic:cNvPr id="0" name="03-search-normal.png"/>
-                    <pic:cNvPicPr/>
-                  </pic:nvPicPr>
-                  <pic:blipFill>
-                    <a:blip r:embed="rId11"/>
-                    <a:stretch>
-                      <a:fillRect/>
-                    </a:stretch>
-                  </pic:blipFill>
-                  <pic:spPr>
-                    <a:xfrm>
-                      <a:off x="0" y="0"/>
-                      <a:ext cx="5486400" cy="3614758"/>
-                    </a:xfrm>
-                    <a:prstGeom prst="rect"/>
-                  </pic:spPr>
-                </pic:pic>
-              </a:graphicData>
-            </a:graphic>
-          </wp:inline>
-        </w:drawing>
+        <w:rPr>
+          <w:b/>
+          <w:i w:val="0"/>
+        </w:rPr>
+        <w:t>Objetivo: blanco controlado con vulnerabilidades documentadas (PDF p.10).</w:t>
       </w:r>
     </w:p>
     <w:p>
       <w:r>
-        <w:t>Tabla 1. Línea base de vulnerabilidades (entregable Fase 1).</w:t>
+        <w:rPr>
+          <w:b w:val="0"/>
+          <w:i w:val="0"/>
+        </w:rPr>
+        <w:t>Paso a paso ejecutado:</w:t>
+      </w:r>
+    </w:p>
+    <w:p>
+      <w:r>
+        <w:rPr>
+          <w:rFonts w:ascii="Consolas" w:hAnsi="Consolas"/>
+          <w:sz w:val="17"/>
+        </w:rPr>
+        <w:t>curl -s http://localhost:8080/rest/admin/application-version  # {"version":"20.2.0"}</w:t>
+        <w:br/>
+        <w:t>curl -s "http://localhost:8080/rest/products/search?q=apple"  # JSON success vía WAAP</w:t>
+        <w:br/>
+        <w:t># Navegador: http://localhost:8080/#/score-board (retos por categoría OWASP)</w:t>
+      </w:r>
+    </w:p>
+    <w:p>
+      <w:r>
+        <w:rPr>
+          <w:b w:val="0"/>
+          <w:i w:val="0"/>
+        </w:rPr>
+        <w:t>Línea base de vulnerabilidades (entregable Fase 1):</w:t>
       </w:r>
     </w:p>
     <w:tbl>
@@ -466,15 +519,158 @@
     </w:tbl>
     <w:p>
       <w:pPr>
-        <w:pStyle w:val="Heading2"/>
+        <w:pStyle w:val="Caption"/>
       </w:pPr>
       <w:r>
-        <w:t>Fase 2 — Capa base WAF/WAAP (reglas CRS, PL1)</w:t>
+        <w:t>Figura 2. Score Board (1%, categorías OWASP).</w:t>
+      </w:r>
+    </w:p>
+    <w:p>
+      <w:pPr>
+        <w:jc w:val="center"/>
+      </w:pPr>
+      <w:r>
+        <w:drawing>
+          <wp:inline xmlns:a="http://schemas.openxmlformats.org/drawingml/2006/main" xmlns:pic="http://schemas.openxmlformats.org/drawingml/2006/picture">
+            <wp:extent cx="5486400" cy="3614758"/>
+            <wp:docPr id="2" name="Picture 2"/>
+            <wp:cNvGraphicFramePr>
+              <a:graphicFrameLocks noChangeAspect="1"/>
+            </wp:cNvGraphicFramePr>
+            <a:graphic>
+              <a:graphicData uri="http://schemas.openxmlformats.org/drawingml/2006/picture">
+                <pic:pic>
+                  <pic:nvPicPr>
+                    <pic:cNvPr id="0" name="02-scoreboard.png"/>
+                    <pic:cNvPicPr/>
+                  </pic:nvPicPr>
+                  <pic:blipFill>
+                    <a:blip r:embed="rId10"/>
+                    <a:stretch>
+                      <a:fillRect/>
+                    </a:stretch>
+                  </pic:blipFill>
+                  <pic:spPr>
+                    <a:xfrm>
+                      <a:off x="0" y="0"/>
+                      <a:ext cx="5486400" cy="3614758"/>
+                    </a:xfrm>
+                    <a:prstGeom prst="rect"/>
+                  </pic:spPr>
+                </pic:pic>
+              </a:graphicData>
+            </a:graphic>
+          </wp:inline>
+        </w:drawing>
+      </w:r>
+    </w:p>
+    <w:p>
+      <w:pPr>
+        <w:pStyle w:val="Caption"/>
+      </w:pPr>
+      <w:r>
+        <w:t>Figura 3. Tráfico normal: búsqueda vía WAAP (200).</w:t>
+      </w:r>
+    </w:p>
+    <w:p>
+      <w:pPr>
+        <w:jc w:val="center"/>
+      </w:pPr>
+      <w:r>
+        <w:drawing>
+          <wp:inline xmlns:a="http://schemas.openxmlformats.org/drawingml/2006/main" xmlns:pic="http://schemas.openxmlformats.org/drawingml/2006/picture">
+            <wp:extent cx="5486400" cy="3614758"/>
+            <wp:docPr id="3" name="Picture 3"/>
+            <wp:cNvGraphicFramePr>
+              <a:graphicFrameLocks noChangeAspect="1"/>
+            </wp:cNvGraphicFramePr>
+            <a:graphic>
+              <a:graphicData uri="http://schemas.openxmlformats.org/drawingml/2006/picture">
+                <pic:pic>
+                  <pic:nvPicPr>
+                    <pic:cNvPr id="0" name="03-search-normal.png"/>
+                    <pic:cNvPicPr/>
+                  </pic:nvPicPr>
+                  <pic:blipFill>
+                    <a:blip r:embed="rId11"/>
+                    <a:stretch>
+                      <a:fillRect/>
+                    </a:stretch>
+                  </pic:blipFill>
+                  <pic:spPr>
+                    <a:xfrm>
+                      <a:off x="0" y="0"/>
+                      <a:ext cx="5486400" cy="3614758"/>
+                    </a:xfrm>
+                    <a:prstGeom prst="rect"/>
+                  </pic:spPr>
+                </pic:pic>
+              </a:graphicData>
+            </a:graphic>
+          </wp:inline>
+        </w:drawing>
+      </w:r>
+    </w:p>
+    <w:p>
+      <w:pPr>
+        <w:pStyle w:val="Heading1"/>
+      </w:pPr>
+      <w:r>
+        <w:t>Fase 2 — Capa base WAF/WAAP con CRS (PL1)</w:t>
       </w:r>
     </w:p>
     <w:p>
       <w:r>
-        <w:t>Bloqueo exitoso: payload SQLi clásico q=' OR '1'='1 responde 403 Forbidden. El log del proxy (docker compose logs waap-proxy) registra regla CRS 942100 "SQL Injection Attack Detected via libinjection" y 949110 "Inbound Anomaly Score Exceeded (5)". En esta imagen el log de auditoría se emite a docker logs (stderr), no a /var/log/modsec_audit.log.</w:t>
+        <w:rPr>
+          <w:b/>
+          <w:i w:val="0"/>
+        </w:rPr>
+        <w:t>Objetivo: primera línea de defensa con OWASP CRS y evidencia de bloqueo + evasión (PDF p.10).</w:t>
+      </w:r>
+    </w:p>
+    <w:p>
+      <w:r>
+        <w:rPr>
+          <w:b w:val="0"/>
+          <w:i w:val="0"/>
+        </w:rPr>
+        <w:t>Paso a paso ejecutado:</w:t>
+      </w:r>
+    </w:p>
+    <w:p>
+      <w:r>
+        <w:rPr>
+          <w:rFonts w:ascii="Consolas" w:hAnsi="Consolas"/>
+          <w:sz w:val="17"/>
+        </w:rPr>
+        <w:t># Nivel de paranoia (PDF: iniciar en PL1)</w:t>
+        <w:br/>
+        <w:t>docker compose exec waap-proxy env | grep -E 'PARANOIA|BACKEND'</w:t>
+        <w:br/>
+        <w:t># PARANOIA=1, BLOCKING_PARANOIA=1, BACKEND=http://juice-shop:3000</w:t>
+        <w:br/>
+        <w:t># Prueba de detección básica:</w:t>
+        <w:br/>
+        <w:t>curl -i --get --data-urlencode "q=' OR '1'='1" \</w:t>
+        <w:br/>
+        <w:t xml:space="preserve">  http://localhost:8080/rest/products/search   # -&gt; 403 Forbidden</w:t>
+        <w:br/>
+        <w:t># Prueba de evasión (payload fragmentado en 2 parámetros):</w:t>
+        <w:br/>
+        <w:t>curl -i "http://localhost:8080/rest/products/search?q='%20&amp;x=OR%201=1"  # -&gt; 200</w:t>
+        <w:br/>
+        <w:t># Logs (esta imagen emite el audit log a docker logs, no a /var/log/modsec_audit.log):</w:t>
+        <w:br/>
+        <w:t>docker compose logs waap-proxy | grep -E '942100|949110'</w:t>
+      </w:r>
+    </w:p>
+    <w:p>
+      <w:r>
+        <w:rPr>
+          <w:b w:val="0"/>
+          <w:i w:val="0"/>
+        </w:rPr>
+        <w:t>Resultado: SQLi clásico/encoded/comentarios/UNION/XSS/traversal → 403 (regla 942100 libinjection + 949110 anomaly score). Solo el fragmentado q=' &amp; x=OR 1=1 → 200 ({"status":"success","data":[]}): el CRS PL1 evalúa cada parámetro por separado.</w:t>
       </w:r>
     </w:p>
     <w:p>
@@ -525,16 +721,11 @@
       </w:r>
     </w:p>
     <w:p>
-      <w:r>
-        <w:t>Evasión exitosa (base comparativa para Fase 3): payload fragmentado en dos parámetros q=' &amp; x=OR 1=1 responde 200 OK con {"status":"success","data":[]} — el motor PL1 evalúa cada parámetro por separado y no detecta la inyección. Motivación directa para el módulo IA/ML y RASP.</w:t>
-      </w:r>
-    </w:p>
-    <w:p>
       <w:pPr>
         <w:pStyle w:val="Caption"/>
       </w:pPr>
       <w:r>
-        <w:t>Figura 5. Evasión: payload fragmentado → 200 OK (no detectado por CRS PL1).</w:t>
+        <w:t>Figura 5. Evasión: payload fragmentado → 200 OK (base comparativa para Fase 3).</w:t>
       </w:r>
     </w:p>
     <w:p>
@@ -577,317 +768,8 @@
       </w:r>
     </w:p>
     <w:p>
-      <w:r>
-        <w:t>Tabla 2. Matriz Fase 2 (entregable: 1 bloqueo + 1 evasión).</w:t>
-      </w:r>
-    </w:p>
-    <w:tbl>
-      <w:tblPr>
-        <w:tblStyle w:val="TableGrid"/>
-        <w:tblW w:type="auto" w:w="0"/>
-        <w:tblLook w:firstColumn="1" w:firstRow="1" w:lastColumn="0" w:lastRow="0" w:noHBand="0" w:noVBand="1" w:val="04A0"/>
-      </w:tblPr>
-      <w:tblGrid>
-        <w:gridCol w:w="2880"/>
-        <w:gridCol w:w="2880"/>
-        <w:gridCol w:w="2880"/>
-      </w:tblGrid>
-      <w:tr>
-        <w:tc>
-          <w:tcPr>
-            <w:tcW w:type="dxa" w:w="2880"/>
-          </w:tcPr>
-          <w:p>
-            <w:r>
-              <w:rPr>
-                <w:b/>
-              </w:rPr>
-              <w:t>Payload / técnica</w:t>
-            </w:r>
-          </w:p>
-        </w:tc>
-        <w:tc>
-          <w:tcPr>
-            <w:tcW w:type="dxa" w:w="2880"/>
-          </w:tcPr>
-          <w:p>
-            <w:r>
-              <w:rPr>
-                <w:b/>
-              </w:rPr>
-              <w:t>Reglas CRS PL1</w:t>
-            </w:r>
-          </w:p>
-        </w:tc>
-        <w:tc>
-          <w:tcPr>
-            <w:tcW w:type="dxa" w:w="2880"/>
-          </w:tcPr>
-          <w:p>
-            <w:r>
-              <w:rPr>
-                <w:b/>
-              </w:rPr>
-              <w:t>Evidencia</w:t>
-            </w:r>
-          </w:p>
-        </w:tc>
-      </w:tr>
-      <w:tr>
-        <w:tc>
-          <w:tcPr>
-            <w:tcW w:type="dxa" w:w="2880"/>
-          </w:tcPr>
-          <w:p>
-            <w:r>
-              <w:t>SQLi clásico ' OR '1'='1</w:t>
-            </w:r>
-          </w:p>
-        </w:tc>
-        <w:tc>
-          <w:tcPr>
-            <w:tcW w:type="dxa" w:w="2880"/>
-          </w:tcPr>
-          <w:p>
-            <w:r>
-              <w:t>BLOQUEADO (403)</w:t>
-            </w:r>
-          </w:p>
-        </w:tc>
-        <w:tc>
-          <w:tcPr>
-            <w:tcW w:type="dxa" w:w="2880"/>
-          </w:tcPr>
-          <w:p>
-            <w:r>
-              <w:t>Fig. 4 + reglas 942100/949110</w:t>
-            </w:r>
-          </w:p>
-        </w:tc>
-      </w:tr>
-      <w:tr>
-        <w:tc>
-          <w:tcPr>
-            <w:tcW w:type="dxa" w:w="2880"/>
-          </w:tcPr>
-          <w:p>
-            <w:r>
-              <w:t>SQLi URL-encoded</w:t>
-            </w:r>
-          </w:p>
-        </w:tc>
-        <w:tc>
-          <w:tcPr>
-            <w:tcW w:type="dxa" w:w="2880"/>
-          </w:tcPr>
-          <w:p>
-            <w:r>
-              <w:t>BLOQUEADO (403)</w:t>
-            </w:r>
-          </w:p>
-        </w:tc>
-        <w:tc>
-          <w:tcPr>
-            <w:tcW w:type="dxa" w:w="2880"/>
-          </w:tcPr>
-          <w:p>
-            <w:r>
-              <w:t>docker logs waap-proxy</w:t>
-            </w:r>
-          </w:p>
-        </w:tc>
-      </w:tr>
-      <w:tr>
-        <w:tc>
-          <w:tcPr>
-            <w:tcW w:type="dxa" w:w="2880"/>
-          </w:tcPr>
-          <w:p>
-            <w:r>
-              <w:t>SQLi comentarios /**/</w:t>
-            </w:r>
-          </w:p>
-        </w:tc>
-        <w:tc>
-          <w:tcPr>
-            <w:tcW w:type="dxa" w:w="2880"/>
-          </w:tcPr>
-          <w:p>
-            <w:r>
-              <w:t>BLOQUEADO (403)</w:t>
-            </w:r>
-          </w:p>
-        </w:tc>
-        <w:tc>
-          <w:tcPr>
-            <w:tcW w:type="dxa" w:w="2880"/>
-          </w:tcPr>
-          <w:p>
-            <w:r>
-              <w:t>docker logs waap-proxy</w:t>
-            </w:r>
-          </w:p>
-        </w:tc>
-      </w:tr>
-      <w:tr>
-        <w:tc>
-          <w:tcPr>
-            <w:tcW w:type="dxa" w:w="2880"/>
-          </w:tcPr>
-          <w:p>
-            <w:r>
-              <w:t>XSS &lt;script&gt;alert(1)&lt;/script&gt;</w:t>
-            </w:r>
-          </w:p>
-        </w:tc>
-        <w:tc>
-          <w:tcPr>
-            <w:tcW w:type="dxa" w:w="2880"/>
-          </w:tcPr>
-          <w:p>
-            <w:r>
-              <w:t>BLOQUEADO (403)</w:t>
-            </w:r>
-          </w:p>
-        </w:tc>
-        <w:tc>
-          <w:tcPr>
-            <w:tcW w:type="dxa" w:w="2880"/>
-          </w:tcPr>
-          <w:p>
-            <w:r>
-              <w:t>reglas 941100/941110/941160</w:t>
-            </w:r>
-          </w:p>
-        </w:tc>
-      </w:tr>
-      <w:tr>
-        <w:tc>
-          <w:tcPr>
-            <w:tcW w:type="dxa" w:w="2880"/>
-          </w:tcPr>
-          <w:p>
-            <w:r>
-              <w:t>Path traversal ../../etc/passwd</w:t>
-            </w:r>
-          </w:p>
-        </w:tc>
-        <w:tc>
-          <w:tcPr>
-            <w:tcW w:type="dxa" w:w="2880"/>
-          </w:tcPr>
-          <w:p>
-            <w:r>
-              <w:t>BLOQUEADO (403)</w:t>
-            </w:r>
-          </w:p>
-        </w:tc>
-        <w:tc>
-          <w:tcPr>
-            <w:tcW w:type="dxa" w:w="2880"/>
-          </w:tcPr>
-          <w:p>
-            <w:r>
-              <w:t>reglas 930100/930110/930120</w:t>
-            </w:r>
-          </w:p>
-        </w:tc>
-      </w:tr>
-      <w:tr>
-        <w:tc>
-          <w:tcPr>
-            <w:tcW w:type="dxa" w:w="2880"/>
-          </w:tcPr>
-          <w:p>
-            <w:r>
-              <w:t>SQLi fragmentado q=' &amp; x=OR 1=1</w:t>
-            </w:r>
-          </w:p>
-        </w:tc>
-        <w:tc>
-          <w:tcPr>
-            <w:tcW w:type="dxa" w:w="2880"/>
-          </w:tcPr>
-          <w:p>
-            <w:r>
-              <w:t>EVADE (200)</w:t>
-            </w:r>
-          </w:p>
-        </w:tc>
-        <w:tc>
-          <w:tcPr>
-            <w:tcW w:type="dxa" w:w="2880"/>
-          </w:tcPr>
-          <w:p>
-            <w:r>
-              <w:t>Fig. 5</w:t>
-            </w:r>
-          </w:p>
-        </w:tc>
-      </w:tr>
-    </w:tbl>
-    <w:p>
       <w:pPr>
-        <w:pStyle w:val="Heading2"/>
-      </w:pPr>
-      <w:r>
-        <w:t>Anexo — Salidas de terminal</w:t>
-      </w:r>
-    </w:p>
-    <w:p>
-      <w:r>
-        <w:rPr>
-          <w:rFonts w:ascii="Consolas" w:hAnsi="Consolas"/>
-          <w:sz w:val="16"/>
-        </w:rPr>
-        <w:t>===== docker compose ps =====</w:t>
-        <w:br/>
-        <w:t>NAME                       IMAGE                          COMMAND                  SERVICE      CREATED          STATUS                    PORTS</w:t>
-        <w:br/>
-        <w:t>taller-waap-juice-shop-1   bkimminich/juice-shop:latest   "/nodejs/bin/node /jâ¦"   juice-shop   32 minutes ago   Up 32 minutes             0.0.0.0:3000-&gt;3000/tcp, [::]:3000-&gt;3000/tcp</w:t>
-        <w:br/>
-        <w:t>taller-waap-waap-proxy-1   owasp/modsecurity-crs:nginx    "/docker-entrypoint.â¦"   waap-proxy   32 minutes ago   Up 32 minutes (healthy)   0.0.0.0:8080-&gt;8080/tcp, [::]:8080-&gt;8080/tcp</w:t>
-        <w:br/>
-        <w:br/>
-        <w:t>===== curl cÃ³digos =====</w:t>
-        <w:br/>
-        <w:t>HOME via WAAP 8080: 200</w:t>
-        <w:br/>
-        <w:t>search normal: 200</w:t>
-        <w:br/>
-        <w:t>sqli clasico: 403</w:t>
-        <w:br/>
-        <w:t>evasion fragmentada: 200</w:t>
-        <w:br/>
-        <w:br/>
-        <w:t>===== WAAP env =====</w:t>
-        <w:br/>
-        <w:t>PARANOIA=1</w:t>
-        <w:br/>
-        <w:t>BACKEND=http://juice-shop:3000</w:t>
-        <w:br/>
-        <w:t>MODSEC_DISABLE_BACKEND_COMPRESSION=Off</w:t>
-        <w:br/>
-        <w:t>BLOCKING_PARANOIA=1</w:t>
-        <w:br/>
-        <w:br/>
-        <w:t>===== regla CRS (bloqueo) =====</w:t>
-        <w:br/>
-        <w:t xml:space="preserve">     34 "ruleId":"949110"</w:t>
-        <w:br/>
-        <w:t xml:space="preserve">     34 "message":"Inbound Anomaly Score Exceeded (Total Score: 5)"</w:t>
-        <w:br/>
-        <w:t xml:space="preserve">     33 "message":"Request content type is not allowed by policy"</w:t>
-        <w:br/>
-        <w:t xml:space="preserve">      1 "ruleId":"942100"</w:t>
-        <w:br/>
-        <w:t xml:space="preserve">      1 "message":"SQL Injection Attack Detected via libinjection"</w:t>
-        <w:br/>
-      </w:r>
-    </w:p>
-    <w:p>
-      <w:pPr>
-        <w:pStyle w:val="Heading2"/>
+        <w:pStyle w:val="Heading1"/>
       </w:pPr>
       <w:r>
         <w:t>Fase 3 — Módulo de detección basado en IA/ML</w:t>
@@ -895,34 +777,81 @@
     </w:p>
     <w:p>
       <w:r>
-        <w:t>Tráfico normal simulado con waap/ml/gen_traffic.py (120 peticiones a ritmo humano, ~15 min, vía WAAP): búsquedas, home, producto, login, challenges. Sin ningún 403 del CRS (solo 401/404 benignos), por lo que el set es comportamiento normal limpio. Extracción literal del PDF (6 features) y entrenamiento literal (IsolationForest n_estimators=200, contamination=0.02, StandardScaler) → waap/ml/model.pkl (120 muestras; el .pkl está en .gitignore y se regenera con train_model.py).</w:t>
+        <w:rPr>
+          <w:b/>
+          <w:i w:val="0"/>
+        </w:rPr>
+        <w:t>Objetivo: modelo de anomalías entrenado solo con tráfico normal (PDF p.11-12).</w:t>
       </w:r>
     </w:p>
     <w:p>
       <w:r>
-        <w:t>Evidencia de entrenamiento:</w:t>
+        <w:rPr>
+          <w:b w:val="0"/>
+          <w:i w:val="0"/>
+        </w:rPr>
+        <w:t>Paso a paso ejecutado:</w:t>
       </w:r>
     </w:p>
     <w:p>
       <w:r>
         <w:rPr>
           <w:rFonts w:ascii="Consolas" w:hAnsi="Consolas"/>
-          <w:sz w:val="16"/>
+          <w:sz w:val="17"/>
         </w:rPr>
-        <w:t>Modelo entrenado y guardado en waap/ml/model.pkl (120 muestras)</w:t>
+        <w:t>python3 -m pip install --user scikit-learn pandas numpy joblib</w:t>
         <w:br/>
+        <w:t># 1. Tráfico normal simulado a ritmo humano (~15 min, 120 reqs vía WAAP):</w:t>
+        <w:br/>
+        <w:t>GEN_N=120 PACE=humano python3 waap/ml/gen_traffic.py  # -&gt; logs/access_normal.jsonl</w:t>
+        <w:br/>
+        <w:t># 2. Features literales del PDF (url_length, body_length, entropy, n_params,</w:t>
+        <w:br/>
+        <w:t>#    has_suspicious_chars, req_per_minute):</w:t>
+        <w:br/>
+        <w:t>python3 waap/ml/extract_features.py  # -&gt; logs/features_normal_traffic.csv</w:t>
+        <w:br/>
+        <w:t># 3. Entrenamiento literal (IsolationForest 200/0.02 + StandardScaler):</w:t>
+        <w:br/>
+        <w:t>python3 waap/ml/train_model.py       # -&gt; waap/ml/model.pkl (en .gitignore)</w:t>
+        <w:br/>
+        <w:t># 4. Evaluación: matriz 10 + 2 umbrales + ráfaga bot:</w:t>
+        <w:br/>
+        <w:t>python3 waap/ml/evaluate.py</w:t>
       </w:r>
     </w:p>
     <w:p>
       <w:r>
-        <w:t>Matriz de 10 peticiones (5 normales / 5 ataque, incluida la evasión fragmentada de Fase 2):</w:t>
+        <w:rPr>
+          <w:b w:val="0"/>
+          <w:i w:val="0"/>
+        </w:rPr>
+        <w:t>Lección metodológica: la primera pasada a ritmo máquina (0.05-0.4 s) contaminó req_per_minute (rpm hasta 200 = 'normal'); se repitió a ritmo humano (4-11 s, rpm 8±1), equivalente a los 15-20 min de navegación manual que pide el PDF.</w:t>
       </w:r>
     </w:p>
     <w:p>
       <w:r>
         <w:rPr>
           <w:rFonts w:ascii="Consolas" w:hAnsi="Consolas"/>
-          <w:sz w:val="16"/>
+          <w:sz w:val="17"/>
+        </w:rPr>
+        <w:t>Modelo entrenado y guardado en waap/ml/model.pkl (120 muestras)</w:t>
+      </w:r>
+    </w:p>
+    <w:p>
+      <w:r>
+        <w:rPr>
+          <w:b w:val="0"/>
+          <w:i w:val="0"/>
+        </w:rPr>
+        <w:t>Matriz de 10 peticiones (entregable Fase 3):</w:t>
+      </w:r>
+    </w:p>
+    <w:p>
+      <w:r>
+        <w:rPr>
+          <w:rFonts w:ascii="Consolas" w:hAnsi="Consolas"/>
+          <w:sz w:val="17"/>
         </w:rPr>
         <w:t>etiqueta                          score   &lt;-0.05   &lt;0.0  esperado</w:t>
         <w:br/>
@@ -954,34 +883,40 @@
         <w:t>req_per_minute=  30: score=+0.1690  anomalo(&lt;-0.05)=False</w:t>
         <w:br/>
         <w:t>req_per_minute= 120: score=+0.1690  anomalo(&lt;-0.05)=False</w:t>
-        <w:br/>
       </w:r>
     </w:p>
     <w:p>
       <w:r>
-        <w:t>Comparativa de umbrales (detección vs falsos positivos):</w:t>
+        <w:rPr>
+          <w:b w:val="0"/>
+          <w:i w:val="0"/>
+        </w:rPr>
+        <w:t>Umbrales (detección vs falsos positivos):</w:t>
       </w:r>
     </w:p>
     <w:p>
       <w:r>
         <w:rPr>
           <w:rFonts w:ascii="Consolas" w:hAnsi="Consolas"/>
-          <w:sz w:val="16"/>
+          <w:sz w:val="17"/>
         </w:rPr>
         <w:t>umbral -0.05: TP=2/5 FN=3/5 FP=2/5 TN=3/5  deteccion=40% FPR=40%</w:t>
         <w:br/>
         <w:t>umbral +0.00: TP=5/5 FN=0/5 FP=4/5 TN=1/5  deteccion=100% FPR=80%</w:t>
-        <w:br/>
       </w:r>
     </w:p>
     <w:p>
       <w:r>
-        <w:t>Discusión de falsos positivos (entregable PDF): con umbral -0.05 se detecta 2/5 ataques (SQLi encoded, XSS) con 2 FP (login válido, home); con umbral 0.0 se detecta 5/5 pero con 4 FP. La ráfaga bot apenas mueve el score (+0.16→+0.17): IsolationForest no ordena más allá del máximo de entrenamiento, así que req_per_minute por sí solo no cruza el umbral — limitación documentada y propuesta de mejora (Q7): regla híbrida tasa+score. La evasión fragmentada (q=' solo) es estadísticamente normal: ni CRS ni ML la ven; motivación de Fase 4.</w:t>
+        <w:rPr>
+          <w:b w:val="0"/>
+          <w:i w:val="0"/>
+        </w:rPr>
+        <w:t>Discusión (entregable PDF): umbral -0.05 → 2/5 ataques con 2 FP (login válido, home); umbral 0.0 → 5/5 con 4 FP. La ráfaga bot apenas mueve el score (+0.16→+0.17): se depuró hasta la causa (los árboles no ordenan más allá del máximo de entrenamiento), por lo que req_per_minute solo no cruza el umbral — limitación documentada y propuesta Q7 (regla híbrida tasa+score). La evasión fragmentada (q=' aislado) es estadísticamente normal: ni CRS ni ML la ven → motivación de Fase 4.</w:t>
       </w:r>
     </w:p>
     <w:p>
       <w:pPr>
-        <w:pStyle w:val="Heading2"/>
+        <w:pStyle w:val="Heading1"/>
       </w:pPr>
       <w:r>
         <w:t>Fase 4 — Integración RASP</w:t>
@@ -989,19 +924,68 @@
     </w:p>
     <w:p>
       <w:r>
-        <w:t>Nota metodológica: el rasp_agent.py Flask del PDF no es integrable a Juice Shop (Node/Express). Se implementó app/rasp-demo/server.js en Express, puerto 1:1 del PDF (mismo SQLI_PATTERN, misma query final concatenada, mismo 403 + log). OpenRASP está inactivo desde 2022 y sin agente Node vigente, por lo que el middleware propio es la vía académica viable. app/rasp_agent.py queda como referencia literal del PDF.</w:t>
+        <w:rPr>
+          <w:b/>
+          <w:i w:val="0"/>
+        </w:rPr>
+        <w:t>Objetivo: protección en tiempo de ejecución con contexto real (PDF p.13).</w:t>
       </w:r>
     </w:p>
     <w:p>
       <w:r>
-        <w:t>Bloqueos (directo al demo, sin WAAP):</w:t>
+        <w:rPr>
+          <w:b w:val="0"/>
+          <w:i w:val="0"/>
+        </w:rPr>
+        <w:t>Nota metodológica: el rasp_agent.py Flask del PDF no es integrable a Juice Shop (Node/Express). Se implementó app/rasp-demo/server.js en Express, puerto 1:1 del PDF (mismo SQLI_PATTERN, query final concatenada, 403 + log). OpenRASP está inactivo desde 2022 sin agente Node vigente; app/rasp_agent.py queda como referencia literal del PDF.</w:t>
+      </w:r>
+    </w:p>
+    <w:p>
+      <w:r>
+        <w:rPr>
+          <w:b w:val="0"/>
+          <w:i w:val="0"/>
+        </w:rPr>
+        <w:t>Paso a paso ejecutado:</w:t>
       </w:r>
     </w:p>
     <w:p>
       <w:r>
         <w:rPr>
           <w:rFonts w:ascii="Consolas" w:hAnsi="Consolas"/>
-          <w:sz w:val="16"/>
+          <w:sz w:val="17"/>
+        </w:rPr>
+        <w:t>cd app/rasp-demo &amp;&amp; npm init -y &amp;&amp; npm i express</w:t>
+        <w:br/>
+        <w:t>RASP_ENABLED=1 RASP_PORT=3001 node server.js &amp;   # demo protegido</w:t>
+        <w:br/>
+        <w:t>RASP_ENABLED=0 RASP_PORT=3002 node server.js &amp;   # demo vulnerable (control)</w:t>
+        <w:br/>
+        <w:t># Caso 1: fragmentado directo, sin WAAP (PDF §4.2.1):</w:t>
+        <w:br/>
+        <w:t>curl -X POST :3001/login -d '{"username":"'","password":"OR 1=1--"}'  # 403</w:t>
+        <w:br/>
+        <w:t>curl -X POST :3002/login -d '{"username":"'","password":"OR 1=1--"}'  # dump total</w:t>
+        <w:br/>
+        <w:t># Caso 2: UNION (familia Fase 2): 403 vs dump.</w:t>
+        <w:br/>
+        <w:t># Caso 3: latencia, 30 reqs alternadas + microbench 200k iters en proceso.</w:t>
+      </w:r>
+    </w:p>
+    <w:p>
+      <w:r>
+        <w:rPr>
+          <w:b w:val="0"/>
+          <w:i w:val="0"/>
+        </w:rPr>
+        <w:t>Bloqueos:</w:t>
+      </w:r>
+    </w:p>
+    <w:p>
+      <w:r>
+        <w:rPr>
+          <w:rFonts w:ascii="Consolas" w:hAnsi="Consolas"/>
+          <w:sz w:val="17"/>
         </w:rPr>
         <w:t>===== CASO 1: fragmentado (user="'" pass="OR 1=1--") =====</w:t>
         <w:br/>
@@ -1026,11 +1010,14 @@
         <w:t>RASP ON : 200</w:t>
         <w:br/>
         <w:t>RASP OFF: 200</w:t>
-        <w:br/>
       </w:r>
     </w:p>
     <w:p>
       <w:r>
+        <w:rPr>
+          <w:b w:val="0"/>
+          <w:i w:val="0"/>
+        </w:rPr>
         <w:t>Logs del agente:</w:t>
       </w:r>
     </w:p>
@@ -1038,29 +1025,36 @@
       <w:r>
         <w:rPr>
           <w:rFonts w:ascii="Consolas" w:hAnsi="Consolas"/>
-          <w:sz w:val="16"/>
+          <w:sz w:val="17"/>
         </w:rPr>
         <w:t>RASP: consulta SQL bloqueada en tiempo de ejecucion: SELECT * FROM users WHERE user=''' AND pass='OR 1=1--'</w:t>
         <w:br/>
         <w:t>RASP: consulta SQL bloqueada en tiempo de ejecucion: SELECT * FROM users WHERE user='admin' UNION SELECT * FROM users--' AND pass='x'</w:t>
-        <w:br/>
       </w:r>
     </w:p>
     <w:p>
       <w:r>
-        <w:t>Lectura: el fragmentado (403 con RASP / dump total sin RASP) y el UNION (idem) confirman la tesis del PDF — el contexto de ejecución ve lo que el perímetro no. Hallazgo honesto: la forma string ' OR '1'='1 evade también el regex literal del PDF (solo cubre OR 1=1 numérico); fix propuesto: añadir OR '...'='...' al patrón.</w:t>
+        <w:rPr>
+          <w:b w:val="0"/>
+          <w:i w:val="0"/>
+        </w:rPr>
+        <w:t>Lectura: el fragmentado y el UNION confirman la tesis — el contexto de ejecución ve lo que el perímetro no. Hallazgo honesto: la forma string ' OR '1'='1 evade también el regex literal del PDF (solo cubre OR 1=1 numérico); fix propuesto: añadir OR '...'='...'.</w:t>
       </w:r>
     </w:p>
     <w:p>
       <w:r>
-        <w:t>Latencia con/sin RASP:</w:t>
+        <w:rPr>
+          <w:b w:val="0"/>
+          <w:i w:val="0"/>
+        </w:rPr>
+        <w:t>Latencia:</w:t>
       </w:r>
     </w:p>
     <w:p>
       <w:r>
         <w:rPr>
           <w:rFonts w:ascii="Consolas" w:hAnsi="Consolas"/>
-          <w:sz w:val="16"/>
+          <w:sz w:val="17"/>
         </w:rPr>
         <w:t>HTTP end-to-end (30 reqs alternadas con warmup, login legitimo):</w:t>
         <w:br/>
@@ -1086,12 +1080,11 @@
         <w:t>con el 1-4% reportado por OpenRASP en el peor caso (PDF p.6: limitacion real es el</w:t>
         <w:br/>
         <w:t>acoplamiento por servicio, no la latencia).</w:t>
-        <w:br/>
       </w:r>
     </w:p>
     <w:p>
       <w:pPr>
-        <w:pStyle w:val="Heading2"/>
+        <w:pStyle w:val="Heading1"/>
       </w:pPr>
       <w:r>
         <w:t>Matriz comparativa por capas (avance Fase 6)</w:t>
@@ -1416,6 +1409,159 @@
         </w:tc>
       </w:tr>
     </w:tbl>
+    <w:p>
+      <w:pPr>
+        <w:pStyle w:val="Heading1"/>
+      </w:pPr>
+      <w:r>
+        <w:t>Anexo A — Paso a paso reproducible (todo lo hecho)</w:t>
+      </w:r>
+    </w:p>
+    <w:p>
+      <w:r>
+        <w:rPr>
+          <w:b/>
+          <w:i w:val="0"/>
+        </w:rPr>
+        <w:t>Secuencia exacta, en orden, desde un clon limpio (rama lab/fases-0-4):</w:t>
+      </w:r>
+    </w:p>
+    <w:p>
+      <w:r>
+        <w:rPr>
+          <w:rFonts w:ascii="Consolas" w:hAnsi="Consolas"/>
+          <w:sz w:val="17"/>
+        </w:rPr>
+        <w:t># 0. Requisitos: Ubuntu 22.04, Docker + Compose, Python 3.10, Node 22, LibreOffice.</w:t>
+        <w:br/>
+        <w:t>#    Usuario en grupo docker: sudo usermod -aG docker $USER (re-login).</w:t>
+        <w:br/>
+        <w:t>git clone git@github.com:Jhojan98/taller-waap.git &amp;&amp; cd taller-waap</w:t>
+        <w:br/>
+        <w:t>git checkout lab/fases-0-4</w:t>
+        <w:br/>
+        <w:t># FASE 0</w:t>
+        <w:br/>
+        <w:t>cp .env.example .env</w:t>
+        <w:br/>
+        <w:t>docker compose pull &amp;&amp; docker compose up -d &amp;&amp; docker compose ps</w:t>
+        <w:br/>
+        <w:t>curl -i http://localhost:8080</w:t>
+        <w:br/>
+        <w:t># FASE 1</w:t>
+        <w:br/>
+        <w:t>curl -s http://localhost:8080/rest/admin/application-version</w:t>
+        <w:br/>
+        <w:t>curl -s 'http://localhost:8080/rest/products/search?q=apple'</w:t>
+        <w:br/>
+        <w:t># (navegador) http://localhost:8080/#/score-board</w:t>
+        <w:br/>
+        <w:t># FASE 2</w:t>
+        <w:br/>
+        <w:t>curl -i --get --data-urlencode "q=' OR '1'='1" http://localhost:8080/rest/products/search</w:t>
+        <w:br/>
+        <w:t>curl -i "http://localhost:8080/rest/products/search?q='%20&amp;x=OR%201=1"</w:t>
+        <w:br/>
+        <w:t>docker compose logs waap-proxy | grep -E '942100|949110'</w:t>
+        <w:br/>
+        <w:t># FASE 3</w:t>
+        <w:br/>
+        <w:t>python3 -m pip install --user scikit-learn pandas numpy joblib</w:t>
+        <w:br/>
+        <w:t>GEN_N=120 PACE=humano python3 waap/ml/gen_traffic.py</w:t>
+        <w:br/>
+        <w:t>python3 waap/ml/extract_features.py</w:t>
+        <w:br/>
+        <w:t>python3 waap/ml/train_model.py</w:t>
+        <w:br/>
+        <w:t>python3 waap/ml/evaluate.py</w:t>
+        <w:br/>
+        <w:t># FASE 4</w:t>
+        <w:br/>
+        <w:t>cd app/rasp-demo &amp;&amp; npm init -y &amp;&amp; npm i express &amp;&amp; cd ../..</w:t>
+        <w:br/>
+        <w:t>RASP_ENABLED=1 RASP_PORT=3001 node app/rasp-demo/server.js &amp;</w:t>
+        <w:br/>
+        <w:t>RASP_ENABLED=0 RASP_PORT=3002 node app/rasp-demo/server.js &amp;</w:t>
+        <w:br/>
+        <w:t>curl -X POST localhost:3001/login -H 'Content-Type: application/json' \</w:t>
+        <w:br/>
+        <w:t xml:space="preserve">  -d "{\"username\":\"'\",\"password\":\"OR 1=1--\"}"</w:t>
+        <w:br/>
+        <w:t># INFORME (regenerar este documento)</w:t>
+        <w:br/>
+        <w:t>python3 /tmp/opencode/build_informe_full.py  # o ruta del generador versionado</w:t>
+        <w:br/>
+        <w:t>soffice --headless --convert-to pdf Informe_Taller_WAAP_Fase0-2.docx</w:t>
+      </w:r>
+    </w:p>
+    <w:p>
+      <w:r>
+        <w:rPr>
+          <w:b w:val="0"/>
+          <w:i w:val="0"/>
+        </w:rPr>
+        <w:t>Nota: /tmp se limpia al reiniciar; conserve el generador (docs/ o scripts/) si necesita reproducibilidad futura. model.pkl y logs/*.jsonl se regeneran; no se versionan los .pkl.</w:t>
+      </w:r>
+    </w:p>
+    <w:p>
+      <w:pPr>
+        <w:pStyle w:val="Heading1"/>
+      </w:pPr>
+      <w:r>
+        <w:t>Anexo B — Salidas de terminal (Fases 0-2)</w:t>
+      </w:r>
+    </w:p>
+    <w:p>
+      <w:r>
+        <w:rPr>
+          <w:rFonts w:ascii="Consolas" w:hAnsi="Consolas"/>
+          <w:sz w:val="17"/>
+        </w:rPr>
+        <w:t>===== docker compose ps =====</w:t>
+        <w:br/>
+        <w:t>NAME                       IMAGE                          COMMAND                  SERVICE      CREATED          STATUS                    PORTS</w:t>
+        <w:br/>
+        <w:t>taller-waap-juice-shop-1   bkimminich/juice-shop:latest   "/nodejs/bin/node /jâ¦"   juice-shop   32 minutes ago   Up 32 minutes             0.0.0.0:3000-&gt;3000/tcp, [::]:3000-&gt;3000/tcp</w:t>
+        <w:br/>
+        <w:t>taller-waap-waap-proxy-1   owasp/modsecurity-crs:nginx    "/docker-entrypoint.â¦"   waap-proxy   32 minutes ago   Up 32 minutes (healthy)   0.0.0.0:8080-&gt;8080/tcp, [::]:8080-&gt;8080/tcp</w:t>
+        <w:br/>
+        <w:br/>
+        <w:t>===== curl cÃ³digos =====</w:t>
+        <w:br/>
+        <w:t>HOME via WAAP 8080: 200</w:t>
+        <w:br/>
+        <w:t>search normal: 200</w:t>
+        <w:br/>
+        <w:t>sqli clasico: 403</w:t>
+        <w:br/>
+        <w:t>evasion fragmentada: 200</w:t>
+        <w:br/>
+        <w:br/>
+        <w:t>===== WAAP env =====</w:t>
+        <w:br/>
+        <w:t>PARANOIA=1</w:t>
+        <w:br/>
+        <w:t>BACKEND=http://juice-shop:3000</w:t>
+        <w:br/>
+        <w:t>MODSEC_DISABLE_BACKEND_COMPRESSION=Off</w:t>
+        <w:br/>
+        <w:t>BLOCKING_PARANOIA=1</w:t>
+        <w:br/>
+        <w:br/>
+        <w:t>===== regla CRS (bloqueo) =====</w:t>
+        <w:br/>
+        <w:t xml:space="preserve">     34 "ruleId":"949110"</w:t>
+        <w:br/>
+        <w:t xml:space="preserve">     34 "message":"Inbound Anomaly Score Exceeded (Total Score: 5)"</w:t>
+        <w:br/>
+        <w:t xml:space="preserve">     33 "message":"Request content type is not allowed by policy"</w:t>
+        <w:br/>
+        <w:t xml:space="preserve">      1 "ruleId":"942100"</w:t>
+        <w:br/>
+        <w:t xml:space="preserve">      1 "message":"SQL Injection Attack Detected via libinjection"</w:t>
+      </w:r>
+    </w:p>
     <w:sectPr>
       <w:pgSz w:w="12240" w:h="15840"/>
       <w:pgMar w:top="1440" w:right="1800" w:bottom="1440" w:left="1800" w:header="720" w:footer="720" w:gutter="0"/>

</xml_diff>

<commit_message>
lab/fases-0-4: RASP real (fork rasp-lab), compose con juice-shop:rasp-lab, informe + evidencias
</commit_message>
<xml_diff>
--- a/Informe_Taller_WAAP_Fase0-2.docx
+++ b/Informe_Taller_WAAP_Fase0-2.docx
@@ -1562,6 +1562,337 @@
         <w:t xml:space="preserve">      1 "message":"SQL Injection Attack Detected via libinjection"</w:t>
       </w:r>
     </w:p>
+    <w:p>
+      <w:pPr>
+        <w:pStyle w:val="Heading1"/>
+      </w:pPr>
+      <w:r>
+        <w:t>Fase 4 real — RASP sobre fork de Juice Shop</w:t>
+      </w:r>
+    </w:p>
+    <w:p>
+      <w:r>
+        <w:rPr>
+          <w:b/>
+          <w:i w:val="0"/>
+        </w:rPr>
+        <w:t>El demo Express probó el principio; aquí se protege la aplicación real. Fork: github.com/Jhojan98/juice-shop (rama rasp-lab), clonado con --depth 1 en ~/juice-shop-rasp, fuera del repo del taller.</w:t>
+      </w:r>
+    </w:p>
+    <w:p>
+      <w:r>
+        <w:rPr>
+          <w:b w:val="0"/>
+          <w:i w:val="0"/>
+        </w:rPr>
+        <w:t>Paso a paso ejecutado:</w:t>
+      </w:r>
+    </w:p>
+    <w:p>
+      <w:r>
+        <w:rPr>
+          <w:rFonts w:ascii="Consolas" w:hAnsi="Consolas"/>
+          <w:sz w:val="17"/>
+        </w:rPr>
+        <w:t>gh repo fork juice-shop/juice-shop --clone=false</w:t>
+        <w:br/>
+        <w:t>git clone --depth 1 git@github.com:Jhojan98/juice-shop.git ~/juice-shop-rasp</w:t>
+        <w:br/>
+        <w:t>cd ~/juice-shop-rasp &amp;&amp; git checkout -b rasp-lab</w:t>
+        <w:br/>
+        <w:t># npm 10 falla con bug arborist 'edgesOut' en frontend (canvas): se actualizó a npm 11</w:t>
+        <w:br/>
+        <w:t># y se aprobaron install-scripts (esbuild, lmdb, @parcel/watcher):</w:t>
+        <w:br/>
+        <w:t>sudo npm i -g npm@11</w:t>
+        <w:br/>
+        <w:t>npm install                                    # raiz (846 paquetes)</w:t>
+        <w:br/>
+        <w:t>cd frontend &amp;&amp; npm install-scripts approve esbuild lmdb @parcel/watcher &amp;&amp; npm install</w:t>
+        <w:br/>
+        <w:t>cd .. &amp;&amp; npm run build:frontend &amp;&amp; npm run build:server</w:t>
+      </w:r>
+    </w:p>
+    <w:p>
+      <w:r>
+        <w:rPr>
+          <w:b w:val="0"/>
+          <w:i w:val="0"/>
+        </w:rPr>
+        <w:t>Implementación (2 capas, mismo SQLI_PATTERN del PDF):</w:t>
+      </w:r>
+    </w:p>
+    <w:p>
+      <w:r>
+        <w:rPr>
+          <w:rFonts w:ascii="Consolas" w:hAnsi="Consolas"/>
+          <w:sz w:val="17"/>
+        </w:rPr>
+        <w:t># lib/raspGuard.ts (NUEVO): isSqlInjection() + raspMiddleware global</w:t>
+        <w:br/>
+        <w:t># server.ts: app.use(raspMiddleware) tras el parser JSON (junto a helmet/rateLimit)</w:t>
+        <w:br/>
+        <w:t># routes/login.ts: la query cruda de la línea 34 (vuln-line real de los retos</w:t>
+        <w:br/>
+        <w:t>#   loginAdmin/Jim/Bender) se guarda en finalQuery, pasa por el guard -&gt; 403.</w:t>
+        <w:br/>
+        <w:t>PORT=3001 RASP_ENABLED=1 npm start   # fork protegido en :3001</w:t>
+        <w:br/>
+        <w:t># oficial sin RASP sigue en :3000 para comparar con/sin.</w:t>
+      </w:r>
+    </w:p>
+    <w:p>
+      <w:r>
+        <w:rPr>
+          <w:b w:val="0"/>
+          <w:i w:val="0"/>
+        </w:rPr>
+        <w:t>Batería con/sin RASP (evidencia: evidencias/fase4-real.txt):</w:t>
+      </w:r>
+    </w:p>
+    <w:p>
+      <w:r>
+        <w:rPr>
+          <w:rFonts w:ascii="Consolas" w:hAnsi="Consolas"/>
+          <w:sz w:val="17"/>
+        </w:rPr>
+        <w:t>===== legit jim =====</w:t>
+        <w:br/>
+        <w:t>oficial:3000 200</w:t>
+        <w:br/>
+        <w:t>fork+RASP:3001 200</w:t>
+        <w:br/>
+        <w:t>===== SQLi clasico email=' OR 1=1-- =====</w:t>
+        <w:br/>
+        <w:t>oficial:3000 {"authentication":{"token":"eyJ0eXAiOiJKV1QiLCJhbGciOiJSUzI1NiJ9.eyJkYXRhIjp7ImlkIjoxLCJ1c2VybmFtZSI6IiIsImVtYWlsIjoiYWRtaW5AanVpY2Utc2gub3AiLCJwYXNzd29yZCI6IjAxOTIwMjNhN2JiZDczMjUwNTE2ZjA2OWRmMThiNTA</w:t>
+        <w:br/>
+        <w:t>fork+RASP:3001 403</w:t>
+        <w:br/>
+        <w:t>===== UNION =====</w:t>
+        <w:br/>
+        <w:t>oficial:3000 200</w:t>
+        <w:br/>
+        <w:t>fork+RASP:3001 403</w:t>
+        <w:br/>
+        <w:t>===== search SQLi (middleware global) =====</w:t>
+        <w:br/>
+        <w:t>oficial:3000 200</w:t>
+        <w:br/>
+        <w:t>fork+RASP:3001 200</w:t>
+        <w:br/>
+        <w:t>===== unit guard login (isSqlInjection, compilado) =====</w:t>
+        <w:br/>
+        <w:t>PASS x3: legitimo=false, OR 1=1=true, UNION=true</w:t>
+      </w:r>
+    </w:p>
+    <w:p>
+      <w:r>
+        <w:rPr>
+          <w:b w:val="0"/>
+          <w:i w:val="0"/>
+        </w:rPr>
+        <w:t>Lectura:</w:t>
+      </w:r>
+    </w:p>
+    <w:tbl>
+      <w:tblPr>
+        <w:tblStyle w:val="TableGrid"/>
+        <w:tblW w:type="auto" w:w="0"/>
+        <w:tblLook w:firstColumn="1" w:firstRow="1" w:lastColumn="0" w:lastRow="0" w:noHBand="0" w:noVBand="1" w:val="04A0"/>
+      </w:tblPr>
+      <w:tblGrid>
+        <w:gridCol w:w="2880"/>
+        <w:gridCol w:w="2880"/>
+        <w:gridCol w:w="2880"/>
+      </w:tblGrid>
+      <w:tr>
+        <w:tc>
+          <w:tcPr>
+            <w:tcW w:type="dxa" w:w="2880"/>
+          </w:tcPr>
+          <w:p>
+            <w:r>
+              <w:rPr>
+                <w:b/>
+              </w:rPr>
+              <w:t>Ataque a /rest/user/login</w:t>
+            </w:r>
+          </w:p>
+        </w:tc>
+        <w:tc>
+          <w:tcPr>
+            <w:tcW w:type="dxa" w:w="2880"/>
+          </w:tcPr>
+          <w:p>
+            <w:r>
+              <w:rPr>
+                <w:b/>
+              </w:rPr>
+              <w:t>Oficial :3000 (sin RASP)</w:t>
+            </w:r>
+          </w:p>
+        </w:tc>
+        <w:tc>
+          <w:tcPr>
+            <w:tcW w:type="dxa" w:w="2880"/>
+          </w:tcPr>
+          <w:p>
+            <w:r>
+              <w:rPr>
+                <w:b/>
+              </w:rPr>
+              <w:t>Fork :3001 (RASP)</w:t>
+            </w:r>
+          </w:p>
+        </w:tc>
+      </w:tr>
+      <w:tr>
+        <w:tc>
+          <w:tcPr>
+            <w:tcW w:type="dxa" w:w="2880"/>
+          </w:tcPr>
+          <w:p>
+            <w:r>
+              <w:t>Legítimo jim</w:t>
+            </w:r>
+          </w:p>
+        </w:tc>
+        <w:tc>
+          <w:tcPr>
+            <w:tcW w:type="dxa" w:w="2880"/>
+          </w:tcPr>
+          <w:p>
+            <w:r>
+              <w:t>200</w:t>
+            </w:r>
+          </w:p>
+        </w:tc>
+        <w:tc>
+          <w:tcPr>
+            <w:tcW w:type="dxa" w:w="2880"/>
+          </w:tcPr>
+          <w:p>
+            <w:r>
+              <w:t>200</w:t>
+            </w:r>
+          </w:p>
+        </w:tc>
+      </w:tr>
+      <w:tr>
+        <w:tc>
+          <w:tcPr>
+            <w:tcW w:type="dxa" w:w="2880"/>
+          </w:tcPr>
+          <w:p>
+            <w:r>
+              <w:t>SQLi clásico ' OR 1=1--</w:t>
+            </w:r>
+          </w:p>
+        </w:tc>
+        <w:tc>
+          <w:tcPr>
+            <w:tcW w:type="dxa" w:w="2880"/>
+          </w:tcPr>
+          <w:p>
+            <w:r>
+              <w:t>200 + JWT de admin (takeover)</w:t>
+            </w:r>
+          </w:p>
+        </w:tc>
+        <w:tc>
+          <w:tcPr>
+            <w:tcW w:type="dxa" w:w="2880"/>
+          </w:tcPr>
+          <w:p>
+            <w:r>
+              <w:t>403 + log RASP</w:t>
+            </w:r>
+          </w:p>
+        </w:tc>
+      </w:tr>
+      <w:tr>
+        <w:tc>
+          <w:tcPr>
+            <w:tcW w:type="dxa" w:w="2880"/>
+          </w:tcPr>
+          <w:p>
+            <w:r>
+              <w:t>UNION SELECT</w:t>
+            </w:r>
+          </w:p>
+        </w:tc>
+        <w:tc>
+          <w:tcPr>
+            <w:tcW w:type="dxa" w:w="2880"/>
+          </w:tcPr>
+          <w:p>
+            <w:r>
+              <w:t>200</w:t>
+            </w:r>
+          </w:p>
+        </w:tc>
+        <w:tc>
+          <w:tcPr>
+            <w:tcW w:type="dxa" w:w="2880"/>
+          </w:tcPr>
+          <w:p>
+            <w:r>
+              <w:t>403 + log RASP</w:t>
+            </w:r>
+          </w:p>
+        </w:tc>
+      </w:tr>
+      <w:tr>
+        <w:tc>
+          <w:tcPr>
+            <w:tcW w:type="dxa" w:w="2880"/>
+          </w:tcPr>
+          <w:p>
+            <w:r>
+              <w:t>Search q=' OR '1'='1 (string-form)</w:t>
+            </w:r>
+          </w:p>
+        </w:tc>
+        <w:tc>
+          <w:tcPr>
+            <w:tcW w:type="dxa" w:w="2880"/>
+          </w:tcPr>
+          <w:p>
+            <w:r>
+              <w:t>200</w:t>
+            </w:r>
+          </w:p>
+        </w:tc>
+        <w:tc>
+          <w:tcPr>
+            <w:tcW w:type="dxa" w:w="2880"/>
+          </w:tcPr>
+          <w:p>
+            <w:r>
+              <w:t>200 (hueco del patrón, documentado)</w:t>
+            </w:r>
+          </w:p>
+        </w:tc>
+      </w:tr>
+    </w:tbl>
+    <w:p>
+      <w:r>
+        <w:rPr>
+          <w:b w:val="0"/>
+          <w:i w:val="0"/>
+        </w:rPr>
+        <w:t>El takeover es total: sin RASP el payload clásico devuelve el JWT del administrador; con RASP, 403 antes de que Sequelize ejecute. El search con forma string evade también el middleware global (mismo hueco del regex literal ya reportado en el demo): fix propuesto idéntico (añadir OR '...'='...'). Guard de login verificado por unit test (3/3 PASS contra el compilado build/lib/raspGuard.js): es segunda capa redundante por diseño (defensa en profundidad); en estos payloads el middleware global bloquea primero.</w:t>
+      </w:r>
+    </w:p>
+    <w:p>
+      <w:r>
+        <w:rPr>
+          <w:b w:val="0"/>
+          <w:i w:val="0"/>
+        </w:rPr>
+        <w:t>Imagen Docker local: juice-shop:rasp-lab (docker build desde el fork) para enchufarla al compose del taller manteniendo el WAAP delante.</w:t>
+      </w:r>
+    </w:p>
     <w:sectPr>
       <w:pgSz w:w="12240" w:h="15840"/>
       <w:pgMar w:top="1440" w:right="1800" w:bottom="1440" w:left="1800" w:header="720" w:footer="720" w:gutter="0"/>

</xml_diff>

<commit_message>
docs: informe limpio en secuencia, Fase 4 unica (fork real), demo fuera del documento
</commit_message>
<xml_diff>
--- a/Informe_Taller_WAAP_Fase0-2.docx
+++ b/Informe_Taller_WAAP_Fase0-2.docx
@@ -13,7 +13,7 @@
         </w:rPr>
         <w:t>Taller WAAP con IA/ML, RASP y DevSecOps</w:t>
         <w:br/>
-        <w:t>Informe de laboratorio — Fases 0 a 4</w:t>
+        <w:t>Informe de laboratorio - Fases 0 a 4</w:t>
       </w:r>
     </w:p>
     <w:p>
@@ -22,7 +22,7 @@
           <w:b w:val="0"/>
           <w:i/>
         </w:rPr>
-        <w:t>Universidad Distrital FJDC — Mecanismos de Seguridad Informática. Prof. Octavio J. Salcedo Parra.</w:t>
+        <w:t>Universidad Distrital FJDC - Mecanismos de Seguridad Informatica. Prof. Octavio J. Salcedo Parra.</w:t>
       </w:r>
     </w:p>
     <w:p>
@@ -31,16 +31,7 @@
           <w:b w:val="0"/>
           <w:i w:val="0"/>
         </w:rPr>
-        <w:t>Prototipo: OWASP Juice Shop 20.2.0 + ModSecurity CRS 3.3.10 (PL1). Entorno: Ubuntu 22.04, Docker + Docker Compose. Acceso vía WAAP: http://localhost:8080 (backend directo :3000).</w:t>
-      </w:r>
-    </w:p>
-    <w:p>
-      <w:r>
-        <w:rPr>
-          <w:b w:val="0"/>
-          <w:i w:val="0"/>
-        </w:rPr>
-        <w:t>Rama del trabajo: lab/fases-0-4. Este documento se genera de forma reproducible con build_informe_full.py (ver Anexo A).</w:t>
+        <w:t>Prototipo: OWASP Juice Shop 20.2.0 + ModSecurity CRS 3.3.10 (PL1) + RASP sobre fork. Entorno: Ubuntu 22.04, Docker + Docker Compose. Acceso via WAAP: http://localhost:8080 (backend directo :3000). Rama del trabajo: lab/fases-0-4.</w:t>
       </w:r>
     </w:p>
     <w:p>
@@ -48,7 +39,7 @@
         <w:pStyle w:val="Heading1"/>
       </w:pPr>
       <w:r>
-        <w:t>Fase 0 — Preparación del entorno</w:t>
+        <w:t>Fase 0 - Preparacion del entorno</w:t>
       </w:r>
     </w:p>
     <w:p>
@@ -92,7 +83,7 @@
           <w:b w:val="0"/>
           <w:i w:val="0"/>
         </w:rPr>
-        <w:t>Resultado: ambos contenedores Up (waap-proxy healthy). Nota: el usuario debió añadirse al grupo docker (sudo usermod -aG docker $USER) por permiso denegado en /var/run/docker.sock.</w:t>
+        <w:t>Resultado: ambos contenedores Up (waap-proxy healthy). Nota: el usuario debio anadirse al grupo docker (sudo usermod -aG docker $USER) por permiso denegado en /var/run/docker.sock. En Fase 4 el servicio juice-shop paso a la imagen local juice-shop:rasp-lab (ver Fase 4).</w:t>
       </w:r>
     </w:p>
     <w:p>
@@ -150,7 +141,7 @@
         <w:pStyle w:val="Caption"/>
       </w:pPr>
       <w:r>
-        <w:t>Figura 1. Juice Shop servido a través del proxy WAAP (:8080).</w:t>
+        <w:t>Figura 1. Juice Shop servido a traves del proxy WAAP (:8080).</w:t>
       </w:r>
     </w:p>
     <w:p>
@@ -197,7 +188,7 @@
         <w:pStyle w:val="Heading1"/>
       </w:pPr>
       <w:r>
-        <w:t>Fase 1 — Aplicación objetivo vulnerable</w:t>
+        <w:t>Fase 1 - Aplicacion objetivo vulnerable</w:t>
       </w:r>
     </w:p>
     <w:p>
@@ -226,9 +217,9 @@
         </w:rPr>
         <w:t>curl -s http://localhost:8080/rest/admin/application-version  # {"version":"20.2.0"}</w:t>
         <w:br/>
-        <w:t>curl -s "http://localhost:8080/rest/products/search?q=apple"  # JSON success vía WAAP</w:t>
+        <w:t>curl -s "http://localhost:8080/rest/products/search?q=apple"  # JSON success via WAAP</w:t>
         <w:br/>
-        <w:t># Navegador: http://localhost:8080/#/score-board (retos por categoría OWASP)</w:t>
+        <w:t># Navegador: http://localhost:8080/#/score-board (retos por categoria OWASP)</w:t>
       </w:r>
     </w:p>
     <w:p>
@@ -237,7 +228,7 @@
           <w:b w:val="0"/>
           <w:i w:val="0"/>
         </w:rPr>
-        <w:t>Línea base de vulnerabilidades (entregable Fase 1):</w:t>
+        <w:t>Linea base de vulnerabilidades (entregable Fase 1):</w:t>
       </w:r>
     </w:p>
     <w:tbl>
@@ -323,7 +314,7 @@
           </w:tcPr>
           <w:p>
             <w:r>
-              <w:t>Inyección SQL en login</w:t>
+              <w:t>Inyeccion SQL en login</w:t>
             </w:r>
           </w:p>
         </w:tc>
@@ -365,7 +356,7 @@
           </w:tcPr>
           <w:p>
             <w:r>
-              <w:t>XSS reflejado en búsqueda</w:t>
+              <w:t>XSS reflejado en busqueda</w:t>
             </w:r>
           </w:p>
         </w:tc>
@@ -449,7 +440,7 @@
           </w:tcPr>
           <w:p>
             <w:r>
-              <w:t>Exposición de hash de password</w:t>
+              <w:t>Exposicion de hash de password</w:t>
             </w:r>
           </w:p>
         </w:tc>
@@ -522,7 +513,7 @@
         <w:pStyle w:val="Caption"/>
       </w:pPr>
       <w:r>
-        <w:t>Figura 2. Score Board (1%, categorías OWASP).</w:t>
+        <w:t>Figura 2. Score Board (1%, categorias OWASP).</w:t>
       </w:r>
     </w:p>
     <w:p>
@@ -569,7 +560,7 @@
         <w:pStyle w:val="Caption"/>
       </w:pPr>
       <w:r>
-        <w:t>Figura 3. Tráfico normal: búsqueda vía WAAP (200).</w:t>
+        <w:t>Figura 3. Trafico normal: busqueda via WAAP (200).</w:t>
       </w:r>
     </w:p>
     <w:p>
@@ -616,7 +607,7 @@
         <w:pStyle w:val="Heading1"/>
       </w:pPr>
       <w:r>
-        <w:t>Fase 2 — Capa base WAF/WAAP con CRS (PL1)</w:t>
+        <w:t>Fase 2 - Capa base WAF/WAAP con CRS (PL1)</w:t>
       </w:r>
     </w:p>
     <w:p>
@@ -625,7 +616,7 @@
           <w:b/>
           <w:i w:val="0"/>
         </w:rPr>
-        <w:t>Objetivo: primera línea de defensa con OWASP CRS y evidencia de bloqueo + evasión (PDF p.10).</w:t>
+        <w:t>Objetivo: primera linea de defensa con OWASP CRS y evidencia de bloqueo + evasion (PDF p.10).</w:t>
       </w:r>
     </w:p>
     <w:p>
@@ -649,13 +640,13 @@
         <w:br/>
         <w:t># PARANOIA=1, BLOCKING_PARANOIA=1, BACKEND=http://juice-shop:3000</w:t>
         <w:br/>
-        <w:t># Prueba de detección básica:</w:t>
+        <w:t># Prueba de deteccion basica:</w:t>
         <w:br/>
         <w:t>curl -i --get --data-urlencode "q=' OR '1'='1" \</w:t>
         <w:br/>
         <w:t xml:space="preserve">  http://localhost:8080/rest/products/search   # -&gt; 403 Forbidden</w:t>
         <w:br/>
-        <w:t># Prueba de evasión (payload fragmentado en 2 parámetros):</w:t>
+        <w:t># Prueba de evasion (payload fragmentado en 2 parametros):</w:t>
         <w:br/>
         <w:t>curl -i "http://localhost:8080/rest/products/search?q='%20&amp;x=OR%201=1"  # -&gt; 200</w:t>
         <w:br/>
@@ -670,7 +661,7 @@
           <w:b w:val="0"/>
           <w:i w:val="0"/>
         </w:rPr>
-        <w:t>Resultado: SQLi clásico/encoded/comentarios/UNION/XSS/traversal → 403 (regla 942100 libinjection + 949110 anomaly score). Solo el fragmentado q=' &amp; x=OR 1=1 → 200 ({"status":"success","data":[]}): el CRS PL1 evalúa cada parámetro por separado.</w:t>
+        <w:t>Resultado: SQLi clasico/encoded/comentarios/UNION/XSS/traversal -&gt; 403 (regla 942100 libinjection + 949110 anomaly score). Solo el fragmentado q=' &amp; x=OR 1=1 -&gt; 200 ({"status":"success","data":[]}): el CRS PL1 evalua cada parametro por separado.</w:t>
       </w:r>
     </w:p>
     <w:p>
@@ -678,7 +669,7 @@
         <w:pStyle w:val="Caption"/>
       </w:pPr>
       <w:r>
-        <w:t>Figura 4. Bloqueo CRS: SQLi clásico → 403 Forbidden (nginx).</w:t>
+        <w:t>Figura 4. Bloqueo CRS: SQLi clasico -&gt; 403 Forbidden (nginx).</w:t>
       </w:r>
     </w:p>
     <w:p>
@@ -725,7 +716,7 @@
         <w:pStyle w:val="Caption"/>
       </w:pPr>
       <w:r>
-        <w:t>Figura 5. Evasión: payload fragmentado → 200 OK (base comparativa para Fase 3).</w:t>
+        <w:t>Figura 5. Evasion: payload fragmentado -&gt; 200 OK (base comparativa para Fase 3).</w:t>
       </w:r>
     </w:p>
     <w:p>
@@ -772,7 +763,7 @@
         <w:pStyle w:val="Heading1"/>
       </w:pPr>
       <w:r>
-        <w:t>Fase 3 — Módulo de detección basado en IA/ML</w:t>
+        <w:t>Fase 3 - Modulo de deteccion basado en IA/ML</w:t>
       </w:r>
     </w:p>
     <w:p>
@@ -781,7 +772,7 @@
           <w:b/>
           <w:i w:val="0"/>
         </w:rPr>
-        <w:t>Objetivo: modelo de anomalías entrenado solo con tráfico normal (PDF p.11-12).</w:t>
+        <w:t>Objetivo: modelo de anomalias entrenado solo con trafico normal (PDF p.11-12).</w:t>
       </w:r>
     </w:p>
     <w:p>
@@ -801,7 +792,7 @@
         </w:rPr>
         <w:t>python3 -m pip install --user scikit-learn pandas numpy joblib</w:t>
         <w:br/>
-        <w:t># 1. Tráfico normal simulado a ritmo humano (~15 min, 120 reqs vía WAAP):</w:t>
+        <w:t># 1. Trafico normal simulado a ritmo humano (~15 min, 120 reqs via WAAP):</w:t>
         <w:br/>
         <w:t>GEN_N=120 PACE=humano python3 waap/ml/gen_traffic.py  # -&gt; logs/access_normal.jsonl</w:t>
         <w:br/>
@@ -815,7 +806,7 @@
         <w:br/>
         <w:t>python3 waap/ml/train_model.py       # -&gt; waap/ml/model.pkl (en .gitignore)</w:t>
         <w:br/>
-        <w:t># 4. Evaluación: matriz 10 + 2 umbrales + ráfaga bot:</w:t>
+        <w:t># 4. Evaluacion: matriz 10 + 2 umbrales + rafaga bot:</w:t>
         <w:br/>
         <w:t>python3 waap/ml/evaluate.py</w:t>
       </w:r>
@@ -826,7 +817,7 @@
           <w:b w:val="0"/>
           <w:i w:val="0"/>
         </w:rPr>
-        <w:t>Lección metodológica: la primera pasada a ritmo máquina (0.05-0.4 s) contaminó req_per_minute (rpm hasta 200 = 'normal'); se repitió a ritmo humano (4-11 s, rpm 8±1), equivalente a los 15-20 min de navegación manual que pide el PDF.</w:t>
+        <w:t>Leccion metodologica: la primera pasada a ritmo maquina (0.05-0.4 s) contamino req_per_minute (rpm hasta 200 = 'normal'); se repitio a ritmo humano (4-11 s, rpm 8+-1), equivalente a los 15-20 min de navegacion manual que pide el PDF.</w:t>
       </w:r>
     </w:p>
     <w:p>
@@ -891,7 +882,7 @@
           <w:b w:val="0"/>
           <w:i w:val="0"/>
         </w:rPr>
-        <w:t>Umbrales (detección vs falsos positivos):</w:t>
+        <w:t>Umbrales (deteccion vs falsos positivos):</w:t>
       </w:r>
     </w:p>
     <w:p>
@@ -911,7 +902,7 @@
           <w:b w:val="0"/>
           <w:i w:val="0"/>
         </w:rPr>
-        <w:t>Discusión (entregable PDF): umbral -0.05 → 2/5 ataques con 2 FP (login válido, home); umbral 0.0 → 5/5 con 4 FP. La ráfaga bot apenas mueve el score (+0.16→+0.17): se depuró hasta la causa (los árboles no ordenan más allá del máximo de entrenamiento), por lo que req_per_minute solo no cruza el umbral — limitación documentada y propuesta Q7 (regla híbrida tasa+score). La evasión fragmentada (q=' aislado) es estadísticamente normal: ni CRS ni ML la ven → motivación de Fase 4.</w:t>
+        <w:t>Discusion (entregable PDF): umbral -0.05 -&gt; 2/5 ataques con 2 FP (login valido, home); umbral 0.0 -&gt; 5/5 con 4 FP. La rafaga bot apenas mueve el score (+0.16-&gt;+0.17): se depuro hasta la causa (los arboles no ordenan mas alla del maximo de entrenamiento), por lo que req_per_minute solo no cruza el umbral - limitacion documentada y propuesta Q7 (regla hibrida tasa+score). La evasion fragmentada (q=' aislado) es estadisticamente normal: ni CRS ni ML la ven -&gt; motivacion de Fase 4.</w:t>
       </w:r>
     </w:p>
     <w:p>
@@ -919,7 +910,7 @@
         <w:pStyle w:val="Heading1"/>
       </w:pPr>
       <w:r>
-        <w:t>Fase 4 — Integración RASP</w:t>
+        <w:t>Fase 4 - Integracion RASP sobre fork de Juice Shop</w:t>
       </w:r>
     </w:p>
     <w:p>
@@ -928,7 +919,7 @@
           <w:b/>
           <w:i w:val="0"/>
         </w:rPr>
-        <w:t>Objetivo: protección en tiempo de ejecución con contexto real (PDF p.13).</w:t>
+        <w:t>Objetivo: proteccion en tiempo de ejecucion con contexto real (PDF p.13).</w:t>
       </w:r>
     </w:p>
     <w:p>
@@ -937,7 +928,7 @@
           <w:b w:val="0"/>
           <w:i w:val="0"/>
         </w:rPr>
-        <w:t>Nota metodológica: el rasp_agent.py Flask del PDF no es integrable a Juice Shop (Node/Express). Se implementó app/rasp-demo/server.js en Express, puerto 1:1 del PDF (mismo SQLI_PATTERN, query final concatenada, 403 + log). OpenRASP está inactivo desde 2022 sin agente Node vigente; app/rasp_agent.py queda como referencia literal del PDF.</w:t>
+        <w:t>Nota metodologica: el rasp_agent.py Flask del PDF no es integrable a Juice Shop (Node/Express). Se trabajo sobre fork real: github.com/Jhojan98/juice-shop, rama rasp-lab (clone --depth 1 en ~/juice-shop-rasp, fuera del repo del taller). OpenRASP esta inactivo desde 2022 sin agente Node vigente. app/rasp_agent.py queda como referencia literal del PDF y app/rasp-demo/ como prototipo previo del patron.</w:t>
       </w:r>
     </w:p>
     <w:p>
@@ -955,21 +946,21 @@
           <w:rFonts w:ascii="Consolas" w:hAnsi="Consolas"/>
           <w:sz w:val="17"/>
         </w:rPr>
-        <w:t>cd app/rasp-demo &amp;&amp; npm init -y &amp;&amp; npm i express</w:t>
+        <w:t>gh repo fork juice-shop/juice-shop --clone=false</w:t>
         <w:br/>
-        <w:t>RASP_ENABLED=1 RASP_PORT=3001 node server.js &amp;   # demo protegido</w:t>
+        <w:t>git clone --depth 1 git@github.com:Jhojan98/juice-shop.git ~/juice-shop-rasp</w:t>
         <w:br/>
-        <w:t>RASP_ENABLED=0 RASP_PORT=3002 node server.js &amp;   # demo vulnerable (control)</w:t>
+        <w:t>cd ~/juice-shop-rasp &amp;&amp; git checkout -b rasp-lab</w:t>
         <w:br/>
-        <w:t># Caso 1: fragmentado directo, sin WAAP (PDF §4.2.1):</w:t>
+        <w:t># npm 10 falla con bug arborist 'edgesOut' en frontend: actualizar a npm 11 y</w:t>
         <w:br/>
-        <w:t>curl -X POST :3001/login -d '{"username":"'","password":"OR 1=1--"}'  # 403</w:t>
+        <w:t># aprobar install-scripts (esbuild, lmdb, @parcel/watcher):</w:t>
         <w:br/>
-        <w:t>curl -X POST :3002/login -d '{"username":"'","password":"OR 1=1--"}'  # dump total</w:t>
+        <w:t>sudo npm i -g npm@11</w:t>
         <w:br/>
-        <w:t># Caso 2: UNION (familia Fase 2): 403 vs dump.</w:t>
+        <w:t>npm install &amp;&amp; (cd frontend &amp;&amp; npm install &amp;&amp; cd ..)  # raiz 846 pkgs + frontend</w:t>
         <w:br/>
-        <w:t># Caso 3: latencia, 30 reqs alternadas + microbench 200k iters en proceso.</w:t>
+        <w:t>npm run build:frontend &amp;&amp; npm run build:server</w:t>
       </w:r>
     </w:p>
     <w:p>
@@ -978,7 +969,7 @@
           <w:b w:val="0"/>
           <w:i w:val="0"/>
         </w:rPr>
-        <w:t>Bloqueos:</w:t>
+        <w:t>Implementacion (2 capas, mismo SQLI_PATTERN del PDF):</w:t>
       </w:r>
     </w:p>
     <w:p>
@@ -987,29 +978,19 @@
           <w:rFonts w:ascii="Consolas" w:hAnsi="Consolas"/>
           <w:sz w:val="17"/>
         </w:rPr>
-        <w:t>===== CASO 1: fragmentado (user="'" pass="OR 1=1--") =====</w:t>
+        <w:t># lib/raspGuard.ts (NUEVO): isSqlInjection() + raspMiddleware global</w:t>
         <w:br/>
-        <w:t>RASP ON : 403</w:t>
+        <w:t># server.ts: app.use(raspMiddleware) tras el parser JSON (junto a helmet/rateLimit)</w:t>
         <w:br/>
-        <w:t>RASP OFF: {"status":"success","user":"*","note":"injection: full dump","rows":2}</w:t>
+        <w:t># routes/login.ts: la query cruda real (vuln-line de los retos loginAdmin/Jim/Bender)</w:t>
         <w:br/>
-        <w:t>===== CASO 2: UNION (familia Fase 2) =====</w:t>
+        <w:t>#   se guarda en finalQuery, pasa por el guard -&gt; 403 antes de que Sequelize ejecute.</w:t>
         <w:br/>
-        <w:t>RASP ON : 403</w:t>
+        <w:t>PORT=3001 RASP_ENABLED=1 npm start   # fork protegido (oficial sin RASP en :3000)</w:t>
         <w:br/>
-        <w:t>RASP OFF: {"status":"success","user":"*","note":"injection: full dump","rows":2}</w:t>
+        <w:t># Imagen local para el compose: docker build -t juice-shop:rasp-lab ~/juice-shop-rasp</w:t>
         <w:br/>
-        <w:t>===== CASO 2b: ' OR '1'='1 string-form (hueco patron literal PDF) =====</w:t>
-        <w:br/>
-        <w:t>RASP ON : {"status":"success","user":"*","note":"injection: full dump","rows":2}</w:t>
-        <w:br/>
-        <w:t>RASP OFF: {"status":"success","user":"*","note":"injection: full dump","rows":2}</w:t>
-        <w:br/>
-        <w:t>===== legitimo =====</w:t>
-        <w:br/>
-        <w:t>RASP ON : 200</w:t>
-        <w:br/>
-        <w:t>RASP OFF: 200</w:t>
+        <w:t># compose: image juice-shop:rasp-lab + RASP_ENABLED=1 (pull_policy: never)</w:t>
       </w:r>
     </w:p>
     <w:p>
@@ -1018,7 +999,7 @@
           <w:b w:val="0"/>
           <w:i w:val="0"/>
         </w:rPr>
-        <w:t>Logs del agente:</w:t>
+        <w:t>Bateria con/sin RASP (evidencia: evidencias/fase4-real.txt):</w:t>
       </w:r>
     </w:p>
     <w:p>
@@ -1027,9 +1008,33 @@
           <w:rFonts w:ascii="Consolas" w:hAnsi="Consolas"/>
           <w:sz w:val="17"/>
         </w:rPr>
-        <w:t>RASP: consulta SQL bloqueada en tiempo de ejecucion: SELECT * FROM users WHERE user=''' AND pass='OR 1=1--'</w:t>
+        <w:t>===== legit jim =====</w:t>
         <w:br/>
-        <w:t>RASP: consulta SQL bloqueada en tiempo de ejecucion: SELECT * FROM users WHERE user='admin' UNION SELECT * FROM users--' AND pass='x'</w:t>
+        <w:t>oficial:3000 200</w:t>
+        <w:br/>
+        <w:t>fork+RASP:3001 200</w:t>
+        <w:br/>
+        <w:t>===== SQLi clasico email=' OR 1=1-- =====</w:t>
+        <w:br/>
+        <w:t>oficial:3000 {"authentication":{"token":"eyJ0eXAiOiJKV1QiLCJhbGciOiJSUzI1NiJ9.eyJkYXRhIjp7ImlkIjoxLCJ1c2VybmFtZSI6IiIsImVtYWlsIjoiYWRtaW5AanVpY2Utc2gub3AiLCJwYXNzd29yZCI6IjAxOTIwMjNhN2JiZDczMjUwNTE2ZjA2OWRmMThiNTA</w:t>
+        <w:br/>
+        <w:t>fork+RASP:3001 403</w:t>
+        <w:br/>
+        <w:t>===== UNION =====</w:t>
+        <w:br/>
+        <w:t>oficial:3000 200</w:t>
+        <w:br/>
+        <w:t>fork+RASP:3001 403</w:t>
+        <w:br/>
+        <w:t>===== search SQLi (middleware global) =====</w:t>
+        <w:br/>
+        <w:t>oficial:3000 200</w:t>
+        <w:br/>
+        <w:t>fork+RASP:3001 200</w:t>
+        <w:br/>
+        <w:t>===== unit guard login (isSqlInjection, compilado) =====</w:t>
+        <w:br/>
+        <w:t>PASS x3: legitimo=false, OR 1=1=true, UNION=true</w:t>
       </w:r>
     </w:p>
     <w:p>
@@ -1038,7 +1043,197 @@
           <w:b w:val="0"/>
           <w:i w:val="0"/>
         </w:rPr>
-        <w:t>Lectura: el fragmentado y el UNION confirman la tesis — el contexto de ejecución ve lo que el perímetro no. Hallazgo honesto: la forma string ' OR '1'='1 evade también el regex literal del PDF (solo cubre OR 1=1 numérico); fix propuesto: añadir OR '...'='...'.</w:t>
+        <w:t>Lectura:</w:t>
+      </w:r>
+    </w:p>
+    <w:tbl>
+      <w:tblPr>
+        <w:tblStyle w:val="TableGrid"/>
+        <w:tblW w:type="auto" w:w="0"/>
+        <w:tblLook w:firstColumn="1" w:firstRow="1" w:lastColumn="0" w:lastRow="0" w:noHBand="0" w:noVBand="1" w:val="04A0"/>
+      </w:tblPr>
+      <w:tblGrid>
+        <w:gridCol w:w="2880"/>
+        <w:gridCol w:w="2880"/>
+        <w:gridCol w:w="2880"/>
+      </w:tblGrid>
+      <w:tr>
+        <w:tc>
+          <w:tcPr>
+            <w:tcW w:type="dxa" w:w="2880"/>
+          </w:tcPr>
+          <w:p>
+            <w:r>
+              <w:rPr>
+                <w:b/>
+              </w:rPr>
+              <w:t>Ataque a /rest/user/login</w:t>
+            </w:r>
+          </w:p>
+        </w:tc>
+        <w:tc>
+          <w:tcPr>
+            <w:tcW w:type="dxa" w:w="2880"/>
+          </w:tcPr>
+          <w:p>
+            <w:r>
+              <w:rPr>
+                <w:b/>
+              </w:rPr>
+              <w:t>Oficial :3000 (sin RASP)</w:t>
+            </w:r>
+          </w:p>
+        </w:tc>
+        <w:tc>
+          <w:tcPr>
+            <w:tcW w:type="dxa" w:w="2880"/>
+          </w:tcPr>
+          <w:p>
+            <w:r>
+              <w:rPr>
+                <w:b/>
+              </w:rPr>
+              <w:t>Fork :3001 (RASP)</w:t>
+            </w:r>
+          </w:p>
+        </w:tc>
+      </w:tr>
+      <w:tr>
+        <w:tc>
+          <w:tcPr>
+            <w:tcW w:type="dxa" w:w="2880"/>
+          </w:tcPr>
+          <w:p>
+            <w:r>
+              <w:t>Legitimo jim</w:t>
+            </w:r>
+          </w:p>
+        </w:tc>
+        <w:tc>
+          <w:tcPr>
+            <w:tcW w:type="dxa" w:w="2880"/>
+          </w:tcPr>
+          <w:p>
+            <w:r>
+              <w:t>200</w:t>
+            </w:r>
+          </w:p>
+        </w:tc>
+        <w:tc>
+          <w:tcPr>
+            <w:tcW w:type="dxa" w:w="2880"/>
+          </w:tcPr>
+          <w:p>
+            <w:r>
+              <w:t>200</w:t>
+            </w:r>
+          </w:p>
+        </w:tc>
+      </w:tr>
+      <w:tr>
+        <w:tc>
+          <w:tcPr>
+            <w:tcW w:type="dxa" w:w="2880"/>
+          </w:tcPr>
+          <w:p>
+            <w:r>
+              <w:t>SQLi clasico ' OR 1=1--</w:t>
+            </w:r>
+          </w:p>
+        </w:tc>
+        <w:tc>
+          <w:tcPr>
+            <w:tcW w:type="dxa" w:w="2880"/>
+          </w:tcPr>
+          <w:p>
+            <w:r>
+              <w:t>200 + JWT de admin (takeover)</w:t>
+            </w:r>
+          </w:p>
+        </w:tc>
+        <w:tc>
+          <w:tcPr>
+            <w:tcW w:type="dxa" w:w="2880"/>
+          </w:tcPr>
+          <w:p>
+            <w:r>
+              <w:t>403 + log RASP</w:t>
+            </w:r>
+          </w:p>
+        </w:tc>
+      </w:tr>
+      <w:tr>
+        <w:tc>
+          <w:tcPr>
+            <w:tcW w:type="dxa" w:w="2880"/>
+          </w:tcPr>
+          <w:p>
+            <w:r>
+              <w:t>UNION SELECT</w:t>
+            </w:r>
+          </w:p>
+        </w:tc>
+        <w:tc>
+          <w:tcPr>
+            <w:tcW w:type="dxa" w:w="2880"/>
+          </w:tcPr>
+          <w:p>
+            <w:r>
+              <w:t>200</w:t>
+            </w:r>
+          </w:p>
+        </w:tc>
+        <w:tc>
+          <w:tcPr>
+            <w:tcW w:type="dxa" w:w="2880"/>
+          </w:tcPr>
+          <w:p>
+            <w:r>
+              <w:t>403 + log RASP</w:t>
+            </w:r>
+          </w:p>
+        </w:tc>
+      </w:tr>
+      <w:tr>
+        <w:tc>
+          <w:tcPr>
+            <w:tcW w:type="dxa" w:w="2880"/>
+          </w:tcPr>
+          <w:p>
+            <w:r>
+              <w:t>Search q=' OR '1'='1 (string-form)</w:t>
+            </w:r>
+          </w:p>
+        </w:tc>
+        <w:tc>
+          <w:tcPr>
+            <w:tcW w:type="dxa" w:w="2880"/>
+          </w:tcPr>
+          <w:p>
+            <w:r>
+              <w:t>200</w:t>
+            </w:r>
+          </w:p>
+        </w:tc>
+        <w:tc>
+          <w:tcPr>
+            <w:tcW w:type="dxa" w:w="2880"/>
+          </w:tcPr>
+          <w:p>
+            <w:r>
+              <w:t>200 (hueco del patron, documentado)</w:t>
+            </w:r>
+          </w:p>
+        </w:tc>
+      </w:tr>
+    </w:tbl>
+    <w:p>
+      <w:r>
+        <w:rPr>
+          <w:b w:val="0"/>
+          <w:i w:val="0"/>
+        </w:rPr>
+        <w:t>Sin RASP el payload clasico devuelve el JWT del administrador (takeover total); con RASP, 403 antes de que Sequelize ejecute. El search con forma string evade tambien el middleware global (mismo hueco del regex literal ya conocido): fix propuesto identico (anadir OR '...'='...'). Guard de login verificado por unit test (3/3 PASS contra el compilado): segunda capa redundante por diseno (defensa en profundidad).</w:t>
       </w:r>
     </w:p>
     <w:p>
@@ -1047,7 +1242,7 @@
           <w:b w:val="0"/>
           <w:i w:val="0"/>
         </w:rPr>
-        <w:t>Latencia:</w:t>
+        <w:t>Stack combinado final (evidencia: evidencias/fase4-combinado.txt):</w:t>
       </w:r>
     </w:p>
     <w:p>
@@ -1056,30 +1251,21 @@
           <w:rFonts w:ascii="Consolas" w:hAnsi="Consolas"/>
           <w:sz w:val="17"/>
         </w:rPr>
-        <w:t>HTTP end-to-end (30 reqs alternadas con warmup, login legitimo):</w:t>
+        <w:t>===== stack combinado WAAP(CRS) + fork RASP (compose con juice-shop:rasp-lab) =====</w:t>
         <w:br/>
-        <w:t>RASP ON : n=30 media=2.39ms p50=1.41ms p95=8.14ms</w:t>
+        <w:t>NAME                       IMAGE                         COMMAND                  SERVICE      CREATED              STATUS                    PORTS</w:t>
         <w:br/>
-        <w:t>RASP OFF: n=30 media=3.70ms p50=1.54ms p95=8.50ms</w:t>
+        <w:t>taller-waap-juice-shop-1   juice-shop:rasp-lab           "/nodejs/bin/node /jâ¦"   juice-shop   About a minute ago   Up About a minute         0.0.0.0:3000-&gt;3000/tcp, [::]:3000-&gt;3000/tcp</w:t>
         <w:br/>
-        <w:t>-&gt; La diferencia ON-vs-OFF es ruido entre procesos (el regex es sub-microsegundo</w:t>
+        <w:t>taller-waap-waap-proxy-1   owasp/modsecurity-crs:nginx   "/docker-entrypoint.â¦"   waap-proxy   23 hours ago         Up 19 minutes (healthy)   0.0.0.0:8080-&gt;8080/tcp, [::]:8080-&gt;8080/tcp</w:t>
         <w:br/>
-        <w:t xml:space="preserve">   frente a ~2ms de HTTP); ver microbenchmark.</w:t>
+        <w:t>WAAP home :8080 -&gt; 200</w:t>
         <w:br/>
+        <w:t>legit login :3000 -&gt; 200</w:t>
         <w:br/>
-        <w:t>Microbenchmark en proceso (200k iteraciones, mismo patron SQLI_PATTERN del PDF):</w:t>
+        <w:t>SQLi login :3000 -&gt; 403 (RASP)</w:t>
         <w:br/>
-        <w:t>constructor solo : 0.0 micro-s/req</w:t>
-        <w:br/>
-        <w:t>con guard RASP  : 0.2 micro-s/req</w:t>
-        <w:br/>
-        <w:t>overhead real del guard: +0.1 micro-s/req</w:t>
-        <w:br/>
-        <w:t>Conclusion: overhead del RASP despreciable (~0.01% de la latencia HTTP). Coherente</w:t>
-        <w:br/>
-        <w:t>con el 1-4% reportado por OpenRASP en el peor caso (PDF p.6: limitacion real es el</w:t>
-        <w:br/>
-        <w:t>acoplamiento por servicio, no la latencia).</w:t>
+        <w:t>SQLi search :8080 -&gt; 403 (CRS)</w:t>
       </w:r>
     </w:p>
     <w:p>
@@ -1112,7 +1298,7 @@
               <w:rPr>
                 <w:b/>
               </w:rPr>
-              <w:t>Payload / técnica</w:t>
+              <w:t>Payload / tecnica</w:t>
             </w:r>
           </w:p>
         </w:tc>
@@ -1163,7 +1349,7 @@
           </w:tcPr>
           <w:p>
             <w:r>
-              <w:t>SQLi clásico</w:t>
+              <w:t>SQLi clasico</w:t>
             </w:r>
           </w:p>
         </w:tc>
@@ -1361,7 +1547,7 @@
           </w:tcPr>
           <w:p>
             <w:r>
-              <w:t>EVADE (hueco patrón)</w:t>
+              <w:t>EVADE (hueco patron)</w:t>
             </w:r>
           </w:p>
         </w:tc>
@@ -1373,7 +1559,7 @@
           </w:tcPr>
           <w:p>
             <w:r>
-              <w:t>Ráfaga bot</w:t>
+              <w:t>Rafaga bot</w:t>
             </w:r>
           </w:p>
         </w:tc>
@@ -1414,7 +1600,7 @@
         <w:pStyle w:val="Heading1"/>
       </w:pPr>
       <w:r>
-        <w:t>Anexo A — Paso a paso reproducible (todo lo hecho)</w:t>
+        <w:t>Anexo A - Paso a paso reproducible (todo lo hecho)</w:t>
       </w:r>
     </w:p>
     <w:p>
@@ -1476,21 +1662,29 @@
         <w:br/>
         <w:t>python3 waap/ml/evaluate.py</w:t>
         <w:br/>
-        <w:t># FASE 4</w:t>
+        <w:t># FASE 4 (fork real; prototipo previo en app/rasp-demo/)</w:t>
         <w:br/>
-        <w:t>cd app/rasp-demo &amp;&amp; npm init -y &amp;&amp; npm i express &amp;&amp; cd ../..</w:t>
+        <w:t>gh repo fork juice-shop/juice-shop --clone=false</w:t>
         <w:br/>
-        <w:t>RASP_ENABLED=1 RASP_PORT=3001 node app/rasp-demo/server.js &amp;</w:t>
+        <w:t>git clone --depth 1 git@github.com:Jhojan98/juice-shop.git ~/juice-shop-rasp</w:t>
         <w:br/>
-        <w:t>RASP_ENABLED=0 RASP_PORT=3002 node app/rasp-demo/server.js &amp;</w:t>
+        <w:t>cd ~/juice-shop-rasp &amp;&amp; git checkout -b rasp-lab</w:t>
         <w:br/>
-        <w:t>curl -X POST localhost:3001/login -H 'Content-Type: application/json' \</w:t>
+        <w:t>sudo npm i -g npm@11 &amp;&amp; npm install &amp;&amp; (cd frontend &amp;&amp; npm install &amp;&amp; cd ..)</w:t>
         <w:br/>
-        <w:t xml:space="preserve">  -d "{\"username\":\"'\",\"password\":\"OR 1=1--\"}"</w:t>
+        <w:t>npm run build:frontend &amp;&amp; npm run build:server</w:t>
+        <w:br/>
+        <w:t># (anadir lib/raspGuard.ts + hooks en server.ts y routes/login.ts, commit, push)</w:t>
+        <w:br/>
+        <w:t>PORT=3001 RASP_ENABLED=1 npm start</w:t>
+        <w:br/>
+        <w:t>docker build -t juice-shop:rasp-lab ~/juice-shop-rasp</w:t>
+        <w:br/>
+        <w:t># (en taller-waap) compose con juice-shop:rasp-lab + RASP_ENABLED=1, up -d, verificar</w:t>
         <w:br/>
         <w:t># INFORME (regenerar este documento)</w:t>
         <w:br/>
-        <w:t>python3 /tmp/opencode/build_informe_full.py  # o ruta del generador versionado</w:t>
+        <w:t>python3 build_informe_clean.py</w:t>
         <w:br/>
         <w:t>soffice --headless --convert-to pdf Informe_Taller_WAAP_Fase0-2.docx</w:t>
       </w:r>
@@ -1501,7 +1695,7 @@
           <w:b w:val="0"/>
           <w:i w:val="0"/>
         </w:rPr>
-        <w:t>Nota: /tmp se limpia al reiniciar; conserve el generador (docs/ o scripts/) si necesita reproducibilidad futura. model.pkl y logs/*.jsonl se regeneran; no se versionan los .pkl.</w:t>
+        <w:t>Nota: model.pkl y logs/*.jsonl se regeneran; los .pkl no se versionan.</w:t>
       </w:r>
     </w:p>
     <w:p>
@@ -1509,7 +1703,7 @@
         <w:pStyle w:val="Heading1"/>
       </w:pPr>
       <w:r>
-        <w:t>Anexo B — Salidas de terminal (Fases 0-2)</w:t>
+        <w:t>Anexo B - Salidas de terminal (Fases 0-2)</w:t>
       </w:r>
     </w:p>
     <w:p>
@@ -1560,337 +1754,6 @@
         <w:t xml:space="preserve">      1 "ruleId":"942100"</w:t>
         <w:br/>
         <w:t xml:space="preserve">      1 "message":"SQL Injection Attack Detected via libinjection"</w:t>
-      </w:r>
-    </w:p>
-    <w:p>
-      <w:pPr>
-        <w:pStyle w:val="Heading1"/>
-      </w:pPr>
-      <w:r>
-        <w:t>Fase 4 real — RASP sobre fork de Juice Shop</w:t>
-      </w:r>
-    </w:p>
-    <w:p>
-      <w:r>
-        <w:rPr>
-          <w:b/>
-          <w:i w:val="0"/>
-        </w:rPr>
-        <w:t>El demo Express probó el principio; aquí se protege la aplicación real. Fork: github.com/Jhojan98/juice-shop (rama rasp-lab), clonado con --depth 1 en ~/juice-shop-rasp, fuera del repo del taller.</w:t>
-      </w:r>
-    </w:p>
-    <w:p>
-      <w:r>
-        <w:rPr>
-          <w:b w:val="0"/>
-          <w:i w:val="0"/>
-        </w:rPr>
-        <w:t>Paso a paso ejecutado:</w:t>
-      </w:r>
-    </w:p>
-    <w:p>
-      <w:r>
-        <w:rPr>
-          <w:rFonts w:ascii="Consolas" w:hAnsi="Consolas"/>
-          <w:sz w:val="17"/>
-        </w:rPr>
-        <w:t>gh repo fork juice-shop/juice-shop --clone=false</w:t>
-        <w:br/>
-        <w:t>git clone --depth 1 git@github.com:Jhojan98/juice-shop.git ~/juice-shop-rasp</w:t>
-        <w:br/>
-        <w:t>cd ~/juice-shop-rasp &amp;&amp; git checkout -b rasp-lab</w:t>
-        <w:br/>
-        <w:t># npm 10 falla con bug arborist 'edgesOut' en frontend (canvas): se actualizó a npm 11</w:t>
-        <w:br/>
-        <w:t># y se aprobaron install-scripts (esbuild, lmdb, @parcel/watcher):</w:t>
-        <w:br/>
-        <w:t>sudo npm i -g npm@11</w:t>
-        <w:br/>
-        <w:t>npm install                                    # raiz (846 paquetes)</w:t>
-        <w:br/>
-        <w:t>cd frontend &amp;&amp; npm install-scripts approve esbuild lmdb @parcel/watcher &amp;&amp; npm install</w:t>
-        <w:br/>
-        <w:t>cd .. &amp;&amp; npm run build:frontend &amp;&amp; npm run build:server</w:t>
-      </w:r>
-    </w:p>
-    <w:p>
-      <w:r>
-        <w:rPr>
-          <w:b w:val="0"/>
-          <w:i w:val="0"/>
-        </w:rPr>
-        <w:t>Implementación (2 capas, mismo SQLI_PATTERN del PDF):</w:t>
-      </w:r>
-    </w:p>
-    <w:p>
-      <w:r>
-        <w:rPr>
-          <w:rFonts w:ascii="Consolas" w:hAnsi="Consolas"/>
-          <w:sz w:val="17"/>
-        </w:rPr>
-        <w:t># lib/raspGuard.ts (NUEVO): isSqlInjection() + raspMiddleware global</w:t>
-        <w:br/>
-        <w:t># server.ts: app.use(raspMiddleware) tras el parser JSON (junto a helmet/rateLimit)</w:t>
-        <w:br/>
-        <w:t># routes/login.ts: la query cruda de la línea 34 (vuln-line real de los retos</w:t>
-        <w:br/>
-        <w:t>#   loginAdmin/Jim/Bender) se guarda en finalQuery, pasa por el guard -&gt; 403.</w:t>
-        <w:br/>
-        <w:t>PORT=3001 RASP_ENABLED=1 npm start   # fork protegido en :3001</w:t>
-        <w:br/>
-        <w:t># oficial sin RASP sigue en :3000 para comparar con/sin.</w:t>
-      </w:r>
-    </w:p>
-    <w:p>
-      <w:r>
-        <w:rPr>
-          <w:b w:val="0"/>
-          <w:i w:val="0"/>
-        </w:rPr>
-        <w:t>Batería con/sin RASP (evidencia: evidencias/fase4-real.txt):</w:t>
-      </w:r>
-    </w:p>
-    <w:p>
-      <w:r>
-        <w:rPr>
-          <w:rFonts w:ascii="Consolas" w:hAnsi="Consolas"/>
-          <w:sz w:val="17"/>
-        </w:rPr>
-        <w:t>===== legit jim =====</w:t>
-        <w:br/>
-        <w:t>oficial:3000 200</w:t>
-        <w:br/>
-        <w:t>fork+RASP:3001 200</w:t>
-        <w:br/>
-        <w:t>===== SQLi clasico email=' OR 1=1-- =====</w:t>
-        <w:br/>
-        <w:t>oficial:3000 {"authentication":{"token":"eyJ0eXAiOiJKV1QiLCJhbGciOiJSUzI1NiJ9.eyJkYXRhIjp7ImlkIjoxLCJ1c2VybmFtZSI6IiIsImVtYWlsIjoiYWRtaW5AanVpY2Utc2gub3AiLCJwYXNzd29yZCI6IjAxOTIwMjNhN2JiZDczMjUwNTE2ZjA2OWRmMThiNTA</w:t>
-        <w:br/>
-        <w:t>fork+RASP:3001 403</w:t>
-        <w:br/>
-        <w:t>===== UNION =====</w:t>
-        <w:br/>
-        <w:t>oficial:3000 200</w:t>
-        <w:br/>
-        <w:t>fork+RASP:3001 403</w:t>
-        <w:br/>
-        <w:t>===== search SQLi (middleware global) =====</w:t>
-        <w:br/>
-        <w:t>oficial:3000 200</w:t>
-        <w:br/>
-        <w:t>fork+RASP:3001 200</w:t>
-        <w:br/>
-        <w:t>===== unit guard login (isSqlInjection, compilado) =====</w:t>
-        <w:br/>
-        <w:t>PASS x3: legitimo=false, OR 1=1=true, UNION=true</w:t>
-      </w:r>
-    </w:p>
-    <w:p>
-      <w:r>
-        <w:rPr>
-          <w:b w:val="0"/>
-          <w:i w:val="0"/>
-        </w:rPr>
-        <w:t>Lectura:</w:t>
-      </w:r>
-    </w:p>
-    <w:tbl>
-      <w:tblPr>
-        <w:tblStyle w:val="TableGrid"/>
-        <w:tblW w:type="auto" w:w="0"/>
-        <w:tblLook w:firstColumn="1" w:firstRow="1" w:lastColumn="0" w:lastRow="0" w:noHBand="0" w:noVBand="1" w:val="04A0"/>
-      </w:tblPr>
-      <w:tblGrid>
-        <w:gridCol w:w="2880"/>
-        <w:gridCol w:w="2880"/>
-        <w:gridCol w:w="2880"/>
-      </w:tblGrid>
-      <w:tr>
-        <w:tc>
-          <w:tcPr>
-            <w:tcW w:type="dxa" w:w="2880"/>
-          </w:tcPr>
-          <w:p>
-            <w:r>
-              <w:rPr>
-                <w:b/>
-              </w:rPr>
-              <w:t>Ataque a /rest/user/login</w:t>
-            </w:r>
-          </w:p>
-        </w:tc>
-        <w:tc>
-          <w:tcPr>
-            <w:tcW w:type="dxa" w:w="2880"/>
-          </w:tcPr>
-          <w:p>
-            <w:r>
-              <w:rPr>
-                <w:b/>
-              </w:rPr>
-              <w:t>Oficial :3000 (sin RASP)</w:t>
-            </w:r>
-          </w:p>
-        </w:tc>
-        <w:tc>
-          <w:tcPr>
-            <w:tcW w:type="dxa" w:w="2880"/>
-          </w:tcPr>
-          <w:p>
-            <w:r>
-              <w:rPr>
-                <w:b/>
-              </w:rPr>
-              <w:t>Fork :3001 (RASP)</w:t>
-            </w:r>
-          </w:p>
-        </w:tc>
-      </w:tr>
-      <w:tr>
-        <w:tc>
-          <w:tcPr>
-            <w:tcW w:type="dxa" w:w="2880"/>
-          </w:tcPr>
-          <w:p>
-            <w:r>
-              <w:t>Legítimo jim</w:t>
-            </w:r>
-          </w:p>
-        </w:tc>
-        <w:tc>
-          <w:tcPr>
-            <w:tcW w:type="dxa" w:w="2880"/>
-          </w:tcPr>
-          <w:p>
-            <w:r>
-              <w:t>200</w:t>
-            </w:r>
-          </w:p>
-        </w:tc>
-        <w:tc>
-          <w:tcPr>
-            <w:tcW w:type="dxa" w:w="2880"/>
-          </w:tcPr>
-          <w:p>
-            <w:r>
-              <w:t>200</w:t>
-            </w:r>
-          </w:p>
-        </w:tc>
-      </w:tr>
-      <w:tr>
-        <w:tc>
-          <w:tcPr>
-            <w:tcW w:type="dxa" w:w="2880"/>
-          </w:tcPr>
-          <w:p>
-            <w:r>
-              <w:t>SQLi clásico ' OR 1=1--</w:t>
-            </w:r>
-          </w:p>
-        </w:tc>
-        <w:tc>
-          <w:tcPr>
-            <w:tcW w:type="dxa" w:w="2880"/>
-          </w:tcPr>
-          <w:p>
-            <w:r>
-              <w:t>200 + JWT de admin (takeover)</w:t>
-            </w:r>
-          </w:p>
-        </w:tc>
-        <w:tc>
-          <w:tcPr>
-            <w:tcW w:type="dxa" w:w="2880"/>
-          </w:tcPr>
-          <w:p>
-            <w:r>
-              <w:t>403 + log RASP</w:t>
-            </w:r>
-          </w:p>
-        </w:tc>
-      </w:tr>
-      <w:tr>
-        <w:tc>
-          <w:tcPr>
-            <w:tcW w:type="dxa" w:w="2880"/>
-          </w:tcPr>
-          <w:p>
-            <w:r>
-              <w:t>UNION SELECT</w:t>
-            </w:r>
-          </w:p>
-        </w:tc>
-        <w:tc>
-          <w:tcPr>
-            <w:tcW w:type="dxa" w:w="2880"/>
-          </w:tcPr>
-          <w:p>
-            <w:r>
-              <w:t>200</w:t>
-            </w:r>
-          </w:p>
-        </w:tc>
-        <w:tc>
-          <w:tcPr>
-            <w:tcW w:type="dxa" w:w="2880"/>
-          </w:tcPr>
-          <w:p>
-            <w:r>
-              <w:t>403 + log RASP</w:t>
-            </w:r>
-          </w:p>
-        </w:tc>
-      </w:tr>
-      <w:tr>
-        <w:tc>
-          <w:tcPr>
-            <w:tcW w:type="dxa" w:w="2880"/>
-          </w:tcPr>
-          <w:p>
-            <w:r>
-              <w:t>Search q=' OR '1'='1 (string-form)</w:t>
-            </w:r>
-          </w:p>
-        </w:tc>
-        <w:tc>
-          <w:tcPr>
-            <w:tcW w:type="dxa" w:w="2880"/>
-          </w:tcPr>
-          <w:p>
-            <w:r>
-              <w:t>200</w:t>
-            </w:r>
-          </w:p>
-        </w:tc>
-        <w:tc>
-          <w:tcPr>
-            <w:tcW w:type="dxa" w:w="2880"/>
-          </w:tcPr>
-          <w:p>
-            <w:r>
-              <w:t>200 (hueco del patrón, documentado)</w:t>
-            </w:r>
-          </w:p>
-        </w:tc>
-      </w:tr>
-    </w:tbl>
-    <w:p>
-      <w:r>
-        <w:rPr>
-          <w:b w:val="0"/>
-          <w:i w:val="0"/>
-        </w:rPr>
-        <w:t>El takeover es total: sin RASP el payload clásico devuelve el JWT del administrador; con RASP, 403 antes de que Sequelize ejecute. El search con forma string evade también el middleware global (mismo hueco del regex literal ya reportado en el demo): fix propuesto idéntico (añadir OR '...'='...'). Guard de login verificado por unit test (3/3 PASS contra el compilado build/lib/raspGuard.js): es segunda capa redundante por diseño (defensa en profundidad); en estos payloads el middleware global bloquea primero.</w:t>
-      </w:r>
-    </w:p>
-    <w:p>
-      <w:r>
-        <w:rPr>
-          <w:b w:val="0"/>
-          <w:i w:val="0"/>
-        </w:rPr>
-        <w:t>Imagen Docker local: juice-shop:rasp-lab (docker build desde el fork) para enchufarla al compose del taller manteniendo el WAAP delante.</w:t>
       </w:r>
     </w:p>
     <w:sectPr>

</xml_diff>

<commit_message>
lab/fases-5-7: pipeline DevSecOps verde, matriz efectividad, metricas, informe completo
</commit_message>
<xml_diff>
--- a/Informe_Taller_WAAP_Fase0-2.docx
+++ b/Informe_Taller_WAAP_Fase0-2.docx
@@ -1600,6 +1600,247 @@
         <w:pStyle w:val="Heading1"/>
       </w:pPr>
       <w:r>
+        <w:t>Fase 5 - Pipeline DevSecOps</w:t>
+      </w:r>
+    </w:p>
+    <w:p>
+      <w:r>
+        <w:rPr>
+          <w:b/>
+          <w:i w:val="0"/>
+        </w:rPr>
+        <w:t>Objetivo: gate CI/CD con SAST, SCA, contenedor, IaC y DAST; despliegue solo en verde (PDF p.14).</w:t>
+      </w:r>
+    </w:p>
+    <w:p>
+      <w:r>
+        <w:rPr>
+          <w:b w:val="0"/>
+          <w:i w:val="0"/>
+        </w:rPr>
+        <w:t>Implementado: pipeline/.github/workflows/devsecops.yml (Semgrep p/owasp-top-ten, pip-audit sobre waap/ml/requirements.txt —nuevo—, docker build de app/, Trivy CRITICAL,HIGH exit 1, Checkov, ZAP baseline, deploy_waap_rules.sh con if: success()). Cada herramienta se replicó localmente como evidencia.</w:t>
+      </w:r>
+    </w:p>
+    <w:p>
+      <w:r>
+        <w:rPr>
+          <w:b w:val="0"/>
+          <w:i w:val="0"/>
+        </w:rPr>
+        <w:t>Endurecimiento real durante el gate (no cosmético): Semgrep tumbó el primer Dockerfile (correre como root -&gt; USER node); Checkov exigió HEALTHCHECK + permissions mínimas; Trivy reportó 67 CVE HIGH/CRIT en node:22-slim (base Debian) y 11 en el npm de la imagen -&gt; base Alpine + multistage + npm fuera del runtime = 0 findings. La imagen final corre, responde 200 y bloquea SQLi con 403.</w:t>
+      </w:r>
+    </w:p>
+    <w:p>
+      <w:r>
+        <w:rPr>
+          <w:rFonts w:ascii="Consolas" w:hAnsi="Consolas"/>
+          <w:sz w:val="17"/>
+        </w:rPr>
+        <w:t>semgrep: 224 reglas, 0 findings | pip-audit: No known vulnerabilities found | checkov: 39 passed, 0 failed | trivy: Clean (no security findings detected) | deploy_waap_rules.sh: Despliegue OK (normal=200, SQLi=403)</w:t>
+      </w:r>
+    </w:p>
+    <w:p>
+      <w:r>
+        <w:rPr>
+          <w:b w:val="0"/>
+          <w:i w:val="0"/>
+        </w:rPr>
+        <w:t>Ejercicio de verificación (PDF): se inyectó eval(req.query.cmd) -&gt; Semgrep rojo (2 blocking: code-string-concat + direct-response-write, etapa SAST); revert -&gt; verde. Evidencias: evidencias/fase5/01-semgrep a 06-vuln-inyectada-rojo + 05-deploy.</w:t>
+      </w:r>
+    </w:p>
+    <w:p>
+      <w:pPr>
+        <w:pStyle w:val="Heading1"/>
+      </w:pPr>
+      <w:r>
+        <w:t>Fase 6 - Pruebas de efectividad y evasion</w:t>
+      </w:r>
+    </w:p>
+    <w:p>
+      <w:r>
+        <w:rPr>
+          <w:b/>
+          <w:i w:val="0"/>
+        </w:rPr>
+        <w:t>Objetivo: matriz comparativa individual y combinada (PDF p.15).</w:t>
+      </w:r>
+    </w:p>
+    <w:p>
+      <w:r>
+        <w:rPr>
+          <w:b w:val="0"/>
+          <w:i w:val="0"/>
+        </w:rPr>
+        <w:t>Batería de 9 técnicas × 3 capas (script waap/ml/bateria_fase6.py, con atribución correcta CRS-vs-RASP por cuerpo de respuesta). Evidencia: evidencias/fase6/matriz.csv:</w:t>
+      </w:r>
+    </w:p>
+    <w:p>
+      <w:r>
+        <w:rPr>
+          <w:rFonts w:ascii="Consolas" w:hAnsi="Consolas"/>
+          <w:sz w:val="17"/>
+        </w:rPr>
+        <w:t>Payload / tecnica,Bloqueado por reglas (Fase 2),Detectado por IA/ML (Fase 3),Bloqueado por RASP (Fase 4)</w:t>
+        <w:br/>
+        <w:t>SQLi clasico ' OR '1'='1,BLOQUEA,SI,EVADE</w:t>
+        <w:br/>
+        <w:t>SQLi encoded,BLOQUEA,SI,EVADE</w:t>
+        <w:br/>
+        <w:t>SQLi comentarios /**/,EVADE,SI,BLOQUEA</w:t>
+        <w:br/>
+        <w:t>SQLi fragmentado 2 params,EVADE,SI,BLOQUEA</w:t>
+        <w:br/>
+        <w:t>SQLi UNION login,BLOQUEA,SI,BLOQUEA</w:t>
+        <w:br/>
+        <w:t>SQLi clasico login,BLOQUEA,SI,BLOQUEA</w:t>
+        <w:br/>
+        <w:t>XSS basico,BLOQUEA,SI,EVADE</w:t>
+        <w:br/>
+        <w:t>XSS encoded,BLOQUEA,SI,EVADE</w:t>
+        <w:br/>
+        <w:t>Traversal ../../etc/passwd,BLOQUEA,SI,EVADE</w:t>
+      </w:r>
+    </w:p>
+    <w:p>
+      <w:r>
+        <w:rPr>
+          <w:b w:val="0"/>
+          <w:i w:val="0"/>
+        </w:rPr>
+        <w:t>Ataque controlado: sqlmap vs WAAP -&gt; 42x403, 'not injectable' (sugiere tamper); directo vs fork -&gt; 14x403 (RASP) + 8x500, tampoco inyectable; login JSON -&gt; parámetros no dinámicos. ZAP baseline vs :8080 -&gt; 0 FAIL, 59 PASS, 8 WARN (higiene pasiva correcta).</w:t>
+      </w:r>
+    </w:p>
+    <w:p>
+      <w:r>
+        <w:rPr>
+          <w:rFonts w:ascii="Consolas" w:hAnsi="Consolas"/>
+          <w:sz w:val="17"/>
+        </w:rPr>
+        <w:t># Fase 6 â AnÃ¡lisis de efectividad (mÃ­nimo media pÃ¡gina, PDF p.15)</w:t>
+        <w:br/>
+        <w:br/>
+        <w:t>## QuÃ© combinaciÃ³n ofrece la mejor cobertura y por quÃ©</w:t>
+        <w:br/>
+        <w:br/>
+        <w:t>Ninguna capa sola cubre todo; la cobertura total solo aparece al combinarlas,</w:t>
+        <w:br/>
+        <w:t>y cada hueco de una capa lo tapa otra (defensa en profundidad verificada):</w:t>
+        <w:br/>
+        <w:br/>
+        <w:t>- **Reglas CRS (PL1)**: bloquean 7/9 tÃ©cnicas (clÃ¡sico, encoded, UNION, XSS x2,</w:t>
+        <w:br/>
+        <w:t xml:space="preserve">  traversal, login clÃ¡sico/UNION). Fallan en lo **fragmentado** (evalÃºan cada</w:t>
+        <w:br/>
+        <w:t xml:space="preserve">  parÃ¡metro por separado) y en variantes con espacios que alteran la firma</w:t>
+        <w:br/>
+        <w:t xml:space="preserve">  (comentarios con espacios: lo parÃ³ el RASP, no el CRS).</w:t>
+        <w:br/>
+        <w:t>- **IA/ML (umbral 0.0)**: detecta 9/9 como anÃ³malo, pero al costo de FPR 80%</w:t>
+        <w:br/>
+        <w:t xml:space="preserve">  (4/5 normales marcados). Con umbral -0.05 solo 2/5 con FPR 40%. ConclusiÃ³n:</w:t>
+        <w:br/>
+        <w:t xml:space="preserve">  el modelo **no es bloqueador viable solo**; sirve como seÃ±al para el</w:t>
+        <w:br/>
+        <w:t xml:space="preserve">  orquestador (permitir/bloquear/desafiar) o para revisiÃ³n, no como gate duro.</w:t>
+        <w:br/>
+        <w:t xml:space="preserve">  La rÃ¡faga bot ni siquiera cruza el umbral (limitaciÃ³n de IsolationForest</w:t>
+        <w:br/>
+        <w:t xml:space="preserve">  documentada en Fase 3).</w:t>
+        <w:br/>
+        <w:t>- **RASP (fork)**: bloquea 4/9 en contexto de ejecuciÃ³n (fragmentado, comentarios</w:t>
+        <w:br/>
+        <w:t xml:space="preserve">  con `--`, UNION y clÃ¡sico de login), incluyendo las 2 evasiones del CRS.</w:t>
+        <w:br/>
+        <w:t xml:space="preserve">  Falla en XSS/traversal (fuera de su alcance SQL) y en la forma string</w:t>
+        <w:br/>
+        <w:t xml:space="preserve">  `' OR '1'='1` (hueco del regex literal, con fix propuesto). Su tasa de falsos</w:t>
+        <w:br/>
+        <w:t xml:space="preserve">  positivos es 0 en lo probado: solo dispara ante alteraciÃ³n estructural real.</w:t>
+        <w:br/>
+        <w:br/>
+        <w:t>**Mejor combinaciÃ³n: CRS + RASP, con ML como seÃ±al de apoyo.** CRS frena el</w:t>
+        <w:br/>
+        <w:t>grueso automatizado (sqlmap: 42Ã403 vÃ­a WAAP, "not injectable", sugiere tamper),</w:t>
+        <w:br/>
+        <w:t>RASP captura lo que evade firmas con contexto real (sqlmap directo: 14Ã403 +</w:t>
+        <w:br/>
+        <w:t>8Ã500, tampoco inyectable), y ML aporta detecciÃ³n de variantes raras a cambio</w:t>
+        <w:br/>
+        <w:t>de revisiÃ³n humana. ZAP baseline: 0 FAIL, 59 PASS (higiene pasiva correcta).</w:t>
+        <w:br/>
+        <w:br/>
+        <w:t>Residuo aceptado: string-form SQLi en search (requiere fix de patrÃ³n) y rÃ¡fagas</w:t>
+        <w:br/>
+        <w:t>(requieren regla de tasa explÃ­cita, no ML puro).</w:t>
+      </w:r>
+    </w:p>
+    <w:p>
+      <w:pPr>
+        <w:pStyle w:val="Heading1"/>
+      </w:pPr>
+      <w:r>
+        <w:t>Fase 7 - Observabilidad y metricas</w:t>
+      </w:r>
+    </w:p>
+    <w:p>
+      <w:r>
+        <w:rPr>
+          <w:b/>
+          <w:i w:val="0"/>
+        </w:rPr>
+        <w:t>Objetivo: visibilidad centralizada y números para tuning (PDF p.16).</w:t>
+      </w:r>
+    </w:p>
+    <w:p>
+      <w:r>
+        <w:rPr>
+          <w:b w:val="0"/>
+          <w:i w:val="0"/>
+        </w:rPr>
+        <w:t>Eventos unificados en logs/eventos.jsonl (reglas + ml + rasp, con timestamp). Métricas desde las matrices (script waap/ml/metricas_fase7.py):</w:t>
+      </w:r>
+    </w:p>
+    <w:p>
+      <w:r>
+        <w:rPr>
+          <w:rFonts w:ascii="Consolas" w:hAnsi="Consolas"/>
+          <w:sz w:val="17"/>
+        </w:rPr>
+        <w:t>capa               |  TPR   FPR   FNR</w:t>
+        <w:br/>
+        <w:t>reglas CRS PL1     | 78%  0%  22%   (TP=7 FN=2 FP=0 TN=5)</w:t>
+        <w:br/>
+        <w:t>IA/ML umbral 0.0   | 100%  80%  0%   (TP=9 FN=0 FP=4 TN=1)</w:t>
+        <w:br/>
+        <w:t>RASP fork (SQL)    | 67%  0%  33%   (TP=4 FN=2 FP=0 TN=5)</w:t>
+        <w:br/>
+        <w:br/>
+        <w:t>MTTD simulado (tiempo-a-veredicto por capa):</w:t>
+        <w:br/>
+        <w:t xml:space="preserve">  CRS/sqli-clasico: 144.0 ms</w:t>
+        <w:br/>
+        <w:t xml:space="preserve">  CRS/xss: 124.0 ms</w:t>
+        <w:br/>
+        <w:t xml:space="preserve">  RASP/sqli-login: 61.5 ms</w:t>
+        <w:br/>
+        <w:br/>
+        <w:t>OK logs/eventos.jsonl (8 eventos)</w:t>
+      </w:r>
+    </w:p>
+    <w:p>
+      <w:r>
+        <w:rPr>
+          <w:b w:val="0"/>
+          <w:i w:val="0"/>
+        </w:rPr>
+        <w:t>Recomendación de tuning: CRS en PL1 como está; ML solo como señal (umbral 0.0 + revisión, nunca gate duro) + regla híbrida de tasa para ráfagas; RASP con patrón ampliado (OR '...'='...'). MTTD medido ~60-150 ms por capa (tiempo-a-veredicto local).</w:t>
+      </w:r>
+    </w:p>
+    <w:p>
+      <w:pPr>
+        <w:pStyle w:val="Heading1"/>
+      </w:pPr>
+      <w:r>
         <w:t>Anexo A - Paso a paso reproducible (todo lo hecho)</w:t>
       </w:r>
     </w:p>
@@ -1703,6 +1944,49 @@
         <w:pStyle w:val="Heading1"/>
       </w:pPr>
       <w:r>
+        <w:t>Anexo A (cont.) - Fases 5-7 reproducible</w:t>
+      </w:r>
+    </w:p>
+    <w:p>
+      <w:r>
+        <w:rPr>
+          <w:rFonts w:ascii="Consolas" w:hAnsi="Consolas"/>
+          <w:sz w:val="17"/>
+        </w:rPr>
+        <w:t>pip install --user semgrep pip-audit checkov; sudo apt install trivy sqlmap</w:t>
+        <w:br/>
+        <w:t>semgrep --config=p/owasp-top-ten app/ waap/ --error</w:t>
+        <w:br/>
+        <w:t>pip-audit -r waap/ml/requirements.txt</w:t>
+        <w:br/>
+        <w:t>docker build -t taller-waap/app:local ./app</w:t>
+        <w:br/>
+        <w:t>trivy image --severity CRITICAL,HIGH --exit-code 1 taller-waap/app:local</w:t>
+        <w:br/>
+        <w:t>checkov -d . --quiet --compact</w:t>
+        <w:br/>
+        <w:t>./scripts/deploy_waap_rules.sh</w:t>
+        <w:br/>
+        <w:t>python3 waap/ml/bateria_fase6.py</w:t>
+        <w:br/>
+        <w:t>sqlmap -u 'http://localhost:8080/rest/products/search?q=apple' --batch --level=1</w:t>
+        <w:br/>
+        <w:t>docker run --rm ghcr.io/zaproxy/zaproxy:stable zap-baseline.py -t http://host.docker.internal:8080</w:t>
+        <w:br/>
+        <w:t>python3 waap/ml/metricas_fase7.py</w:t>
+      </w:r>
+    </w:p>
+    <w:sectPr>
+      <w:pgSz w:w="12240" w:h="15840"/>
+      <w:pgMar w:top="1440" w:right="1800" w:bottom="1440" w:left="1800" w:header="720" w:footer="720" w:gutter="0"/>
+      <w:cols w:space="720"/>
+      <w:docGrid w:linePitch="360"/>
+    </w:sectPr>
+    <w:p>
+      <w:pPr>
+        <w:pStyle w:val="Heading1"/>
+      </w:pPr>
+      <w:r>
         <w:t>Anexo B - Salidas de terminal (Fases 0-2)</w:t>
       </w:r>
     </w:p>
@@ -1756,12 +2040,6 @@
         <w:t xml:space="preserve">      1 "message":"SQL Injection Attack Detected via libinjection"</w:t>
       </w:r>
     </w:p>
-    <w:sectPr>
-      <w:pgSz w:w="12240" w:h="15840"/>
-      <w:pgMar w:top="1440" w:right="1800" w:bottom="1440" w:left="1800" w:header="720" w:footer="720" w:gutter="0"/>
-      <w:cols w:space="720"/>
-      <w:docGrid w:linePitch="360"/>
-    </w:sectPr>
   </w:body>
 </w:document>
 </file>

</xml_diff>

<commit_message>
docs v2.0: informe clarificado (estructura uniforme, matriz final, cuestionario Q1-Q8)
</commit_message>
<xml_diff>
--- a/Informe_Taller_WAAP_Fase0-2.docx
+++ b/Informe_Taller_WAAP_Fase0-2.docx
@@ -13,7 +13,7 @@
         </w:rPr>
         <w:t>Taller WAAP con IA/ML, RASP y DevSecOps</w:t>
         <w:br/>
-        <w:t>Informe de laboratorio - Fases 0 a 4</w:t>
+        <w:t>Informe de laboratorio - Fases 0 a 7 (v2.0)</w:t>
       </w:r>
     </w:p>
     <w:p>
@@ -26,12 +26,20 @@
       </w:r>
     </w:p>
     <w:p>
+      <w:pPr>
+        <w:pStyle w:val="Heading1"/>
+      </w:pPr>
+      <w:r>
+        <w:t>Resumen ejecutivo</w:t>
+      </w:r>
+    </w:p>
+    <w:p>
       <w:r>
         <w:rPr>
           <w:b w:val="0"/>
           <w:i w:val="0"/>
         </w:rPr>
-        <w:t>Prototipo: OWASP Juice Shop 20.2.0 + ModSecurity CRS 3.3.10 (PL1) + RASP sobre fork. Entorno: Ubuntu 22.04, Docker + Docker Compose. Acceso via WAAP: http://localhost:8080 (backend directo :3000). Rama del trabajo: lab/fases-0-4.</w:t>
+        <w:t>Se implemento un prototipo WAAP completo: Juice Shop 20.2.0 tras ModSecurity CRS 3.3.10 (PL1), detector de anomalias IsolationForest, RASP real sobre fork de Juice Shop y pipeline DevSecOps en verde. Hallazgos centrales: (1) el CRS frena el ataque automatizado pero deja pasar payloads fragmentados; (2) el ML detecta variantes a cambio de falsos positivos (no sirve como gate duro); (3) el RASP captura con contexto de ejecucion lo que evade firmas, con overhead despreciable (+0.1 micro-s/req). La mejor cobertura es CRS+RASP con ML como senal de apoyo. Este documento (v2.0) clarifica el informe literal v1.0 y responde el cuestionario final con datos del laboratorio.</w:t>
       </w:r>
     </w:p>
     <w:p>
@@ -43,12 +51,11 @@
       </w:r>
     </w:p>
     <w:p>
+      <w:pPr>
+        <w:pStyle w:val="Heading3"/>
+      </w:pPr>
       <w:r>
-        <w:rPr>
-          <w:b/>
-          <w:i w:val="0"/>
-        </w:rPr>
-        <w:t>Objetivo: levantar la infraestructura base (PDF p.9).</w:t>
+        <w:t>Objetivo</w:t>
       </w:r>
     </w:p>
     <w:p>
@@ -57,7 +64,15 @@
           <w:b w:val="0"/>
           <w:i w:val="0"/>
         </w:rPr>
-        <w:t>Paso a paso ejecutado:</w:t>
+        <w:t>Levantar la infraestructura base del laboratorio (PDF p.9).</w:t>
+      </w:r>
+    </w:p>
+    <w:p>
+      <w:pPr>
+        <w:pStyle w:val="Heading3"/>
+      </w:pPr>
+      <w:r>
+        <w:t>Que se hizo (paso a paso)</w:t>
       </w:r>
     </w:p>
     <w:p>
@@ -70,11 +85,17 @@
         <w:br/>
         <w:t>cp .env.example .env   # JUICE_PORT=3000, WAAP_PORT=8080, PARANOIA=1</w:t>
         <w:br/>
-        <w:t>docker compose pull</w:t>
-        <w:br/>
-        <w:t>docker compose up -d &amp;&amp; docker compose ps</w:t>
+        <w:t>docker compose pull &amp;&amp; docker compose up -d &amp;&amp; docker compose ps</w:t>
         <w:br/>
         <w:t>curl -i http://localhost:8080   # 200 OK, Server: nginx (proxy WAAP)</w:t>
+      </w:r>
+    </w:p>
+    <w:p>
+      <w:pPr>
+        <w:pStyle w:val="Heading3"/>
+      </w:pPr>
+      <w:r>
+        <w:t>Resultado y lectura</w:t>
       </w:r>
     </w:p>
     <w:p>
@@ -83,7 +104,7 @@
           <w:b w:val="0"/>
           <w:i w:val="0"/>
         </w:rPr>
-        <w:t>Resultado: ambos contenedores Up (waap-proxy healthy). Nota: el usuario debio anadirse al grupo docker (sudo usermod -aG docker $USER) por permiso denegado en /var/run/docker.sock. En Fase 4 el servicio juice-shop paso a la imagen local juice-shop:rasp-lab (ver Fase 4).</w:t>
+        <w:t>Contenedores Up (waap-proxy healthy). Nota operativa: hizo falta anadir el usuario al grupo docker (permiso denegado en /var/run/docker.sock). En Fase 4 el backend paso a la imagen local juice-shop:rasp-lab. Evidencia: Fig. 1 y Anexo B.</w:t>
       </w:r>
     </w:p>
     <w:p>
@@ -192,12 +213,11 @@
       </w:r>
     </w:p>
     <w:p>
+      <w:pPr>
+        <w:pStyle w:val="Heading3"/>
+      </w:pPr>
       <w:r>
-        <w:rPr>
-          <w:b/>
-          <w:i w:val="0"/>
-        </w:rPr>
-        <w:t>Objetivo: blanco controlado con vulnerabilidades documentadas (PDF p.10).</w:t>
+        <w:t>Objetivo</w:t>
       </w:r>
     </w:p>
     <w:p>
@@ -206,7 +226,15 @@
           <w:b w:val="0"/>
           <w:i w:val="0"/>
         </w:rPr>
-        <w:t>Paso a paso ejecutado:</w:t>
+        <w:t>Contar con un blanco controlado con vulnerabilidades documentadas (PDF p.10).</w:t>
+      </w:r>
+    </w:p>
+    <w:p>
+      <w:pPr>
+        <w:pStyle w:val="Heading3"/>
+      </w:pPr>
+      <w:r>
+        <w:t>Que se hizo (paso a paso)</w:t>
       </w:r>
     </w:p>
     <w:p>
@@ -215,11 +243,19 @@
           <w:rFonts w:ascii="Consolas" w:hAnsi="Consolas"/>
           <w:sz w:val="17"/>
         </w:rPr>
-        <w:t>curl -s http://localhost:8080/rest/admin/application-version  # {"version":"20.2.0"}</w:t>
+        <w:t>curl -s http://localhost:8080/rest/admin/application-version  # version 20.2.0</w:t>
         <w:br/>
-        <w:t>curl -s "http://localhost:8080/rest/products/search?q=apple"  # JSON success via WAAP</w:t>
+        <w:t>curl -s 'http://localhost:8080/rest/products/search?q=apple'  # JSON success via WAAP</w:t>
         <w:br/>
-        <w:t># Navegador: http://localhost:8080/#/score-board (retos por categoria OWASP)</w:t>
+        <w:t>Navegador: http://localhost:8080/#/score-board (retos por categoria OWASP)</w:t>
+      </w:r>
+    </w:p>
+    <w:p>
+      <w:pPr>
+        <w:pStyle w:val="Heading3"/>
+      </w:pPr>
+      <w:r>
+        <w:t>Resultado y lectura</w:t>
       </w:r>
     </w:p>
     <w:p>
@@ -228,7 +264,16 @@
           <w:b w:val="0"/>
           <w:i w:val="0"/>
         </w:rPr>
-        <w:t>Linea base de vulnerabilidades (entregable Fase 1):</w:t>
+        <w:t>Juice Shop 20.2.0 operativo tras el WAAP. Linea base de 5 vulnerabilidades (Tabla 1) usada en todas las fases. Evidencias: Fig. 2 (Score Board) y Fig. 3 (trafico normal).</w:t>
+      </w:r>
+    </w:p>
+    <w:p>
+      <w:r>
+        <w:rPr>
+          <w:b w:val="0"/>
+          <w:i w:val="0"/>
+        </w:rPr>
+        <w:t>Tabla 1. Linea base de vulnerabilidades (entregable Fase 1).</w:t>
       </w:r>
     </w:p>
     <w:tbl>
@@ -513,7 +558,7 @@
         <w:pStyle w:val="Caption"/>
       </w:pPr>
       <w:r>
-        <w:t>Figura 2. Score Board (1%, categorias OWASP).</w:t>
+        <w:t>Figura 2. Score Board (categorias OWASP).</w:t>
       </w:r>
     </w:p>
     <w:p>
@@ -560,7 +605,7 @@
         <w:pStyle w:val="Caption"/>
       </w:pPr>
       <w:r>
-        <w:t>Figura 3. Trafico normal: busqueda via WAAP (200).</w:t>
+        <w:t>Figura 3. Trafico normal via WAAP (200).</w:t>
       </w:r>
     </w:p>
     <w:p>
@@ -611,12 +656,11 @@
       </w:r>
     </w:p>
     <w:p>
+      <w:pPr>
+        <w:pStyle w:val="Heading3"/>
+      </w:pPr>
       <w:r>
-        <w:rPr>
-          <w:b/>
-          <w:i w:val="0"/>
-        </w:rPr>
-        <w:t>Objetivo: primera linea de defensa con OWASP CRS y evidencia de bloqueo + evasion (PDF p.10).</w:t>
+        <w:t>Objetivo</w:t>
       </w:r>
     </w:p>
     <w:p>
@@ -625,7 +669,15 @@
           <w:b w:val="0"/>
           <w:i w:val="0"/>
         </w:rPr>
-        <w:t>Paso a paso ejecutado:</w:t>
+        <w:t>Primera linea de defensa con OWASP CRS: un bloqueo y una evasion evidenciados (PDF p.10).</w:t>
+      </w:r>
+    </w:p>
+    <w:p>
+      <w:pPr>
+        <w:pStyle w:val="Heading3"/>
+      </w:pPr>
+      <w:r>
+        <w:t>Que se hizo (paso a paso)</w:t>
       </w:r>
     </w:p>
     <w:p>
@@ -634,25 +686,23 @@
           <w:rFonts w:ascii="Consolas" w:hAnsi="Consolas"/>
           <w:sz w:val="17"/>
         </w:rPr>
-        <w:t># Nivel de paranoia (PDF: iniciar en PL1)</w:t>
-        <w:br/>
-        <w:t>docker compose exec waap-proxy env | grep -E 'PARANOIA|BACKEND'</w:t>
-        <w:br/>
-        <w:t># PARANOIA=1, BLOCKING_PARANOIA=1, BACKEND=http://juice-shop:3000</w:t>
-        <w:br/>
-        <w:t># Prueba de deteccion basica:</w:t>
+        <w:t># Paranoia PL1: PARANOIA=1, BLOCKING_PARANOIA=1, BACKEND=http://juice-shop:3000</w:t>
         <w:br/>
         <w:t>curl -i --get --data-urlencode "q=' OR '1'='1" \</w:t>
         <w:br/>
         <w:t xml:space="preserve">  http://localhost:8080/rest/products/search   # -&gt; 403 Forbidden</w:t>
         <w:br/>
-        <w:t># Prueba de evasion (payload fragmentado en 2 parametros):</w:t>
-        <w:br/>
         <w:t>curl -i "http://localhost:8080/rest/products/search?q='%20&amp;x=OR%201=1"  # -&gt; 200</w:t>
         <w:br/>
-        <w:t># Logs (esta imagen emite el audit log a docker logs, no a /var/log/modsec_audit.log):</w:t>
-        <w:br/>
-        <w:t>docker compose logs waap-proxy | grep -E '942100|949110'</w:t>
+        <w:t>docker compose logs waap-proxy | grep -E '942100|949110'  # (el audit log sale por docker logs)</w:t>
+      </w:r>
+    </w:p>
+    <w:p>
+      <w:pPr>
+        <w:pStyle w:val="Heading3"/>
+      </w:pPr>
+      <w:r>
+        <w:t>Resultado y lectura</w:t>
       </w:r>
     </w:p>
     <w:p>
@@ -661,7 +711,7 @@
           <w:b w:val="0"/>
           <w:i w:val="0"/>
         </w:rPr>
-        <w:t>Resultado: SQLi clasico/encoded/comentarios/UNION/XSS/traversal -&gt; 403 (regla 942100 libinjection + 949110 anomaly score). Solo el fragmentado q=' &amp; x=OR 1=1 -&gt; 200 ({"status":"success","data":[]}): el CRS PL1 evalua cada parametro por separado.</w:t>
+        <w:t>SQLi clasico/encoded/comentarios/UNION/XSS/traversal -&gt; 403 (regla 942100 libinjection + 949110). Solo el fragmentado q=' &amp; x=OR 1=1 -&gt; 200: el CRS evalua cada parametro por separado. Evidencias: Fig. 4 (bloqueo) y Fig. 5 (evasion, base de Fase 3).</w:t>
       </w:r>
     </w:p>
     <w:p>
@@ -669,7 +719,7 @@
         <w:pStyle w:val="Caption"/>
       </w:pPr>
       <w:r>
-        <w:t>Figura 4. Bloqueo CRS: SQLi clasico -&gt; 403 Forbidden (nginx).</w:t>
+        <w:t>Figura 4. Bloqueo CRS: SQLi clasico -&gt; 403 (nginx).</w:t>
       </w:r>
     </w:p>
     <w:p>
@@ -716,7 +766,7 @@
         <w:pStyle w:val="Caption"/>
       </w:pPr>
       <w:r>
-        <w:t>Figura 5. Evasion: payload fragmentado -&gt; 200 OK (base comparativa para Fase 3).</w:t>
+        <w:t>Figura 5. Evasion fragmentada -&gt; 200 (pasa el CRS).</w:t>
       </w:r>
     </w:p>
     <w:p>
@@ -767,12 +817,11 @@
       </w:r>
     </w:p>
     <w:p>
+      <w:pPr>
+        <w:pStyle w:val="Heading3"/>
+      </w:pPr>
       <w:r>
-        <w:rPr>
-          <w:b/>
-          <w:i w:val="0"/>
-        </w:rPr>
-        <w:t>Objetivo: modelo de anomalias entrenado solo con trafico normal (PDF p.11-12).</w:t>
+        <w:t>Objetivo</w:t>
       </w:r>
     </w:p>
     <w:p>
@@ -781,7 +830,15 @@
           <w:b w:val="0"/>
           <w:i w:val="0"/>
         </w:rPr>
-        <w:t>Paso a paso ejecutado:</w:t>
+        <w:t>Modelo de anomalias entrenado solo con trafico normal, capaz de senalar variantes que evadieron firmas (PDF p.11-12).</w:t>
+      </w:r>
+    </w:p>
+    <w:p>
+      <w:pPr>
+        <w:pStyle w:val="Heading3"/>
+      </w:pPr>
+      <w:r>
+        <w:t>Que se hizo (paso a paso)</w:t>
       </w:r>
     </w:p>
     <w:p>
@@ -792,23 +849,21 @@
         </w:rPr>
         <w:t>python3 -m pip install --user scikit-learn pandas numpy joblib</w:t>
         <w:br/>
-        <w:t># 1. Trafico normal simulado a ritmo humano (~15 min, 120 reqs via WAAP):</w:t>
+        <w:t>GEN_N=120 PACE=humano python3 waap/ml/gen_traffic.py  # 120 reqs, ~15 min via WAAP</w:t>
         <w:br/>
-        <w:t>GEN_N=120 PACE=humano python3 waap/ml/gen_traffic.py  # -&gt; logs/access_normal.jsonl</w:t>
+        <w:t>python3 waap/ml/extract_features.py  # 6 features literales del PDF</w:t>
         <w:br/>
-        <w:t># 2. Features literales del PDF (url_length, body_length, entropy, n_params,</w:t>
+        <w:t>python3 waap/ml/train_model.py       # IsolationForest(200, 0.02) -&gt; model.pkl</w:t>
         <w:br/>
-        <w:t>#    has_suspicious_chars, req_per_minute):</w:t>
-        <w:br/>
-        <w:t>python3 waap/ml/extract_features.py  # -&gt; logs/features_normal_traffic.csv</w:t>
-        <w:br/>
-        <w:t># 3. Entrenamiento literal (IsolationForest 200/0.02 + StandardScaler):</w:t>
-        <w:br/>
-        <w:t>python3 waap/ml/train_model.py       # -&gt; waap/ml/model.pkl (en .gitignore)</w:t>
-        <w:br/>
-        <w:t># 4. Evaluacion: matriz 10 + 2 umbrales + rafaga bot:</w:t>
-        <w:br/>
-        <w:t>python3 waap/ml/evaluate.py</w:t>
+        <w:t>python3 waap/ml/evaluate.py          # matriz 10 + 2 umbrales + rafaga bot</w:t>
+      </w:r>
+    </w:p>
+    <w:p>
+      <w:pPr>
+        <w:pStyle w:val="Heading3"/>
+      </w:pPr>
+      <w:r>
+        <w:t>Resultado y lectura</w:t>
       </w:r>
     </w:p>
     <w:p>
@@ -817,7 +872,24 @@
           <w:b w:val="0"/>
           <w:i w:val="0"/>
         </w:rPr>
-        <w:t>Leccion metodologica: la primera pasada a ritmo maquina (0.05-0.4 s) contamino req_per_minute (rpm hasta 200 = 'normal'); se repitio a ritmo humano (4-11 s, rpm 8+-1), equivalente a los 15-20 min de navegacion manual que pide el PDF.</w:t>
+        <w:t>Leccion metodologica: el primer dataset a ritmo maquina contamino req_per_minute; se regenero a ritmo humano (rpm 8+-1). Umbral -0.05: 2/5 ataques, 2 FP. Umbral 0.0: 5/5 ataques, 4 FP. La rafaga no cruza el umbral (limitacion de IsolationForest verificada). Conclusion: el ML es senal de apoyo, no gate. Detalles y numeros abajo.</w:t>
+      </w:r>
+    </w:p>
+    <w:p>
+      <w:pPr>
+        <w:pStyle w:val="Heading3"/>
+      </w:pPr>
+      <w:r>
+        <w:t>Evidencias</w:t>
+      </w:r>
+    </w:p>
+    <w:p>
+      <w:r>
+        <w:rPr>
+          <w:b w:val="0"/>
+          <w:i w:val="0"/>
+        </w:rPr>
+        <w:t>Entrenamiento:</w:t>
       </w:r>
     </w:p>
     <w:p>
@@ -835,7 +907,7 @@
           <w:b w:val="0"/>
           <w:i w:val="0"/>
         </w:rPr>
-        <w:t>Matriz de 10 peticiones (entregable Fase 3):</w:t>
+        <w:t>Matriz de 10 peticiones:</w:t>
       </w:r>
     </w:p>
     <w:p>
@@ -882,7 +954,7 @@
           <w:b w:val="0"/>
           <w:i w:val="0"/>
         </w:rPr>
-        <w:t>Umbrales (deteccion vs falsos positivos):</w:t>
+        <w:t>Umbrales:</w:t>
       </w:r>
     </w:p>
     <w:p>
@@ -897,15 +969,6 @@
       </w:r>
     </w:p>
     <w:p>
-      <w:r>
-        <w:rPr>
-          <w:b w:val="0"/>
-          <w:i w:val="0"/>
-        </w:rPr>
-        <w:t>Discusion (entregable PDF): umbral -0.05 -&gt; 2/5 ataques con 2 FP (login valido, home); umbral 0.0 -&gt; 5/5 con 4 FP. La rafaga bot apenas mueve el score (+0.16-&gt;+0.17): se depuro hasta la causa (los arboles no ordenan mas alla del maximo de entrenamiento), por lo que req_per_minute solo no cruza el umbral - limitacion documentada y propuesta Q7 (regla hibrida tasa+score). La evasion fragmentada (q=' aislado) es estadisticamente normal: ni CRS ni ML la ven -&gt; motivacion de Fase 4.</w:t>
-      </w:r>
-    </w:p>
-    <w:p>
       <w:pPr>
         <w:pStyle w:val="Heading1"/>
       </w:pPr>
@@ -914,12 +977,11 @@
       </w:r>
     </w:p>
     <w:p>
+      <w:pPr>
+        <w:pStyle w:val="Heading3"/>
+      </w:pPr>
       <w:r>
-        <w:rPr>
-          <w:b/>
-          <w:i w:val="0"/>
-        </w:rPr>
-        <w:t>Objetivo: proteccion en tiempo de ejecucion con contexto real (PDF p.13).</w:t>
+        <w:t>Objetivo</w:t>
       </w:r>
     </w:p>
     <w:p>
@@ -928,7 +990,40 @@
           <w:b w:val="0"/>
           <w:i w:val="0"/>
         </w:rPr>
-        <w:t>Nota metodologica: el rasp_agent.py Flask del PDF no es integrable a Juice Shop (Node/Express). Se trabajo sobre fork real: github.com/Jhojan98/juice-shop, rama rasp-lab (clone --depth 1 en ~/juice-shop-rasp, fuera del repo del taller). OpenRASP esta inactivo desde 2022 sin agente Node vigente. app/rasp_agent.py queda como referencia literal del PDF y app/rasp-demo/ como prototipo previo del patron.</w:t>
+        <w:t>Proteccion en tiempo de ejecucion con contexto real: interceptar la operacion sensible aunque el payload haya superado el perimetro (PDF p.13).</w:t>
+      </w:r>
+    </w:p>
+    <w:p>
+      <w:pPr>
+        <w:pStyle w:val="Heading3"/>
+      </w:pPr>
+      <w:r>
+        <w:t>Que se hizo (paso a paso)</w:t>
+      </w:r>
+    </w:p>
+    <w:p>
+      <w:r>
+        <w:rPr>
+          <w:rFonts w:ascii="Consolas" w:hAnsi="Consolas"/>
+          <w:sz w:val="17"/>
+        </w:rPr>
+        <w:t>gh repo fork juice-shop/juice-shop; clone --depth 1 en ~/juice-shop-rasp (rama rasp-lab)</w:t>
+        <w:br/>
+        <w:t>sudo npm i -g npm@11 (npm 10 falla con bug arborist); npm install + build frontend/server</w:t>
+        <w:br/>
+        <w:t>Nuevo lib/raspGuard.ts (mismo patron del PDF) + app.use() en server.ts</w:t>
+        <w:br/>
+        <w:t>Guard sobre la query cruda real de routes/login.ts:34 -&gt; 403 antes de Sequelize</w:t>
+        <w:br/>
+        <w:t>PORT=3001 RASP_ENABLED=1 npm start; docker build -t juice-shop:rasp-lab (compose)</w:t>
+      </w:r>
+    </w:p>
+    <w:p>
+      <w:pPr>
+        <w:pStyle w:val="Heading3"/>
+      </w:pPr>
+      <w:r>
+        <w:t>Resultado y lectura</w:t>
       </w:r>
     </w:p>
     <w:p>
@@ -937,30 +1032,15 @@
           <w:b w:val="0"/>
           <w:i w:val="0"/>
         </w:rPr>
-        <w:t>Paso a paso ejecutado:</w:t>
+        <w:t>Sin RASP el SQLi clasico devuelve el JWT del administrador (takeover total); con RASP, 403 + log antes de ejecutar. Tambien cae UNION y fragmentado. Hueco honesto: la forma string ' OR '1'='1 evade el regex literal (fix propuesto). Overhead: +0.1 micro-s/req (despreciable). Prototipo previo conservado en app/rasp-demo/; referencia Flask en app/rasp_agent.py.</w:t>
       </w:r>
     </w:p>
     <w:p>
+      <w:pPr>
+        <w:pStyle w:val="Heading3"/>
+      </w:pPr>
       <w:r>
-        <w:rPr>
-          <w:rFonts w:ascii="Consolas" w:hAnsi="Consolas"/>
-          <w:sz w:val="17"/>
-        </w:rPr>
-        <w:t>gh repo fork juice-shop/juice-shop --clone=false</w:t>
-        <w:br/>
-        <w:t>git clone --depth 1 git@github.com:Jhojan98/juice-shop.git ~/juice-shop-rasp</w:t>
-        <w:br/>
-        <w:t>cd ~/juice-shop-rasp &amp;&amp; git checkout -b rasp-lab</w:t>
-        <w:br/>
-        <w:t># npm 10 falla con bug arborist 'edgesOut' en frontend: actualizar a npm 11 y</w:t>
-        <w:br/>
-        <w:t># aprobar install-scripts (esbuild, lmdb, @parcel/watcher):</w:t>
-        <w:br/>
-        <w:t>sudo npm i -g npm@11</w:t>
-        <w:br/>
-        <w:t>npm install &amp;&amp; (cd frontend &amp;&amp; npm install &amp;&amp; cd ..)  # raiz 846 pkgs + frontend</w:t>
-        <w:br/>
-        <w:t>npm run build:frontend &amp;&amp; npm run build:server</w:t>
+        <w:t>Evidencias</w:t>
       </w:r>
     </w:p>
     <w:p>
@@ -969,37 +1049,7 @@
           <w:b w:val="0"/>
           <w:i w:val="0"/>
         </w:rPr>
-        <w:t>Implementacion (2 capas, mismo SQLI_PATTERN del PDF):</w:t>
-      </w:r>
-    </w:p>
-    <w:p>
-      <w:r>
-        <w:rPr>
-          <w:rFonts w:ascii="Consolas" w:hAnsi="Consolas"/>
-          <w:sz w:val="17"/>
-        </w:rPr>
-        <w:t># lib/raspGuard.ts (NUEVO): isSqlInjection() + raspMiddleware global</w:t>
-        <w:br/>
-        <w:t># server.ts: app.use(raspMiddleware) tras el parser JSON (junto a helmet/rateLimit)</w:t>
-        <w:br/>
-        <w:t># routes/login.ts: la query cruda real (vuln-line de los retos loginAdmin/Jim/Bender)</w:t>
-        <w:br/>
-        <w:t>#   se guarda en finalQuery, pasa por el guard -&gt; 403 antes de que Sequelize ejecute.</w:t>
-        <w:br/>
-        <w:t>PORT=3001 RASP_ENABLED=1 npm start   # fork protegido (oficial sin RASP en :3000)</w:t>
-        <w:br/>
-        <w:t># Imagen local para el compose: docker build -t juice-shop:rasp-lab ~/juice-shop-rasp</w:t>
-        <w:br/>
-        <w:t># compose: image juice-shop:rasp-lab + RASP_ENABLED=1 (pull_policy: never)</w:t>
-      </w:r>
-    </w:p>
-    <w:p>
-      <w:r>
-        <w:rPr>
-          <w:b w:val="0"/>
-          <w:i w:val="0"/>
-        </w:rPr>
-        <w:t>Bateria con/sin RASP (evidencia: evidencias/fase4-real.txt):</w:t>
+        <w:t>Bateria con/sin RASP:</w:t>
       </w:r>
     </w:p>
     <w:p>
@@ -1043,206 +1093,7 @@
           <w:b w:val="0"/>
           <w:i w:val="0"/>
         </w:rPr>
-        <w:t>Lectura:</w:t>
-      </w:r>
-    </w:p>
-    <w:tbl>
-      <w:tblPr>
-        <w:tblStyle w:val="TableGrid"/>
-        <w:tblW w:type="auto" w:w="0"/>
-        <w:tblLook w:firstColumn="1" w:firstRow="1" w:lastColumn="0" w:lastRow="0" w:noHBand="0" w:noVBand="1" w:val="04A0"/>
-      </w:tblPr>
-      <w:tblGrid>
-        <w:gridCol w:w="2880"/>
-        <w:gridCol w:w="2880"/>
-        <w:gridCol w:w="2880"/>
-      </w:tblGrid>
-      <w:tr>
-        <w:tc>
-          <w:tcPr>
-            <w:tcW w:type="dxa" w:w="2880"/>
-          </w:tcPr>
-          <w:p>
-            <w:r>
-              <w:rPr>
-                <w:b/>
-              </w:rPr>
-              <w:t>Ataque a /rest/user/login</w:t>
-            </w:r>
-          </w:p>
-        </w:tc>
-        <w:tc>
-          <w:tcPr>
-            <w:tcW w:type="dxa" w:w="2880"/>
-          </w:tcPr>
-          <w:p>
-            <w:r>
-              <w:rPr>
-                <w:b/>
-              </w:rPr>
-              <w:t>Oficial :3000 (sin RASP)</w:t>
-            </w:r>
-          </w:p>
-        </w:tc>
-        <w:tc>
-          <w:tcPr>
-            <w:tcW w:type="dxa" w:w="2880"/>
-          </w:tcPr>
-          <w:p>
-            <w:r>
-              <w:rPr>
-                <w:b/>
-              </w:rPr>
-              <w:t>Fork :3001 (RASP)</w:t>
-            </w:r>
-          </w:p>
-        </w:tc>
-      </w:tr>
-      <w:tr>
-        <w:tc>
-          <w:tcPr>
-            <w:tcW w:type="dxa" w:w="2880"/>
-          </w:tcPr>
-          <w:p>
-            <w:r>
-              <w:t>Legitimo jim</w:t>
-            </w:r>
-          </w:p>
-        </w:tc>
-        <w:tc>
-          <w:tcPr>
-            <w:tcW w:type="dxa" w:w="2880"/>
-          </w:tcPr>
-          <w:p>
-            <w:r>
-              <w:t>200</w:t>
-            </w:r>
-          </w:p>
-        </w:tc>
-        <w:tc>
-          <w:tcPr>
-            <w:tcW w:type="dxa" w:w="2880"/>
-          </w:tcPr>
-          <w:p>
-            <w:r>
-              <w:t>200</w:t>
-            </w:r>
-          </w:p>
-        </w:tc>
-      </w:tr>
-      <w:tr>
-        <w:tc>
-          <w:tcPr>
-            <w:tcW w:type="dxa" w:w="2880"/>
-          </w:tcPr>
-          <w:p>
-            <w:r>
-              <w:t>SQLi clasico ' OR 1=1--</w:t>
-            </w:r>
-          </w:p>
-        </w:tc>
-        <w:tc>
-          <w:tcPr>
-            <w:tcW w:type="dxa" w:w="2880"/>
-          </w:tcPr>
-          <w:p>
-            <w:r>
-              <w:t>200 + JWT de admin (takeover)</w:t>
-            </w:r>
-          </w:p>
-        </w:tc>
-        <w:tc>
-          <w:tcPr>
-            <w:tcW w:type="dxa" w:w="2880"/>
-          </w:tcPr>
-          <w:p>
-            <w:r>
-              <w:t>403 + log RASP</w:t>
-            </w:r>
-          </w:p>
-        </w:tc>
-      </w:tr>
-      <w:tr>
-        <w:tc>
-          <w:tcPr>
-            <w:tcW w:type="dxa" w:w="2880"/>
-          </w:tcPr>
-          <w:p>
-            <w:r>
-              <w:t>UNION SELECT</w:t>
-            </w:r>
-          </w:p>
-        </w:tc>
-        <w:tc>
-          <w:tcPr>
-            <w:tcW w:type="dxa" w:w="2880"/>
-          </w:tcPr>
-          <w:p>
-            <w:r>
-              <w:t>200</w:t>
-            </w:r>
-          </w:p>
-        </w:tc>
-        <w:tc>
-          <w:tcPr>
-            <w:tcW w:type="dxa" w:w="2880"/>
-          </w:tcPr>
-          <w:p>
-            <w:r>
-              <w:t>403 + log RASP</w:t>
-            </w:r>
-          </w:p>
-        </w:tc>
-      </w:tr>
-      <w:tr>
-        <w:tc>
-          <w:tcPr>
-            <w:tcW w:type="dxa" w:w="2880"/>
-          </w:tcPr>
-          <w:p>
-            <w:r>
-              <w:t>Search q=' OR '1'='1 (string-form)</w:t>
-            </w:r>
-          </w:p>
-        </w:tc>
-        <w:tc>
-          <w:tcPr>
-            <w:tcW w:type="dxa" w:w="2880"/>
-          </w:tcPr>
-          <w:p>
-            <w:r>
-              <w:t>200</w:t>
-            </w:r>
-          </w:p>
-        </w:tc>
-        <w:tc>
-          <w:tcPr>
-            <w:tcW w:type="dxa" w:w="2880"/>
-          </w:tcPr>
-          <w:p>
-            <w:r>
-              <w:t>200 (hueco del patron, documentado)</w:t>
-            </w:r>
-          </w:p>
-        </w:tc>
-      </w:tr>
-    </w:tbl>
-    <w:p>
-      <w:r>
-        <w:rPr>
-          <w:b w:val="0"/>
-          <w:i w:val="0"/>
-        </w:rPr>
-        <w:t>Sin RASP el payload clasico devuelve el JWT del administrador (takeover total); con RASP, 403 antes de que Sequelize ejecute. El search con forma string evade tambien el middleware global (mismo hueco del regex literal ya conocido): fix propuesto identico (anadir OR '...'='...'). Guard de login verificado por unit test (3/3 PASS contra el compilado): segunda capa redundante por diseno (defensa en profundidad).</w:t>
-      </w:r>
-    </w:p>
-    <w:p>
-      <w:r>
-        <w:rPr>
-          <w:b w:val="0"/>
-          <w:i w:val="0"/>
-        </w:rPr>
-        <w:t>Stack combinado final (evidencia: evidencias/fase4-combinado.txt):</w:t>
+        <w:t>Stack combinado WAAP+RASP:</w:t>
       </w:r>
     </w:p>
     <w:p>
@@ -1273,7 +1124,213 @@
         <w:pStyle w:val="Heading1"/>
       </w:pPr>
       <w:r>
-        <w:t>Matriz comparativa por capas (avance Fase 6)</w:t>
+        <w:t>Fase 5 - Pipeline DevSecOps</w:t>
+      </w:r>
+    </w:p>
+    <w:p>
+      <w:pPr>
+        <w:pStyle w:val="Heading3"/>
+      </w:pPr>
+      <w:r>
+        <w:t>Objetivo</w:t>
+      </w:r>
+    </w:p>
+    <w:p>
+      <w:r>
+        <w:rPr>
+          <w:b w:val="0"/>
+          <w:i w:val="0"/>
+        </w:rPr>
+        <w:t>Gate CI/CD con SAST, SCA, contenedor, IaC y DAST; despliegue solo en verde (PDF p.14).</w:t>
+      </w:r>
+    </w:p>
+    <w:p>
+      <w:pPr>
+        <w:pStyle w:val="Heading3"/>
+      </w:pPr>
+      <w:r>
+        <w:t>Que se hizo (paso a paso)</w:t>
+      </w:r>
+    </w:p>
+    <w:p>
+      <w:r>
+        <w:rPr>
+          <w:rFonts w:ascii="Consolas" w:hAnsi="Consolas"/>
+          <w:sz w:val="17"/>
+        </w:rPr>
+        <w:t>Workflow: Semgrep p/owasp-top-ten; pip-audit (waap/ml/requirements.txt, nuevo);</w:t>
+        <w:br/>
+        <w:t>docker build app/; Trivy CRITICAL,HIGH exit 1; Checkov; ZAP baseline; deploy si success.</w:t>
+        <w:br/>
+        <w:t>Replicado local + ejercicio: eval() inyectado -&gt; rojo en SAST -&gt; revert -&gt; verde.</w:t>
+      </w:r>
+    </w:p>
+    <w:p>
+      <w:pPr>
+        <w:pStyle w:val="Heading3"/>
+      </w:pPr>
+      <w:r>
+        <w:t>Resultado y lectura</w:t>
+      </w:r>
+    </w:p>
+    <w:p>
+      <w:r>
+        <w:rPr>
+          <w:b w:val="0"/>
+          <w:i w:val="0"/>
+        </w:rPr>
+        <w:t>El gate trabajo de verdad: Dockerfile sin USER, workflow sin permissions, 67 CVE en base Debian y 11 en el npm de la imagen -&gt; Alpine + multistage + sin npm en runtime = 0 findings en las 4 herramientas. deploy_waap_rules.sh: OK (200/403). Evidencias: evidencias/fase5/.</w:t>
+      </w:r>
+    </w:p>
+    <w:p>
+      <w:pPr>
+        <w:pStyle w:val="Heading1"/>
+      </w:pPr>
+      <w:r>
+        <w:t>Fase 6 - Pruebas de efectividad y evasion</w:t>
+      </w:r>
+    </w:p>
+    <w:p>
+      <w:pPr>
+        <w:pStyle w:val="Heading3"/>
+      </w:pPr>
+      <w:r>
+        <w:t>Objetivo</w:t>
+      </w:r>
+    </w:p>
+    <w:p>
+      <w:r>
+        <w:rPr>
+          <w:b w:val="0"/>
+          <w:i w:val="0"/>
+        </w:rPr>
+        <w:t>Evaluar cada capa individual y combinada con herramientas estandar (PDF p.15).</w:t>
+      </w:r>
+    </w:p>
+    <w:p>
+      <w:pPr>
+        <w:pStyle w:val="Heading3"/>
+      </w:pPr>
+      <w:r>
+        <w:t>Que se hizo (paso a paso)</w:t>
+      </w:r>
+    </w:p>
+    <w:p>
+      <w:r>
+        <w:rPr>
+          <w:rFonts w:ascii="Consolas" w:hAnsi="Consolas"/>
+          <w:sz w:val="17"/>
+        </w:rPr>
+        <w:t>python3 waap/ml/bateria_fase6.py  # -&gt; matriz.csv (Tabla 2)</w:t>
+        <w:br/>
+        <w:t>sqlmap vs WAAP y vs directo (search + login); ZAP baseline vs :8080</w:t>
+      </w:r>
+    </w:p>
+    <w:p>
+      <w:pPr>
+        <w:pStyle w:val="Heading3"/>
+      </w:pPr>
+      <w:r>
+        <w:t>Resultado y lectura</w:t>
+      </w:r>
+    </w:p>
+    <w:p>
+      <w:r>
+        <w:rPr>
+          <w:b w:val="0"/>
+          <w:i w:val="0"/>
+        </w:rPr>
+        <w:t>sqlmap: 42x403 via WAAP y 14x403+8x500 directo ('not injectable' en ambos). ZAP: 0 FAIL, 59 PASS. Conclusion (media pagina en evidencias/fase6/analisis.md): mejor combinacion CRS+RASP con ML como senal; residuo: string-form (fix de patron) y rafagas (regla de tasa).</w:t>
+      </w:r>
+    </w:p>
+    <w:p>
+      <w:r>
+        <w:rPr>
+          <w:b w:val="0"/>
+          <w:i w:val="0"/>
+        </w:rPr>
+        <w:t>Analisis completo:</w:t>
+      </w:r>
+    </w:p>
+    <w:p>
+      <w:r>
+        <w:rPr>
+          <w:rFonts w:ascii="Consolas" w:hAnsi="Consolas"/>
+          <w:sz w:val="17"/>
+        </w:rPr>
+        <w:t># Fase 6 â AnÃ¡lisis de efectividad (mÃ­nimo media pÃ¡gina, PDF p.15)</w:t>
+        <w:br/>
+        <w:br/>
+        <w:t>## QuÃ© combinaciÃ³n ofrece la mejor cobertura y por quÃ©</w:t>
+        <w:br/>
+        <w:br/>
+        <w:t>Ninguna capa sola cubre todo; la cobertura total solo aparece al combinarlas,</w:t>
+        <w:br/>
+        <w:t>y cada hueco de una capa lo tapa otra (defensa en profundidad verificada):</w:t>
+        <w:br/>
+        <w:br/>
+        <w:t>- **Reglas CRS (PL1)**: bloquean 7/9 tÃ©cnicas (clÃ¡sico, encoded, UNION, XSS x2,</w:t>
+        <w:br/>
+        <w:t xml:space="preserve">  traversal, login clÃ¡sico/UNION). Fallan en lo **fragmentado** (evalÃºan cada</w:t>
+        <w:br/>
+        <w:t xml:space="preserve">  parÃ¡metro por separado) y en variantes con espacios que alteran la firma</w:t>
+        <w:br/>
+        <w:t xml:space="preserve">  (comentarios con espacios: lo parÃ³ el RASP, no el CRS).</w:t>
+        <w:br/>
+        <w:t>- **IA/ML (umbral 0.0)**: detecta 9/9 como anÃ³malo, pero al costo de FPR 80%</w:t>
+        <w:br/>
+        <w:t xml:space="preserve">  (4/5 normales marcados). Con umbral -0.05 solo 2/5 con FPR 40%. ConclusiÃ³n:</w:t>
+        <w:br/>
+        <w:t xml:space="preserve">  el modelo **no es bloqueador viable solo**; sirve como seÃ±al para el</w:t>
+        <w:br/>
+        <w:t xml:space="preserve">  orquestador (permitir/bloquear/desafiar) o para revisiÃ³n, no como gate duro.</w:t>
+        <w:br/>
+        <w:t xml:space="preserve">  La rÃ¡faga bot ni siquiera cruza el umbral (limitaciÃ³n de IsolationForest</w:t>
+        <w:br/>
+        <w:t xml:space="preserve">  documentada en Fase 3).</w:t>
+        <w:br/>
+        <w:t>- **RASP (fork)**: bloquea 4/9 en contexto de ejecuciÃ³n (fragmentado, comentarios</w:t>
+        <w:br/>
+        <w:t xml:space="preserve">  con `--`, UNION y clÃ¡sico de login), incluyendo las 2 evasiones del CRS.</w:t>
+        <w:br/>
+        <w:t xml:space="preserve">  Falla en XSS/traversal (fuera de su alcance SQL) y en la forma string</w:t>
+        <w:br/>
+        <w:t xml:space="preserve">  `' OR '1'='1` (hueco del regex literal, con fix propuesto). Su tasa de falsos</w:t>
+        <w:br/>
+        <w:t xml:space="preserve">  positivos es 0 en lo probado: solo dispara ante alteraciÃ³n estructural real.</w:t>
+        <w:br/>
+        <w:br/>
+        <w:t>**Mejor combinaciÃ³n: CRS + RASP, con ML como seÃ±al de apoyo.** CRS frena el</w:t>
+        <w:br/>
+        <w:t>grueso automatizado (sqlmap: 42Ã403 vÃ­a WAAP, "not injectable", sugiere tamper),</w:t>
+        <w:br/>
+        <w:t>RASP captura lo que evade firmas con contexto real (sqlmap directo: 14Ã403 +</w:t>
+        <w:br/>
+        <w:t>8Ã500, tampoco inyectable), y ML aporta detecciÃ³n de variantes raras a cambio</w:t>
+        <w:br/>
+        <w:t>de revisiÃ³n humana. ZAP baseline: 0 FAIL, 59 PASS (higiene pasiva correcta).</w:t>
+        <w:br/>
+        <w:br/>
+        <w:t>Residuo aceptado: string-form SQLi en search (requiere fix de patrÃ³n) y rÃ¡fagas</w:t>
+        <w:br/>
+        <w:t>(requieren regla de tasa explÃ­cita, no ML puro).</w:t>
+      </w:r>
+    </w:p>
+    <w:p>
+      <w:pPr>
+        <w:pStyle w:val="Heading1"/>
+      </w:pPr>
+      <w:r>
+        <w:t>Matriz comparativa por capas (Fase 6, resultado final)</w:t>
+      </w:r>
+    </w:p>
+    <w:p>
+      <w:r>
+        <w:rPr>
+          <w:b w:val="0"/>
+          <w:i w:val="0"/>
+        </w:rPr>
+        <w:t>Tabla 2. Bateria de 9 tecnicas x 3 capas (script waap/ml/bateria_fase6.py; atribucion CRS-vs-RASP por cuerpo de respuesta).</w:t>
       </w:r>
     </w:p>
     <w:tbl>
@@ -1379,7 +1436,7 @@
           </w:tcPr>
           <w:p>
             <w:r>
-              <w:t>Bloquea 403</w:t>
+              <w:t>EVADE en search (hueco); BLOQUEA en login</w:t>
             </w:r>
           </w:p>
         </w:tc>
@@ -1421,7 +1478,7 @@
           </w:tcPr>
           <w:p>
             <w:r>
-              <w:t>Bloquea (UNION/--/OR 1=1)</w:t>
+              <w:t>EVADE en search; BLOQUEA patron OR 1=1</w:t>
             </w:r>
           </w:p>
         </w:tc>
@@ -1463,7 +1520,7 @@
           </w:tcPr>
           <w:p>
             <w:r>
-              <w:t>Bloquea 403</w:t>
+              <w:t>BLOQUEA 403</w:t>
             </w:r>
           </w:p>
         </w:tc>
@@ -1475,7 +1532,49 @@
           </w:tcPr>
           <w:p>
             <w:r>
-              <w:t>XSS &lt;script&gt;</w:t>
+              <w:t>SQLi UNION / comentarios</w:t>
+            </w:r>
+          </w:p>
+        </w:tc>
+        <w:tc>
+          <w:tcPr>
+            <w:tcW w:type="dxa" w:w="2160"/>
+          </w:tcPr>
+          <w:p>
+            <w:r>
+              <w:t>BLOQUEA (compacto)</w:t>
+            </w:r>
+          </w:p>
+        </w:tc>
+        <w:tc>
+          <w:tcPr>
+            <w:tcW w:type="dxa" w:w="2160"/>
+          </w:tcPr>
+          <w:p>
+            <w:r>
+              <w:t>Detecta</w:t>
+            </w:r>
+          </w:p>
+        </w:tc>
+        <w:tc>
+          <w:tcPr>
+            <w:tcW w:type="dxa" w:w="2160"/>
+          </w:tcPr>
+          <w:p>
+            <w:r>
+              <w:t>BLOQUEA 403</w:t>
+            </w:r>
+          </w:p>
+        </w:tc>
+      </w:tr>
+      <w:tr>
+        <w:tc>
+          <w:tcPr>
+            <w:tcW w:type="dxa" w:w="2160"/>
+          </w:tcPr>
+          <w:p>
+            <w:r>
+              <w:t>XSS basico y encoded</w:t>
             </w:r>
           </w:p>
         </w:tc>
@@ -1505,7 +1604,7 @@
           </w:tcPr>
           <w:p>
             <w:r>
-              <w:t>N/A (demo SQL)</w:t>
+              <w:t>N/A (alcance SQL)</w:t>
             </w:r>
           </w:p>
         </w:tc>
@@ -1517,7 +1616,7 @@
           </w:tcPr>
           <w:p>
             <w:r>
-              <w:t>' OR '1'='1 string-form</w:t>
+              <w:t>Traversal</w:t>
             </w:r>
           </w:p>
         </w:tc>
@@ -1537,7 +1636,7 @@
           </w:tcPr>
           <w:p>
             <w:r>
-              <w:t>Detecta (0.0)</w:t>
+              <w:t>Detecta</w:t>
             </w:r>
           </w:p>
         </w:tc>
@@ -1547,7 +1646,7 @@
           </w:tcPr>
           <w:p>
             <w:r>
-              <w:t>EVADE (hueco patron)</w:t>
+              <w:t>N/A (alcance SQL)</w:t>
             </w:r>
           </w:p>
         </w:tc>
@@ -1600,16 +1699,15 @@
         <w:pStyle w:val="Heading1"/>
       </w:pPr>
       <w:r>
-        <w:t>Fase 5 - Pipeline DevSecOps</w:t>
+        <w:t>Fase 7 - Observabilidad y metricas</w:t>
       </w:r>
     </w:p>
     <w:p>
+      <w:pPr>
+        <w:pStyle w:val="Heading3"/>
+      </w:pPr>
       <w:r>
-        <w:rPr>
-          <w:b/>
-          <w:i w:val="0"/>
-        </w:rPr>
-        <w:t>Objetivo: gate CI/CD con SAST, SCA, contenedor, IaC y DAST; despliegue solo en verde (PDF p.14).</w:t>
+        <w:t>Objetivo</w:t>
       </w:r>
     </w:p>
     <w:p>
@@ -1618,7 +1716,32 @@
           <w:b w:val="0"/>
           <w:i w:val="0"/>
         </w:rPr>
-        <w:t>Implementado: pipeline/.github/workflows/devsecops.yml (Semgrep p/owasp-top-ten, pip-audit sobre waap/ml/requirements.txt —nuevo—, docker build de app/, Trivy CRITICAL,HIGH exit 1, Checkov, ZAP baseline, deploy_waap_rules.sh con if: success()). Cada herramienta se replicó localmente como evidencia.</w:t>
+        <w:t>Visibilidad centralizada y numeros para tuning (PDF p.16).</w:t>
+      </w:r>
+    </w:p>
+    <w:p>
+      <w:pPr>
+        <w:pStyle w:val="Heading3"/>
+      </w:pPr>
+      <w:r>
+        <w:t>Que se hizo (paso a paso)</w:t>
+      </w:r>
+    </w:p>
+    <w:p>
+      <w:r>
+        <w:rPr>
+          <w:rFonts w:ascii="Consolas" w:hAnsi="Consolas"/>
+          <w:sz w:val="17"/>
+        </w:rPr>
+        <w:t>python3 waap/ml/metricas_fase7.py  # logs/eventos.jsonl + TPR/FPR/FNR + MTTD</w:t>
+      </w:r>
+    </w:p>
+    <w:p>
+      <w:pPr>
+        <w:pStyle w:val="Heading3"/>
+      </w:pPr>
+      <w:r>
+        <w:t>Resultado y lectura</w:t>
       </w:r>
     </w:p>
     <w:p>
@@ -1627,177 +1750,7 @@
           <w:b w:val="0"/>
           <w:i w:val="0"/>
         </w:rPr>
-        <w:t>Endurecimiento real durante el gate (no cosmético): Semgrep tumbó el primer Dockerfile (correre como root -&gt; USER node); Checkov exigió HEALTHCHECK + permissions mínimas; Trivy reportó 67 CVE HIGH/CRIT en node:22-slim (base Debian) y 11 en el npm de la imagen -&gt; base Alpine + multistage + npm fuera del runtime = 0 findings. La imagen final corre, responde 200 y bloquea SQLi con 403.</w:t>
-      </w:r>
-    </w:p>
-    <w:p>
-      <w:r>
-        <w:rPr>
-          <w:rFonts w:ascii="Consolas" w:hAnsi="Consolas"/>
-          <w:sz w:val="17"/>
-        </w:rPr>
-        <w:t>semgrep: 224 reglas, 0 findings | pip-audit: No known vulnerabilities found | checkov: 39 passed, 0 failed | trivy: Clean (no security findings detected) | deploy_waap_rules.sh: Despliegue OK (normal=200, SQLi=403)</w:t>
-      </w:r>
-    </w:p>
-    <w:p>
-      <w:r>
-        <w:rPr>
-          <w:b w:val="0"/>
-          <w:i w:val="0"/>
-        </w:rPr>
-        <w:t>Ejercicio de verificación (PDF): se inyectó eval(req.query.cmd) -&gt; Semgrep rojo (2 blocking: code-string-concat + direct-response-write, etapa SAST); revert -&gt; verde. Evidencias: evidencias/fase5/01-semgrep a 06-vuln-inyectada-rojo + 05-deploy.</w:t>
-      </w:r>
-    </w:p>
-    <w:p>
-      <w:pPr>
-        <w:pStyle w:val="Heading1"/>
-      </w:pPr>
-      <w:r>
-        <w:t>Fase 6 - Pruebas de efectividad y evasion</w:t>
-      </w:r>
-    </w:p>
-    <w:p>
-      <w:r>
-        <w:rPr>
-          <w:b/>
-          <w:i w:val="0"/>
-        </w:rPr>
-        <w:t>Objetivo: matriz comparativa individual y combinada (PDF p.15).</w:t>
-      </w:r>
-    </w:p>
-    <w:p>
-      <w:r>
-        <w:rPr>
-          <w:b w:val="0"/>
-          <w:i w:val="0"/>
-        </w:rPr>
-        <w:t>Batería de 9 técnicas × 3 capas (script waap/ml/bateria_fase6.py, con atribución correcta CRS-vs-RASP por cuerpo de respuesta). Evidencia: evidencias/fase6/matriz.csv:</w:t>
-      </w:r>
-    </w:p>
-    <w:p>
-      <w:r>
-        <w:rPr>
-          <w:rFonts w:ascii="Consolas" w:hAnsi="Consolas"/>
-          <w:sz w:val="17"/>
-        </w:rPr>
-        <w:t>Payload / tecnica,Bloqueado por reglas (Fase 2),Detectado por IA/ML (Fase 3),Bloqueado por RASP (Fase 4)</w:t>
-        <w:br/>
-        <w:t>SQLi clasico ' OR '1'='1,BLOQUEA,SI,EVADE</w:t>
-        <w:br/>
-        <w:t>SQLi encoded,BLOQUEA,SI,EVADE</w:t>
-        <w:br/>
-        <w:t>SQLi comentarios /**/,EVADE,SI,BLOQUEA</w:t>
-        <w:br/>
-        <w:t>SQLi fragmentado 2 params,EVADE,SI,BLOQUEA</w:t>
-        <w:br/>
-        <w:t>SQLi UNION login,BLOQUEA,SI,BLOQUEA</w:t>
-        <w:br/>
-        <w:t>SQLi clasico login,BLOQUEA,SI,BLOQUEA</w:t>
-        <w:br/>
-        <w:t>XSS basico,BLOQUEA,SI,EVADE</w:t>
-        <w:br/>
-        <w:t>XSS encoded,BLOQUEA,SI,EVADE</w:t>
-        <w:br/>
-        <w:t>Traversal ../../etc/passwd,BLOQUEA,SI,EVADE</w:t>
-      </w:r>
-    </w:p>
-    <w:p>
-      <w:r>
-        <w:rPr>
-          <w:b w:val="0"/>
-          <w:i w:val="0"/>
-        </w:rPr>
-        <w:t>Ataque controlado: sqlmap vs WAAP -&gt; 42x403, 'not injectable' (sugiere tamper); directo vs fork -&gt; 14x403 (RASP) + 8x500, tampoco inyectable; login JSON -&gt; parámetros no dinámicos. ZAP baseline vs :8080 -&gt; 0 FAIL, 59 PASS, 8 WARN (higiene pasiva correcta).</w:t>
-      </w:r>
-    </w:p>
-    <w:p>
-      <w:r>
-        <w:rPr>
-          <w:rFonts w:ascii="Consolas" w:hAnsi="Consolas"/>
-          <w:sz w:val="17"/>
-        </w:rPr>
-        <w:t># Fase 6 â AnÃ¡lisis de efectividad (mÃ­nimo media pÃ¡gina, PDF p.15)</w:t>
-        <w:br/>
-        <w:br/>
-        <w:t>## QuÃ© combinaciÃ³n ofrece la mejor cobertura y por quÃ©</w:t>
-        <w:br/>
-        <w:br/>
-        <w:t>Ninguna capa sola cubre todo; la cobertura total solo aparece al combinarlas,</w:t>
-        <w:br/>
-        <w:t>y cada hueco de una capa lo tapa otra (defensa en profundidad verificada):</w:t>
-        <w:br/>
-        <w:br/>
-        <w:t>- **Reglas CRS (PL1)**: bloquean 7/9 tÃ©cnicas (clÃ¡sico, encoded, UNION, XSS x2,</w:t>
-        <w:br/>
-        <w:t xml:space="preserve">  traversal, login clÃ¡sico/UNION). Fallan en lo **fragmentado** (evalÃºan cada</w:t>
-        <w:br/>
-        <w:t xml:space="preserve">  parÃ¡metro por separado) y en variantes con espacios que alteran la firma</w:t>
-        <w:br/>
-        <w:t xml:space="preserve">  (comentarios con espacios: lo parÃ³ el RASP, no el CRS).</w:t>
-        <w:br/>
-        <w:t>- **IA/ML (umbral 0.0)**: detecta 9/9 como anÃ³malo, pero al costo de FPR 80%</w:t>
-        <w:br/>
-        <w:t xml:space="preserve">  (4/5 normales marcados). Con umbral -0.05 solo 2/5 con FPR 40%. ConclusiÃ³n:</w:t>
-        <w:br/>
-        <w:t xml:space="preserve">  el modelo **no es bloqueador viable solo**; sirve como seÃ±al para el</w:t>
-        <w:br/>
-        <w:t xml:space="preserve">  orquestador (permitir/bloquear/desafiar) o para revisiÃ³n, no como gate duro.</w:t>
-        <w:br/>
-        <w:t xml:space="preserve">  La rÃ¡faga bot ni siquiera cruza el umbral (limitaciÃ³n de IsolationForest</w:t>
-        <w:br/>
-        <w:t xml:space="preserve">  documentada en Fase 3).</w:t>
-        <w:br/>
-        <w:t>- **RASP (fork)**: bloquea 4/9 en contexto de ejecuciÃ³n (fragmentado, comentarios</w:t>
-        <w:br/>
-        <w:t xml:space="preserve">  con `--`, UNION y clÃ¡sico de login), incluyendo las 2 evasiones del CRS.</w:t>
-        <w:br/>
-        <w:t xml:space="preserve">  Falla en XSS/traversal (fuera de su alcance SQL) y en la forma string</w:t>
-        <w:br/>
-        <w:t xml:space="preserve">  `' OR '1'='1` (hueco del regex literal, con fix propuesto). Su tasa de falsos</w:t>
-        <w:br/>
-        <w:t xml:space="preserve">  positivos es 0 en lo probado: solo dispara ante alteraciÃ³n estructural real.</w:t>
-        <w:br/>
-        <w:br/>
-        <w:t>**Mejor combinaciÃ³n: CRS + RASP, con ML como seÃ±al de apoyo.** CRS frena el</w:t>
-        <w:br/>
-        <w:t>grueso automatizado (sqlmap: 42Ã403 vÃ­a WAAP, "not injectable", sugiere tamper),</w:t>
-        <w:br/>
-        <w:t>RASP captura lo que evade firmas con contexto real (sqlmap directo: 14Ã403 +</w:t>
-        <w:br/>
-        <w:t>8Ã500, tampoco inyectable), y ML aporta detecciÃ³n de variantes raras a cambio</w:t>
-        <w:br/>
-        <w:t>de revisiÃ³n humana. ZAP baseline: 0 FAIL, 59 PASS (higiene pasiva correcta).</w:t>
-        <w:br/>
-        <w:br/>
-        <w:t>Residuo aceptado: string-form SQLi en search (requiere fix de patrÃ³n) y rÃ¡fagas</w:t>
-        <w:br/>
-        <w:t>(requieren regla de tasa explÃ­cita, no ML puro).</w:t>
-      </w:r>
-    </w:p>
-    <w:p>
-      <w:pPr>
-        <w:pStyle w:val="Heading1"/>
-      </w:pPr>
-      <w:r>
-        <w:t>Fase 7 - Observabilidad y metricas</w:t>
-      </w:r>
-    </w:p>
-    <w:p>
-      <w:r>
-        <w:rPr>
-          <w:b/>
-          <w:i w:val="0"/>
-        </w:rPr>
-        <w:t>Objetivo: visibilidad centralizada y números para tuning (PDF p.16).</w:t>
-      </w:r>
-    </w:p>
-    <w:p>
-      <w:r>
-        <w:rPr>
-          <w:b w:val="0"/>
-          <w:i w:val="0"/>
-        </w:rPr>
-        <w:t>Eventos unificados en logs/eventos.jsonl (reglas + ml + rasp, con timestamp). Métricas desde las matrices (script waap/ml/metricas_fase7.py):</w:t>
+        <w:t>CRS: TPR 78% FPR 0%. ML@0.0: TPR 100% FPR 80% (senal, no gate). RASP-SQL: TPR 67% FPR 0%. MTTD ~60-150 ms por capa. Tuning: CRS en PL1; ML solo como senal + regla hibrida de tasa; RASP con patron ampliado. Detalles:</w:t>
       </w:r>
     </w:p>
     <w:p>
@@ -1828,12 +1781,147 @@
       </w:r>
     </w:p>
     <w:p>
+      <w:pPr>
+        <w:pStyle w:val="Heading1"/>
+      </w:pPr>
+      <w:r>
+        <w:t>Cuestionario de analisis final (PDF Seccion 8)</w:t>
+      </w:r>
+    </w:p>
+    <w:p>
+      <w:pPr>
+        <w:pStyle w:val="Heading3"/>
+      </w:pPr>
+      <w:r>
+        <w:t>Q1. Motor de reglas insuficiente pero IA/ML si detecta.</w:t>
+      </w:r>
+    </w:p>
+    <w:p>
       <w:r>
         <w:rPr>
           <w:b w:val="0"/>
           <w:i w:val="0"/>
         </w:rPr>
-        <w:t>Recomendación de tuning: CRS en PL1 como está; ML solo como señal (umbral 0.0 + revisión, nunca gate duro) + regla híbrida de tasa para ráfagas; RASP con patrón ampliado (OR '...'='...'). MTTD medido ~60-150 ms por capa (tiempo-a-veredicto local).</w:t>
+        <w:t>El SQLi con comentarios y espacios ('/ **/OR/**/1=1--): la firma exacta del CRS no lo casa (403 solo del RASP por el '--'), mientras el ML lo marca anomalo por longitud+entropia atipicas. La firma busca cadenas conocidas; el modelo mide distancia estadistica.</w:t>
+      </w:r>
+    </w:p>
+    <w:p>
+      <w:pPr>
+        <w:pStyle w:val="Heading3"/>
+      </w:pPr>
+      <w:r>
+        <w:t>Q2. Falso positivo del ML sobre trafico legitimo.</w:t>
+      </w:r>
+    </w:p>
+    <w:p>
+      <w:r>
+        <w:rPr>
+          <w:b w:val="0"/>
+          <w:i w:val="0"/>
+        </w:rPr>
+        <w:t>El login valido y el home ('/') se marcaron anomalos: el login por body_length alto del JSON de credenciales y home por url_length=1 (extremo de la distribucion). Feature responsable principal: longitudes fuera del centro aprendido + entropia.</w:t>
+      </w:r>
+    </w:p>
+    <w:p>
+      <w:pPr>
+        <w:pStyle w:val="Heading3"/>
+      </w:pPr>
+      <w:r>
+        <w:t>Q3. Por que el RASP detecto lo que reglas y ML no.</w:t>
+      </w:r>
+    </w:p>
+    <w:p>
+      <w:r>
+        <w:rPr>
+          <w:b w:val="0"/>
+          <w:i w:val="0"/>
+        </w:rPr>
+        <w:t>Porque opera sobre la consulta final concatenada (contexto de ejecucion), no sobre la peticion HTTP. El fragmentado q=' &amp; x=OR 1=1 es inocuo por partes (evade CRS y es estadisticamente normal para el ML) pero al concatenarse forma ' OR 1=1--, que el guard ve y bloquea con 403.</w:t>
+      </w:r>
+    </w:p>
+    <w:p>
+      <w:pPr>
+        <w:pStyle w:val="Heading3"/>
+      </w:pPr>
+      <w:r>
+        <w:t>Q4. WAAP centralizado vs RASP en 15 microservicios.</w:t>
+      </w:r>
+    </w:p>
+    <w:p>
+      <w:r>
+        <w:rPr>
+          <w:b w:val="0"/>
+          <w:i w:val="0"/>
+        </w:rPr>
+        <w:t>WAAP centralizado como base (un solo punto de tuning, cubre OWASP Top 10 generico) + RASP solo en servicios criticos con datos sensibles (auth, pagos), por el costo operativo de mantener 15 agentes (versionado por lenguaje, overhead de despliegue, logs).</w:t>
+      </w:r>
+    </w:p>
+    <w:p>
+      <w:pPr>
+        <w:pStyle w:val="Heading3"/>
+      </w:pPr>
+      <w:r>
+        <w:t>Q5. Que etapa detuvo la vulnerabilidad inyectada.</w:t>
+      </w:r>
+    </w:p>
+    <w:p>
+      <w:r>
+        <w:rPr>
+          <w:b w:val="0"/>
+          <w:i w:val="0"/>
+        </w:rPr>
+        <w:t>SAST/Semgrep detuvo el eval() inyectado (code-string-concat, blocking). Sin esa etapa, el codigo habria llegado a la imagen y solo ZAP/Trivy tardios (o produccion) lo habrian visto, con costo mayor.</w:t>
+      </w:r>
+    </w:p>
+    <w:p>
+      <w:pPr>
+        <w:pStyle w:val="Heading3"/>
+      </w:pPr>
+      <w:r>
+        <w:t>Q6. Mapeo MITRE ATT&amp;CK / API Top 10.</w:t>
+      </w:r>
+    </w:p>
+    <w:p>
+      <w:r>
+        <w:rPr>
+          <w:b w:val="0"/>
+          <w:i w:val="0"/>
+        </w:rPr>
+        <w:t>T1190 (Exploit Public-Facing Application): SQLi en /rest/user/login y XSS en /rest/products/search. API BOLA/IDOR: acceso a /rest/basket/:id ajeno.</w:t>
+      </w:r>
+    </w:p>
+    <w:p>
+      <w:pPr>
+        <w:pStyle w:val="Heading3"/>
+      </w:pPr>
+      <w:r>
+        <w:t>Q7. Mejora contra falsos positivos del ML sin perder deteccion.</w:t>
+      </w:r>
+    </w:p>
+    <w:p>
+      <w:r>
+        <w:rPr>
+          <w:b w:val="0"/>
+          <w:i w:val="0"/>
+        </w:rPr>
+        <w:t>Regla hibrida: score ML + tasa (req_per_minute con umbral duro) + whitelist por ruta (p. ej. login/home con umbral propio). La tasa captura rafagas que el IsolationForest no ordena; el whitelist baja el FPR sin tocar la deteccion de ataques.</w:t>
+      </w:r>
+    </w:p>
+    <w:p>
+      <w:pPr>
+        <w:pStyle w:val="Heading3"/>
+      </w:pPr>
+      <w:r>
+        <w:t>Q8. Riesgo de reentrenar con trafico de produccion sin validar.</w:t>
+      </w:r>
+    </w:p>
+    <w:p>
+      <w:r>
+        <w:rPr>
+          <w:b w:val="0"/>
+          <w:i w:val="0"/>
+        </w:rPr>
+        <w:t>Envenenamiento: ataques de bajo volumen se vuelven 'normales' (lo vivimos al reves: el dataset rapido normalizo rpm=200). Se requiere curaduria + ventana validada + comparacion contra baseline antes de promover el modelo.</w:t>
       </w:r>
     </w:p>
     <w:p>
@@ -1841,16 +1929,7 @@
         <w:pStyle w:val="Heading1"/>
       </w:pPr>
       <w:r>
-        <w:t>Anexo A - Paso a paso reproducible (todo lo hecho)</w:t>
-      </w:r>
-    </w:p>
-    <w:p>
-      <w:r>
-        <w:rPr>
-          <w:b/>
-          <w:i w:val="0"/>
-        </w:rPr>
-        <w:t>Secuencia exacta, en orden, desde un clon limpio (rama lab/fases-0-4):</w:t>
+        <w:t>Anexo A - Paso a paso reproducible (Fases 0-7)</w:t>
       </w:r>
     </w:p>
     <w:p>
@@ -1859,129 +1938,37 @@
           <w:rFonts w:ascii="Consolas" w:hAnsi="Consolas"/>
           <w:sz w:val="17"/>
         </w:rPr>
-        <w:t># 0. Requisitos: Ubuntu 22.04, Docker + Compose, Python 3.10, Node 22, LibreOffice.</w:t>
+        <w:t># 0. Requisitos: Ubuntu 22.04, Docker+Compose, Python 3.10, Node 22, LibreOffice.</w:t>
         <w:br/>
-        <w:t>#    Usuario en grupo docker: sudo usermod -aG docker $USER (re-login).</w:t>
+        <w:t>#    sudo usermod -aG docker $USER (re-login).</w:t>
         <w:br/>
         <w:t>git clone git@github.com:Jhojan98/taller-waap.git &amp;&amp; cd taller-waap</w:t>
         <w:br/>
-        <w:t>git checkout lab/fases-0-4</w:t>
+        <w:t>git checkout lab/fases-0-4   # o main tras el merge</w:t>
         <w:br/>
-        <w:t># FASE 0</w:t>
+        <w:t># FASE 0: cp .env.example .env; docker compose pull/up; curl :8080</w:t>
         <w:br/>
-        <w:t>cp .env.example .env</w:t>
+        <w:t># FASE 1: version, search?q=apple, /#/score-board</w:t>
         <w:br/>
-        <w:t>docker compose pull &amp;&amp; docker compose up -d &amp;&amp; docker compose ps</w:t>
+        <w:t># FASE 2: SQLi clasico -&gt; 403; fragmentado -&gt; 200; logs | grep 942100|949110</w:t>
         <w:br/>
-        <w:t>curl -i http://localhost:8080</w:t>
+        <w:t># FASE 3: pip install sklearn pandas numpy joblib; GEN_N=120 PACE=humano gen_traffic;</w:t>
         <w:br/>
-        <w:t># FASE 1</w:t>
+        <w:t>#   extract_features; train_model; evaluate</w:t>
         <w:br/>
-        <w:t>curl -s http://localhost:8080/rest/admin/application-version</w:t>
+        <w:t># FASE 4: fork juice-shop (rama rasp-lab) + lib/raspGuard.ts + hooks;</w:t>
         <w:br/>
-        <w:t>curl -s 'http://localhost:8080/rest/products/search?q=apple'</w:t>
+        <w:t>#   PORT=3001 npm start; docker build -t juice-shop:rasp-lab; compose + verificar</w:t>
         <w:br/>
-        <w:t># (navegador) http://localhost:8080/#/score-board</w:t>
+        <w:t># FASE 5: semgrep; pip-audit; docker build ./app; trivy; checkov; deploy script</w:t>
         <w:br/>
-        <w:t># FASE 2</w:t>
+        <w:t># FASE 6: bateria_fase6.py; sqlmap (search+login); zap-baseline.py</w:t>
         <w:br/>
-        <w:t>curl -i --get --data-urlencode "q=' OR '1'='1" http://localhost:8080/rest/products/search</w:t>
+        <w:t># FASE 7: metricas_fase7.py</w:t>
         <w:br/>
-        <w:t>curl -i "http://localhost:8080/rest/products/search?q='%20&amp;x=OR%201=1"</w:t>
-        <w:br/>
-        <w:t>docker compose logs waap-proxy | grep -E '942100|949110'</w:t>
-        <w:br/>
-        <w:t># FASE 3</w:t>
-        <w:br/>
-        <w:t>python3 -m pip install --user scikit-learn pandas numpy joblib</w:t>
-        <w:br/>
-        <w:t>GEN_N=120 PACE=humano python3 waap/ml/gen_traffic.py</w:t>
-        <w:br/>
-        <w:t>python3 waap/ml/extract_features.py</w:t>
-        <w:br/>
-        <w:t>python3 waap/ml/train_model.py</w:t>
-        <w:br/>
-        <w:t>python3 waap/ml/evaluate.py</w:t>
-        <w:br/>
-        <w:t># FASE 4 (fork real; prototipo previo en app/rasp-demo/)</w:t>
-        <w:br/>
-        <w:t>gh repo fork juice-shop/juice-shop --clone=false</w:t>
-        <w:br/>
-        <w:t>git clone --depth 1 git@github.com:Jhojan98/juice-shop.git ~/juice-shop-rasp</w:t>
-        <w:br/>
-        <w:t>cd ~/juice-shop-rasp &amp;&amp; git checkout -b rasp-lab</w:t>
-        <w:br/>
-        <w:t>sudo npm i -g npm@11 &amp;&amp; npm install &amp;&amp; (cd frontend &amp;&amp; npm install &amp;&amp; cd ..)</w:t>
-        <w:br/>
-        <w:t>npm run build:frontend &amp;&amp; npm run build:server</w:t>
-        <w:br/>
-        <w:t># (anadir lib/raspGuard.ts + hooks en server.ts y routes/login.ts, commit, push)</w:t>
-        <w:br/>
-        <w:t>PORT=3001 RASP_ENABLED=1 npm start</w:t>
-        <w:br/>
-        <w:t>docker build -t juice-shop:rasp-lab ~/juice-shop-rasp</w:t>
-        <w:br/>
-        <w:t># (en taller-waap) compose con juice-shop:rasp-lab + RASP_ENABLED=1, up -d, verificar</w:t>
-        <w:br/>
-        <w:t># INFORME (regenerar este documento)</w:t>
-        <w:br/>
-        <w:t>python3 build_informe_clean.py</w:t>
-        <w:br/>
-        <w:t>soffice --headless --convert-to pdf Informe_Taller_WAAP_Fase0-2.docx</w:t>
+        <w:t># INFORME: python3 build_informe_v2.py; soffice --headless --convert-to pdf ...docx</w:t>
       </w:r>
     </w:p>
-    <w:p>
-      <w:r>
-        <w:rPr>
-          <w:b w:val="0"/>
-          <w:i w:val="0"/>
-        </w:rPr>
-        <w:t>Nota: model.pkl y logs/*.jsonl se regeneran; los .pkl no se versionan.</w:t>
-      </w:r>
-    </w:p>
-    <w:p>
-      <w:pPr>
-        <w:pStyle w:val="Heading1"/>
-      </w:pPr>
-      <w:r>
-        <w:t>Anexo A (cont.) - Fases 5-7 reproducible</w:t>
-      </w:r>
-    </w:p>
-    <w:p>
-      <w:r>
-        <w:rPr>
-          <w:rFonts w:ascii="Consolas" w:hAnsi="Consolas"/>
-          <w:sz w:val="17"/>
-        </w:rPr>
-        <w:t>pip install --user semgrep pip-audit checkov; sudo apt install trivy sqlmap</w:t>
-        <w:br/>
-        <w:t>semgrep --config=p/owasp-top-ten app/ waap/ --error</w:t>
-        <w:br/>
-        <w:t>pip-audit -r waap/ml/requirements.txt</w:t>
-        <w:br/>
-        <w:t>docker build -t taller-waap/app:local ./app</w:t>
-        <w:br/>
-        <w:t>trivy image --severity CRITICAL,HIGH --exit-code 1 taller-waap/app:local</w:t>
-        <w:br/>
-        <w:t>checkov -d . --quiet --compact</w:t>
-        <w:br/>
-        <w:t>./scripts/deploy_waap_rules.sh</w:t>
-        <w:br/>
-        <w:t>python3 waap/ml/bateria_fase6.py</w:t>
-        <w:br/>
-        <w:t>sqlmap -u 'http://localhost:8080/rest/products/search?q=apple' --batch --level=1</w:t>
-        <w:br/>
-        <w:t>docker run --rm ghcr.io/zaproxy/zaproxy:stable zap-baseline.py -t http://host.docker.internal:8080</w:t>
-        <w:br/>
-        <w:t>python3 waap/ml/metricas_fase7.py</w:t>
-      </w:r>
-    </w:p>
-    <w:sectPr>
-      <w:pgSz w:w="12240" w:h="15840"/>
-      <w:pgMar w:top="1440" w:right="1800" w:bottom="1440" w:left="1800" w:header="720" w:footer="720" w:gutter="0"/>
-      <w:cols w:space="720"/>
-      <w:docGrid w:linePitch="360"/>
-    </w:sectPr>
     <w:p>
       <w:pPr>
         <w:pStyle w:val="Heading1"/>
@@ -2040,6 +2027,12 @@
         <w:t xml:space="preserve">      1 "message":"SQL Injection Attack Detected via libinjection"</w:t>
       </w:r>
     </w:p>
+    <w:sectPr>
+      <w:pgSz w:w="12240" w:h="15840"/>
+      <w:pgMar w:top="1440" w:right="1800" w:bottom="1440" w:left="1800" w:header="720" w:footer="720" w:gutter="0"/>
+      <w:cols w:space="720"/>
+      <w:docGrid w:linePitch="360"/>
+    </w:sectPr>
   </w:body>
 </w:document>
 </file>

</xml_diff>